<commit_message>
lab5: company funding from open sources (appendix D), docs rebuilt
</commit_message>
<xml_diff>
--- a/ЛР5_Анализ_конкурентов/ОТЧЕТ_ЛР5_TableMind.docx
+++ b/ЛР5_Анализ_конкурентов/ОТЧЕТ_ЛР5_TableMind.docx
@@ -245,7 +245,7 @@
       <w:r>
         <w:fldChar w:fldCharType="separate"/>
       </w:r>
-      <w:hyperlink w:anchor="_Toc241934879" w:history="1">
+      <w:hyperlink w:anchor="_Toc241935052" w:history="1">
         <w:r>
           <w:rPr>
             <w:rStyle w:val="af"/>
@@ -273,7 +273,7 @@
             <w:noProof/>
             <w:webHidden/>
           </w:rPr>
-          <w:instrText xml:space="preserve"> PAGEREF _Toc241934879 \h </w:instrText>
+          <w:instrText xml:space="preserve"> PAGEREF _Toc241935052 \h </w:instrText>
         </w:r>
         <w:r>
           <w:rPr>
@@ -314,7 +314,7 @@
           <w:noProof/>
         </w:rPr>
       </w:pPr>
-      <w:hyperlink w:anchor="_Toc241934880" w:history="1">
+      <w:hyperlink w:anchor="_Toc241935053" w:history="1">
         <w:r>
           <w:rPr>
             <w:rStyle w:val="af"/>
@@ -342,7 +342,7 @@
             <w:noProof/>
             <w:webHidden/>
           </w:rPr>
-          <w:instrText xml:space="preserve"> PAGEREF _Toc241934880 \h </w:instrText>
+          <w:instrText xml:space="preserve"> PAGEREF _Toc241935053 \h </w:instrText>
         </w:r>
         <w:r>
           <w:rPr>
@@ -383,7 +383,7 @@
           <w:noProof/>
         </w:rPr>
       </w:pPr>
-      <w:hyperlink w:anchor="_Toc241934881" w:history="1">
+      <w:hyperlink w:anchor="_Toc241935054" w:history="1">
         <w:r>
           <w:rPr>
             <w:rStyle w:val="af"/>
@@ -411,7 +411,7 @@
             <w:noProof/>
             <w:webHidden/>
           </w:rPr>
-          <w:instrText xml:space="preserve"> PAGEREF _Toc241934881 \h </w:instrText>
+          <w:instrText xml:space="preserve"> PAGEREF _Toc241935054 \h </w:instrText>
         </w:r>
         <w:r>
           <w:rPr>
@@ -452,7 +452,7 @@
           <w:noProof/>
         </w:rPr>
       </w:pPr>
-      <w:hyperlink w:anchor="_Toc241934882" w:history="1">
+      <w:hyperlink w:anchor="_Toc241935055" w:history="1">
         <w:r>
           <w:rPr>
             <w:rStyle w:val="af"/>
@@ -480,7 +480,7 @@
             <w:noProof/>
             <w:webHidden/>
           </w:rPr>
-          <w:instrText xml:space="preserve"> PAGEREF _Toc241934882 \h </w:instrText>
+          <w:instrText xml:space="preserve"> PAGEREF _Toc241935055 \h </w:instrText>
         </w:r>
         <w:r>
           <w:rPr>
@@ -521,7 +521,7 @@
           <w:noProof/>
         </w:rPr>
       </w:pPr>
-      <w:hyperlink w:anchor="_Toc241934883" w:history="1">
+      <w:hyperlink w:anchor="_Toc241935056" w:history="1">
         <w:r>
           <w:rPr>
             <w:rStyle w:val="af"/>
@@ -549,7 +549,7 @@
             <w:noProof/>
             <w:webHidden/>
           </w:rPr>
-          <w:instrText xml:space="preserve"> PAGEREF _Toc241934883 \h </w:instrText>
+          <w:instrText xml:space="preserve"> PAGEREF _Toc241935056 \h </w:instrText>
         </w:r>
         <w:r>
           <w:rPr>
@@ -590,7 +590,7 @@
           <w:noProof/>
         </w:rPr>
       </w:pPr>
-      <w:hyperlink w:anchor="_Toc241934884" w:history="1">
+      <w:hyperlink w:anchor="_Toc241935057" w:history="1">
         <w:r>
           <w:rPr>
             <w:rStyle w:val="af"/>
@@ -618,7 +618,7 @@
             <w:noProof/>
             <w:webHidden/>
           </w:rPr>
-          <w:instrText xml:space="preserve"> PAGEREF _Toc241934884 \h </w:instrText>
+          <w:instrText xml:space="preserve"> PAGEREF _Toc241935057 \h </w:instrText>
         </w:r>
         <w:r>
           <w:rPr>
@@ -659,7 +659,7 @@
           <w:noProof/>
         </w:rPr>
       </w:pPr>
-      <w:hyperlink w:anchor="_Toc241934885" w:history="1">
+      <w:hyperlink w:anchor="_Toc241935058" w:history="1">
         <w:r>
           <w:rPr>
             <w:rStyle w:val="af"/>
@@ -687,7 +687,7 @@
             <w:noProof/>
             <w:webHidden/>
           </w:rPr>
-          <w:instrText xml:space="preserve"> PAGEREF _Toc241934885 \h </w:instrText>
+          <w:instrText xml:space="preserve"> PAGEREF _Toc241935058 \h </w:instrText>
         </w:r>
         <w:r>
           <w:rPr>
@@ -728,7 +728,7 @@
           <w:noProof/>
         </w:rPr>
       </w:pPr>
-      <w:hyperlink w:anchor="_Toc241934886" w:history="1">
+      <w:hyperlink w:anchor="_Toc241935059" w:history="1">
         <w:r>
           <w:rPr>
             <w:rStyle w:val="af"/>
@@ -756,7 +756,7 @@
             <w:noProof/>
             <w:webHidden/>
           </w:rPr>
-          <w:instrText xml:space="preserve"> PAGEREF _Toc241934886 \h </w:instrText>
+          <w:instrText xml:space="preserve"> PAGEREF _Toc241935059 \h </w:instrText>
         </w:r>
         <w:r>
           <w:rPr>
@@ -797,7 +797,7 @@
           <w:noProof/>
         </w:rPr>
       </w:pPr>
-      <w:hyperlink w:anchor="_Toc241934887" w:history="1">
+      <w:hyperlink w:anchor="_Toc241935060" w:history="1">
         <w:r>
           <w:rPr>
             <w:rStyle w:val="af"/>
@@ -825,7 +825,7 @@
             <w:noProof/>
             <w:webHidden/>
           </w:rPr>
-          <w:instrText xml:space="preserve"> PAGEREF _Toc241934887 \h </w:instrText>
+          <w:instrText xml:space="preserve"> PAGEREF _Toc241935060 \h </w:instrText>
         </w:r>
         <w:r>
           <w:rPr>
@@ -866,7 +866,7 @@
           <w:noProof/>
         </w:rPr>
       </w:pPr>
-      <w:hyperlink w:anchor="_Toc241934888" w:history="1">
+      <w:hyperlink w:anchor="_Toc241935061" w:history="1">
         <w:r>
           <w:rPr>
             <w:rStyle w:val="af"/>
@@ -894,7 +894,7 @@
             <w:noProof/>
             <w:webHidden/>
           </w:rPr>
-          <w:instrText xml:space="preserve"> PAGEREF _Toc241934888 \h </w:instrText>
+          <w:instrText xml:space="preserve"> PAGEREF _Toc241935061 \h </w:instrText>
         </w:r>
         <w:r>
           <w:rPr>
@@ -935,7 +935,7 @@
           <w:noProof/>
         </w:rPr>
       </w:pPr>
-      <w:hyperlink w:anchor="_Toc241934889" w:history="1">
+      <w:hyperlink w:anchor="_Toc241935062" w:history="1">
         <w:r>
           <w:rPr>
             <w:rStyle w:val="af"/>
@@ -972,7 +972,7 @@
             <w:noProof/>
             <w:webHidden/>
           </w:rPr>
-          <w:instrText xml:space="preserve"> PAGEREF _Toc241934889 \h </w:instrText>
+          <w:instrText xml:space="preserve"> PAGEREF _Toc241935062 \h </w:instrText>
         </w:r>
         <w:r>
           <w:rPr>
@@ -1013,7 +1013,7 @@
           <w:noProof/>
         </w:rPr>
       </w:pPr>
-      <w:hyperlink w:anchor="_Toc241934890" w:history="1">
+      <w:hyperlink w:anchor="_Toc241935063" w:history="1">
         <w:r>
           <w:rPr>
             <w:rStyle w:val="af"/>
@@ -1041,7 +1041,7 @@
             <w:noProof/>
             <w:webHidden/>
           </w:rPr>
-          <w:instrText xml:space="preserve"> PAGEREF _Toc241934890 \h </w:instrText>
+          <w:instrText xml:space="preserve"> PAGEREF _Toc241935063 \h </w:instrText>
         </w:r>
         <w:r>
           <w:rPr>
@@ -1082,7 +1082,7 @@
           <w:noProof/>
         </w:rPr>
       </w:pPr>
-      <w:hyperlink w:anchor="_Toc241934891" w:history="1">
+      <w:hyperlink w:anchor="_Toc241935064" w:history="1">
         <w:r>
           <w:rPr>
             <w:rStyle w:val="af"/>
@@ -1110,7 +1110,7 @@
             <w:noProof/>
             <w:webHidden/>
           </w:rPr>
-          <w:instrText xml:space="preserve"> PAGEREF _Toc241934891 \h </w:instrText>
+          <w:instrText xml:space="preserve"> PAGEREF _Toc241935064 \h </w:instrText>
         </w:r>
         <w:r>
           <w:rPr>
@@ -1151,7 +1151,7 @@
           <w:noProof/>
         </w:rPr>
       </w:pPr>
-      <w:hyperlink w:anchor="_Toc241934892" w:history="1">
+      <w:hyperlink w:anchor="_Toc241935065" w:history="1">
         <w:r>
           <w:rPr>
             <w:rStyle w:val="af"/>
@@ -1179,7 +1179,7 @@
             <w:noProof/>
             <w:webHidden/>
           </w:rPr>
-          <w:instrText xml:space="preserve"> PAGEREF _Toc241934892 \h </w:instrText>
+          <w:instrText xml:space="preserve"> PAGEREF _Toc241935065 \h </w:instrText>
         </w:r>
         <w:r>
           <w:rPr>
@@ -1220,7 +1220,7 @@
           <w:noProof/>
         </w:rPr>
       </w:pPr>
-      <w:hyperlink w:anchor="_Toc241934893" w:history="1">
+      <w:hyperlink w:anchor="_Toc241935066" w:history="1">
         <w:r>
           <w:rPr>
             <w:rStyle w:val="af"/>
@@ -1248,7 +1248,7 @@
             <w:noProof/>
             <w:webHidden/>
           </w:rPr>
-          <w:instrText xml:space="preserve"> PAGEREF _Toc241934893 \h </w:instrText>
+          <w:instrText xml:space="preserve"> PAGEREF _Toc241935066 \h </w:instrText>
         </w:r>
         <w:r>
           <w:rPr>
@@ -1289,7 +1289,7 @@
           <w:noProof/>
         </w:rPr>
       </w:pPr>
-      <w:hyperlink w:anchor="_Toc241934894" w:history="1">
+      <w:hyperlink w:anchor="_Toc241935067" w:history="1">
         <w:r>
           <w:rPr>
             <w:rStyle w:val="af"/>
@@ -1317,7 +1317,7 @@
             <w:noProof/>
             <w:webHidden/>
           </w:rPr>
-          <w:instrText xml:space="preserve"> PAGEREF _Toc241934894 \h </w:instrText>
+          <w:instrText xml:space="preserve"> PAGEREF _Toc241935067 \h </w:instrText>
         </w:r>
         <w:r>
           <w:rPr>
@@ -1358,7 +1358,7 @@
           <w:noProof/>
         </w:rPr>
       </w:pPr>
-      <w:hyperlink w:anchor="_Toc241934895" w:history="1">
+      <w:hyperlink w:anchor="_Toc241935068" w:history="1">
         <w:r>
           <w:rPr>
             <w:rStyle w:val="af"/>
@@ -1386,7 +1386,7 @@
             <w:noProof/>
             <w:webHidden/>
           </w:rPr>
-          <w:instrText xml:space="preserve"> PAGEREF _Toc241934895 \h </w:instrText>
+          <w:instrText xml:space="preserve"> PAGEREF _Toc241935068 \h </w:instrText>
         </w:r>
         <w:r>
           <w:rPr>
@@ -1427,7 +1427,7 @@
           <w:noProof/>
         </w:rPr>
       </w:pPr>
-      <w:hyperlink w:anchor="_Toc241934896" w:history="1">
+      <w:hyperlink w:anchor="_Toc241935069" w:history="1">
         <w:r>
           <w:rPr>
             <w:rStyle w:val="af"/>
@@ -1455,7 +1455,7 @@
             <w:noProof/>
             <w:webHidden/>
           </w:rPr>
-          <w:instrText xml:space="preserve"> PAGEREF _Toc241934896 \h </w:instrText>
+          <w:instrText xml:space="preserve"> PAGEREF _Toc241935069 \h </w:instrText>
         </w:r>
         <w:r>
           <w:rPr>
@@ -1496,7 +1496,7 @@
           <w:noProof/>
         </w:rPr>
       </w:pPr>
-      <w:hyperlink w:anchor="_Toc241934897" w:history="1">
+      <w:hyperlink w:anchor="_Toc241935070" w:history="1">
         <w:r>
           <w:rPr>
             <w:rStyle w:val="af"/>
@@ -1524,7 +1524,7 @@
             <w:noProof/>
             <w:webHidden/>
           </w:rPr>
-          <w:instrText xml:space="preserve"> PAGEREF _Toc241934897 \h </w:instrText>
+          <w:instrText xml:space="preserve"> PAGEREF _Toc241935070 \h </w:instrText>
         </w:r>
         <w:r>
           <w:rPr>
@@ -1557,6 +1557,75 @@
     </w:p>
     <w:p>
       <w:pPr>
+        <w:pStyle w:val="12"/>
+        <w:tabs>
+          <w:tab w:val="right" w:leader="dot" w:pos="9345"/>
+        </w:tabs>
+        <w:rPr>
+          <w:noProof/>
+        </w:rPr>
+      </w:pPr>
+      <w:hyperlink w:anchor="_Toc241935071" w:history="1">
+        <w:r>
+          <w:rPr>
+            <w:rStyle w:val="af"/>
+            <w:b/>
+            <w:noProof/>
+          </w:rPr>
+          <w:t>ПРИЛОЖЕНИЕ Д</w:t>
+        </w:r>
+        <w:r>
+          <w:rPr>
+            <w:noProof/>
+            <w:webHidden/>
+          </w:rPr>
+          <w:tab/>
+        </w:r>
+        <w:r>
+          <w:rPr>
+            <w:noProof/>
+            <w:webHidden/>
+          </w:rPr>
+          <w:fldChar w:fldCharType="begin"/>
+        </w:r>
+        <w:r>
+          <w:rPr>
+            <w:noProof/>
+            <w:webHidden/>
+          </w:rPr>
+          <w:instrText xml:space="preserve"> PAGEREF _Toc241935071 \h </w:instrText>
+        </w:r>
+        <w:r>
+          <w:rPr>
+            <w:noProof/>
+            <w:webHidden/>
+          </w:rPr>
+        </w:r>
+        <w:r>
+          <w:rPr>
+            <w:noProof/>
+            <w:webHidden/>
+          </w:rPr>
+          <w:fldChar w:fldCharType="separate"/>
+        </w:r>
+        <w:r>
+          <w:rPr>
+            <w:noProof/>
+            <w:webHidden/>
+          </w:rPr>
+          <w:t>32</w:t>
+        </w:r>
+        <w:r>
+          <w:rPr>
+            <w:noProof/>
+            <w:webHidden/>
+          </w:rPr>
+          <w:fldChar w:fldCharType="end"/>
+        </w:r>
+      </w:hyperlink>
+    </w:p>
+    <w:p>
+      <w:pPr>
         <w:pStyle w:val="11"/>
       </w:pPr>
       <w:r>
@@ -1570,7 +1639,7 @@
         <w:spacing w:before="0" w:after="360" w:line="360" w:lineRule="exact"/>
         <w:ind w:firstLine="709"/>
       </w:pPr>
-      <w:bookmarkStart w:id="1" w:name="_Toc241934879"/>
+      <w:bookmarkStart w:id="1" w:name="_Toc241935052"/>
       <w:r>
         <w:rPr>
           <w:b/>
@@ -1720,7 +1789,7 @@
         <w:ind w:firstLine="709"/>
       </w:pPr>
       <w:bookmarkStart w:id="2" w:name="_b608aa976fc82a0faaf3b83f58c735968afd03b"/>
-      <w:bookmarkStart w:id="3" w:name="_Toc241934880"/>
+      <w:bookmarkStart w:id="3" w:name="_Toc241935053"/>
       <w:bookmarkEnd w:id="0"/>
       <w:r>
         <w:rPr>
@@ -1743,13 +1812,7 @@
         <w:rPr>
           <w:sz w:val="28"/>
         </w:rPr>
-        <w:t>Работа выполнена в трех блоках по трем методикам: классификаци</w:t>
-      </w:r>
-      <w:r>
-        <w:rPr>
-          <w:sz w:val="28"/>
-        </w:rPr>
-        <w:t xml:space="preserve">я компаний, анализ цифрового товара и анализ бизнес-моделей. Каждый блок реализован в отдельной книге </w:t>
+        <w:t xml:space="preserve">Работа выполнена в трех блоках по трем методикам: классификация компаний, анализ цифрового товара и анализ бизнес-моделей. Каждый блок реализован в отдельной книге </w:t>
       </w:r>
       <w:r>
         <w:rPr>
@@ -1785,13 +1848,20 @@
         <w:ind w:firstLine="709"/>
       </w:pPr>
       <w:bookmarkStart w:id="4" w:name="_c3cf235f67897fccdd158c7c34ca81091dc06e0"/>
-      <w:bookmarkStart w:id="5" w:name="_Toc241934881"/>
+      <w:bookmarkStart w:id="5" w:name="_Toc241935054"/>
       <w:r>
         <w:rPr>
           <w:b/>
           <w:sz w:val="28"/>
         </w:rPr>
-        <w:t>2.1 Контур анализа и реестр компаний</w:t>
+        <w:t xml:space="preserve">2.1 Контур анализа и реестр </w:t>
+      </w:r>
+      <w:r>
+        <w:rPr>
+          <w:b/>
+          <w:sz w:val="28"/>
+        </w:rPr>
+        <w:t>компаний</w:t>
       </w:r>
       <w:bookmarkEnd w:id="5"/>
     </w:p>
@@ -1806,13 +1876,7 @@
         <w:rPr>
           <w:sz w:val="28"/>
         </w:rPr>
-        <w:t xml:space="preserve">Контур определен списком ЛР4: </w:t>
-      </w:r>
-      <w:r>
-        <w:rPr>
-          <w:sz w:val="28"/>
-        </w:rPr>
-        <w:t>специализированные инструменты проверки (</w:t>
+        <w:t>Контур определен списком ЛР4: специализированные инструменты проверки (</w:t>
       </w:r>
       <w:r>
         <w:rPr>
@@ -1981,7 +2045,13 @@
         <w:rPr>
           <w:sz w:val="28"/>
         </w:rPr>
-        <w:t xml:space="preserve"> 365 </w:t>
+        <w:t xml:space="preserve"> 36</w:t>
+      </w:r>
+      <w:r>
+        <w:rPr>
+          <w:sz w:val="28"/>
+        </w:rPr>
+        <w:t xml:space="preserve">5 </w:t>
       </w:r>
       <w:r>
         <w:rPr>
@@ -1994,13 +2064,7 @@
         <w:rPr>
           <w:sz w:val="28"/>
         </w:rPr>
-        <w:t>. Для анализа товара и бизнес-</w:t>
-      </w:r>
-      <w:r>
-        <w:rPr>
-          <w:sz w:val="28"/>
-        </w:rPr>
-        <w:t>модели выбраны 7 конкурентов с достаточными открытыми данными (норма шаблона 5-12), для классификации - 10 компаний.</w:t>
+        <w:t>. Для анализа товара и бизнес-модели выбраны 7 конкурентов с достаточными открытыми данными (норма шаблона 5-12), для классификации - 10 компаний.</w:t>
       </w:r>
     </w:p>
     <w:p>
@@ -2117,7 +2181,14 @@
                 <w:b/>
                 <w:sz w:val="24"/>
               </w:rPr>
-              <w:t>Тип</w:t>
+              <w:t>Т</w:t>
+            </w:r>
+            <w:r>
+              <w:rPr>
+                <w:b/>
+                <w:sz w:val="24"/>
+              </w:rPr>
+              <w:t>ип</w:t>
             </w:r>
           </w:p>
         </w:tc>
@@ -3486,7 +3557,14 @@
           <w:i/>
           <w:sz w:val="28"/>
         </w:rPr>
-        <w:t>C01-C07</w:t>
+        <w:t>C0</w:t>
+      </w:r>
+      <w:r>
+        <w:rPr>
+          <w:i/>
+          <w:sz w:val="28"/>
+        </w:rPr>
+        <w:t>1-C07</w:t>
       </w:r>
       <w:r>
         <w:rPr>
@@ -3502,7 +3580,7 @@
         <w:ind w:firstLine="709"/>
       </w:pPr>
       <w:bookmarkStart w:id="6" w:name="_6c38f46d6252626ee19bec51dca515ea8eb3483"/>
-      <w:bookmarkStart w:id="7" w:name="_Toc241934882"/>
+      <w:bookmarkStart w:id="7" w:name="_Toc241935055"/>
       <w:bookmarkEnd w:id="4"/>
       <w:r>
         <w:rPr>
@@ -3524,13 +3602,13 @@
         <w:rPr>
           <w:sz w:val="28"/>
         </w:rPr>
-        <w:t>Методика [1] оценивает каждую компанию по 10 критериям от 0 до 5 с весами и ограничителями: прямым конкурентом нельзя назвать компанию, у которой совпадение потребительской задачи или функциональная заменяемость ниж</w:t>
-      </w:r>
-      <w:r>
-        <w:rPr>
-          <w:sz w:val="28"/>
-        </w:rPr>
-        <w:t>е 3 баллов. Взвешенный балл переводится в уровень: 4,20-5,00 - прямой конкурент; 3,40-4,19 - близкий альтернативный; 2,50-3,39 - косвенный или заменитель; 1,60-2,49 - смежная конкуренция.</w:t>
+        <w:t>Методика [1] оценивает каждую компанию по 10 критериям от 0 до 5 с весами и ограничителями: прямым конкурентом нельзя назвать компанию, у которой совпадение потребительской зад</w:t>
+      </w:r>
+      <w:r>
+        <w:rPr>
+          <w:sz w:val="28"/>
+        </w:rPr>
+        <w:t>ачи или функциональная заменяемость ниже 3 баллов. Взвешенный балл переводится в уровень: 4,20-5,00 - прямой конкурент; 3,40-4,19 - близкий альтернативный; 2,50-3,39 - косвенный или заменитель; 1,60-2,49 - смежная конкуренция.</w:t>
       </w:r>
     </w:p>
     <w:p>
@@ -3544,7 +3622,13 @@
         <w:rPr>
           <w:sz w:val="28"/>
         </w:rPr>
-        <w:t>В таблице 2 представлено: критерии и веса классификации.</w:t>
+        <w:t>В таблице 2 представлено: кри</w:t>
+      </w:r>
+      <w:r>
+        <w:rPr>
+          <w:sz w:val="28"/>
+        </w:rPr>
+        <w:t>терии и веса классификации.</w:t>
       </w:r>
     </w:p>
     <w:p>
@@ -3557,13 +3641,7 @@
         <w:rPr>
           <w:sz w:val="28"/>
         </w:rPr>
-        <w:t>Таблица 2 –</w:t>
-      </w:r>
-      <w:r>
-        <w:rPr>
-          <w:sz w:val="28"/>
-        </w:rPr>
-        <w:t xml:space="preserve"> Критерии и веса классификации</w:t>
+        <w:t>Таблица 2 – Критерии и веса классификации</w:t>
       </w:r>
     </w:p>
     <w:tbl>
@@ -6272,7 +6350,7 @@
         </w:rPr>
         <w:lastRenderedPageBreak/>
         <w:drawing>
-          <wp:inline distT="0" distB="0" distL="0" distR="0" wp14:anchorId="2297C6BC" wp14:editId="33AFE12E">
+          <wp:inline distT="0" distB="0" distL="0" distR="0" wp14:anchorId="2CD1AB3C" wp14:editId="02A2F823">
             <wp:extent cx="5334000" cy="3122341"/>
             <wp:effectExtent l="0" t="0" r="0" b="0"/>
             <wp:docPr id="12" name="Picture"/>
@@ -6536,7 +6614,7 @@
         <w:ind w:firstLine="709"/>
       </w:pPr>
       <w:bookmarkStart w:id="8" w:name="_e6ba0285e0e0ccc17e7a33a4e535fa387865e88"/>
-      <w:bookmarkStart w:id="9" w:name="_Toc241934883"/>
+      <w:bookmarkStart w:id="9" w:name="_Toc241935056"/>
       <w:bookmarkEnd w:id="6"/>
       <w:r>
         <w:rPr>
@@ -8949,7 +9027,7 @@
         <w:ind w:firstLine="709"/>
       </w:pPr>
       <w:bookmarkStart w:id="10" w:name="_b8f6f14603ee9e71fb2e4d1c108750035f950c7"/>
-      <w:bookmarkStart w:id="11" w:name="_Toc241934884"/>
+      <w:bookmarkStart w:id="11" w:name="_Toc241935057"/>
       <w:bookmarkEnd w:id="8"/>
       <w:r>
         <w:rPr>
@@ -11931,7 +12009,7 @@
           <w:sz w:val="28"/>
         </w:rPr>
         <w:drawing>
-          <wp:inline distT="0" distB="0" distL="0" distR="0" wp14:anchorId="7D5E751A" wp14:editId="2BBF6D05">
+          <wp:inline distT="0" distB="0" distL="0" distR="0" wp14:anchorId="41161A4D" wp14:editId="07FBCFAC">
             <wp:extent cx="5334000" cy="3187390"/>
             <wp:effectExtent l="0" t="0" r="0" b="0"/>
             <wp:docPr id="17" name="Picture"/>
@@ -12478,7 +12556,7 @@
         <w:ind w:firstLine="709"/>
       </w:pPr>
       <w:bookmarkStart w:id="12" w:name="_823200a59a4cf40c51f7f0e02566c010f838ed7"/>
-      <w:bookmarkStart w:id="13" w:name="_Toc241934885"/>
+      <w:bookmarkStart w:id="13" w:name="_Toc241935058"/>
       <w:bookmarkEnd w:id="10"/>
       <w:r>
         <w:rPr>
@@ -13188,7 +13266,7 @@
         </w:rPr>
         <w:lastRenderedPageBreak/>
         <w:drawing>
-          <wp:inline distT="0" distB="0" distL="0" distR="0" wp14:anchorId="69C614FB" wp14:editId="6F1FDBEA">
+          <wp:inline distT="0" distB="0" distL="0" distR="0" wp14:anchorId="625ABFD7" wp14:editId="4E7E8A73">
             <wp:extent cx="5334000" cy="2862146"/>
             <wp:effectExtent l="0" t="0" r="0" b="0"/>
             <wp:docPr id="21" name="Picture"/>
@@ -13283,7 +13361,7 @@
         <w:ind w:firstLine="709"/>
       </w:pPr>
       <w:bookmarkStart w:id="14" w:name="_9d579ff3219dd0c08e87cdba2a2a6d1ef61e3cc"/>
-      <w:bookmarkStart w:id="15" w:name="_Toc241934886"/>
+      <w:bookmarkStart w:id="15" w:name="_Toc241935059"/>
       <w:bookmarkEnd w:id="12"/>
       <w:r>
         <w:rPr>
@@ -15197,7 +15275,7 @@
         <w:ind w:firstLine="709"/>
       </w:pPr>
       <w:bookmarkStart w:id="16" w:name="_8be076d9797953e124cfe81356f035b108674c3"/>
-      <w:bookmarkStart w:id="17" w:name="_Toc241934887"/>
+      <w:bookmarkStart w:id="17" w:name="_Toc241935060"/>
       <w:bookmarkEnd w:id="14"/>
       <w:r>
         <w:rPr>
@@ -17867,7 +17945,7 @@
         <w:ind w:firstLine="709"/>
       </w:pPr>
       <w:bookmarkStart w:id="18" w:name="_0ab5b5274b575dfb9e5e85d7a9a12b82683e52c"/>
-      <w:bookmarkStart w:id="19" w:name="_Toc241934888"/>
+      <w:bookmarkStart w:id="19" w:name="_Toc241935061"/>
       <w:bookmarkEnd w:id="16"/>
       <w:r>
         <w:rPr>
@@ -24829,7 +24907,7 @@
           <w:sz w:val="28"/>
         </w:rPr>
         <w:drawing>
-          <wp:inline distT="0" distB="0" distL="0" distR="0" wp14:anchorId="34448E14" wp14:editId="450B68A9">
+          <wp:inline distT="0" distB="0" distL="0" distR="0" wp14:anchorId="67923478" wp14:editId="6EF3BF80">
             <wp:extent cx="5334000" cy="2471853"/>
             <wp:effectExtent l="0" t="0" r="0" b="0"/>
             <wp:docPr id="27" name="Picture"/>
@@ -26440,7 +26518,7 @@
         <w:ind w:firstLine="709"/>
       </w:pPr>
       <w:bookmarkStart w:id="20" w:name="_79cbfa74df5b3f3beef1cd24c3ad9f089a58d7a"/>
-      <w:bookmarkStart w:id="21" w:name="_Toc241934889"/>
+      <w:bookmarkStart w:id="21" w:name="_Toc241935062"/>
       <w:bookmarkEnd w:id="18"/>
       <w:r>
         <w:rPr>
@@ -27919,7 +27997,7 @@
         <w:ind w:firstLine="709"/>
       </w:pPr>
       <w:bookmarkStart w:id="22" w:name="_339ae803435bd6b9a653c2b18dadc62dc9ad8e7"/>
-      <w:bookmarkStart w:id="23" w:name="_Toc241934890"/>
+      <w:bookmarkStart w:id="23" w:name="_Toc241935063"/>
       <w:bookmarkEnd w:id="20"/>
       <w:r>
         <w:rPr>
@@ -28110,7 +28188,7 @@
         <w:ind w:firstLine="709"/>
       </w:pPr>
       <w:bookmarkStart w:id="24" w:name="_1bfdad9d2d88ddb6ca16c31c1d4d4943679f32f"/>
-      <w:bookmarkStart w:id="25" w:name="_Toc241934891"/>
+      <w:bookmarkStart w:id="25" w:name="_Toc241935064"/>
       <w:bookmarkEnd w:id="22"/>
       <w:bookmarkEnd w:id="2"/>
       <w:r>
@@ -28325,7 +28403,7 @@
         <w:jc w:val="center"/>
       </w:pPr>
       <w:bookmarkStart w:id="26" w:name="_выводы"/>
-      <w:bookmarkStart w:id="27" w:name="_Toc241934892"/>
+      <w:bookmarkStart w:id="27" w:name="_Toc241935065"/>
       <w:bookmarkEnd w:id="24"/>
       <w:r>
         <w:rPr>
@@ -28587,7 +28665,7 @@
         <w:jc w:val="center"/>
       </w:pPr>
       <w:bookmarkStart w:id="28" w:name="_274f6a444530ef90b0479dabf3d210f01e97699"/>
-      <w:bookmarkStart w:id="29" w:name="_Toc241934893"/>
+      <w:bookmarkStart w:id="29" w:name="_Toc241935066"/>
       <w:bookmarkEnd w:id="26"/>
       <w:r>
         <w:rPr>
@@ -29836,6 +29914,553 @@
     </w:p>
     <w:p>
       <w:pPr>
+        <w:pStyle w:val="FirstParagraph"/>
+        <w:numPr>
+          <w:ilvl w:val="0"/>
+          <w:numId w:val="3"/>
+        </w:numPr>
+        <w:spacing w:before="0" w:after="0" w:line="360" w:lineRule="exact"/>
+        <w:ind w:left="709" w:hanging="425"/>
+        <w:jc w:val="both"/>
+      </w:pPr>
+      <w:r>
+        <w:rPr>
+          <w:i/>
+          <w:sz w:val="28"/>
+        </w:rPr>
+        <w:t>DataSnipper</w:t>
+      </w:r>
+      <w:r>
+        <w:rPr>
+          <w:sz w:val="28"/>
+        </w:rPr>
+        <w:t xml:space="preserve">. </w:t>
+      </w:r>
+      <w:r>
+        <w:rPr>
+          <w:i/>
+          <w:sz w:val="28"/>
+        </w:rPr>
+        <w:t>DataSnipper</w:t>
+      </w:r>
+      <w:r>
+        <w:rPr>
+          <w:sz w:val="28"/>
+        </w:rPr>
+        <w:t xml:space="preserve"> </w:t>
+      </w:r>
+      <w:r>
+        <w:rPr>
+          <w:i/>
+          <w:sz w:val="28"/>
+        </w:rPr>
+        <w:t>Raises</w:t>
+      </w:r>
+      <w:r>
+        <w:rPr>
+          <w:sz w:val="28"/>
+        </w:rPr>
+        <w:t xml:space="preserve"> $100</w:t>
+      </w:r>
+      <w:r>
+        <w:rPr>
+          <w:i/>
+          <w:sz w:val="28"/>
+        </w:rPr>
+        <w:t>M</w:t>
+      </w:r>
+      <w:r>
+        <w:rPr>
+          <w:sz w:val="28"/>
+        </w:rPr>
+        <w:t xml:space="preserve"> </w:t>
+      </w:r>
+      <w:r>
+        <w:rPr>
+          <w:i/>
+          <w:sz w:val="28"/>
+        </w:rPr>
+        <w:t>at</w:t>
+      </w:r>
+      <w:r>
+        <w:rPr>
+          <w:sz w:val="28"/>
+        </w:rPr>
+        <w:t xml:space="preserve"> $1</w:t>
+      </w:r>
+      <w:r>
+        <w:rPr>
+          <w:i/>
+          <w:sz w:val="28"/>
+        </w:rPr>
+        <w:t>B</w:t>
+      </w:r>
+      <w:r>
+        <w:rPr>
+          <w:sz w:val="28"/>
+        </w:rPr>
+        <w:t xml:space="preserve"> </w:t>
+      </w:r>
+      <w:r>
+        <w:rPr>
+          <w:i/>
+          <w:sz w:val="28"/>
+        </w:rPr>
+        <w:t>Valuation</w:t>
+      </w:r>
+      <w:r>
+        <w:rPr>
+          <w:sz w:val="28"/>
+        </w:rPr>
+        <w:t xml:space="preserve"> [Электронный ресурс]. – Режим доступа: h</w:t>
+      </w:r>
+      <w:r>
+        <w:rPr>
+          <w:sz w:val="28"/>
+        </w:rPr>
+        <w:t>ttps://www.datasnipper.com/resources/datasnipper-raises-100m. – Дата доступа: 03.10.2026.</w:t>
+      </w:r>
+    </w:p>
+    <w:p>
+      <w:pPr>
+        <w:pStyle w:val="FirstParagraph"/>
+        <w:numPr>
+          <w:ilvl w:val="0"/>
+          <w:numId w:val="3"/>
+        </w:numPr>
+        <w:spacing w:before="0" w:after="0" w:line="360" w:lineRule="exact"/>
+        <w:ind w:left="709" w:hanging="425"/>
+        <w:jc w:val="both"/>
+      </w:pPr>
+      <w:r>
+        <w:rPr>
+          <w:i/>
+          <w:sz w:val="28"/>
+        </w:rPr>
+        <w:t>Calcalist</w:t>
+      </w:r>
+      <w:r>
+        <w:rPr>
+          <w:sz w:val="28"/>
+        </w:rPr>
+        <w:t xml:space="preserve">. </w:t>
+      </w:r>
+      <w:r>
+        <w:rPr>
+          <w:i/>
+          <w:sz w:val="28"/>
+        </w:rPr>
+        <w:t>AI</w:t>
+      </w:r>
+      <w:r>
+        <w:rPr>
+          <w:sz w:val="28"/>
+        </w:rPr>
+        <w:t xml:space="preserve"> </w:t>
+      </w:r>
+      <w:r>
+        <w:rPr>
+          <w:i/>
+          <w:sz w:val="28"/>
+        </w:rPr>
+        <w:t>finance</w:t>
+      </w:r>
+      <w:r>
+        <w:rPr>
+          <w:sz w:val="28"/>
+        </w:rPr>
+        <w:t xml:space="preserve"> </w:t>
+      </w:r>
+      <w:r>
+        <w:rPr>
+          <w:i/>
+          <w:sz w:val="28"/>
+        </w:rPr>
+        <w:t>startup</w:t>
+      </w:r>
+      <w:r>
+        <w:rPr>
+          <w:sz w:val="28"/>
+        </w:rPr>
+        <w:t xml:space="preserve"> </w:t>
+      </w:r>
+      <w:r>
+        <w:rPr>
+          <w:i/>
+          <w:sz w:val="28"/>
+        </w:rPr>
+        <w:t>Datarails</w:t>
+      </w:r>
+      <w:r>
+        <w:rPr>
+          <w:sz w:val="28"/>
+        </w:rPr>
+        <w:t xml:space="preserve"> </w:t>
+      </w:r>
+      <w:r>
+        <w:rPr>
+          <w:i/>
+          <w:sz w:val="28"/>
+        </w:rPr>
+        <w:t>secures</w:t>
+      </w:r>
+      <w:r>
+        <w:rPr>
+          <w:sz w:val="28"/>
+        </w:rPr>
+        <w:t xml:space="preserve"> $70 </w:t>
+      </w:r>
+      <w:r>
+        <w:rPr>
+          <w:i/>
+          <w:sz w:val="28"/>
+        </w:rPr>
+        <w:t>million</w:t>
+      </w:r>
+      <w:r>
+        <w:rPr>
+          <w:sz w:val="28"/>
+        </w:rPr>
+        <w:t xml:space="preserve"> </w:t>
+      </w:r>
+      <w:r>
+        <w:rPr>
+          <w:i/>
+          <w:sz w:val="28"/>
+        </w:rPr>
+        <w:t>Series</w:t>
+      </w:r>
+      <w:r>
+        <w:rPr>
+          <w:sz w:val="28"/>
+        </w:rPr>
+        <w:t xml:space="preserve"> </w:t>
+      </w:r>
+      <w:r>
+        <w:rPr>
+          <w:i/>
+          <w:sz w:val="28"/>
+        </w:rPr>
+        <w:t>C</w:t>
+      </w:r>
+      <w:r>
+        <w:rPr>
+          <w:sz w:val="28"/>
+        </w:rPr>
+        <w:t xml:space="preserve"> </w:t>
+      </w:r>
+      <w:r>
+        <w:rPr>
+          <w:i/>
+          <w:sz w:val="28"/>
+        </w:rPr>
+        <w:t>at</w:t>
+      </w:r>
+      <w:r>
+        <w:rPr>
+          <w:sz w:val="28"/>
+        </w:rPr>
+        <w:t xml:space="preserve"> $550 </w:t>
+      </w:r>
+      <w:r>
+        <w:rPr>
+          <w:i/>
+          <w:sz w:val="28"/>
+        </w:rPr>
+        <w:t>million</w:t>
+      </w:r>
+      <w:r>
+        <w:rPr>
+          <w:sz w:val="28"/>
+        </w:rPr>
+        <w:t xml:space="preserve"> </w:t>
+      </w:r>
+      <w:r>
+        <w:rPr>
+          <w:i/>
+          <w:sz w:val="28"/>
+        </w:rPr>
+        <w:t>valuation</w:t>
+      </w:r>
+      <w:r>
+        <w:rPr>
+          <w:sz w:val="28"/>
+        </w:rPr>
+        <w:t xml:space="preserve"> [Электронный ресурс]. – Режим доступа: https://www.calcalistech.com/cte</w:t>
+      </w:r>
+      <w:r>
+        <w:rPr>
+          <w:sz w:val="28"/>
+        </w:rPr>
+        <w:t>chnews/article/sk00jsmasbl. – Дата доступа: 03.10.2026.</w:t>
+      </w:r>
+    </w:p>
+    <w:p>
+      <w:pPr>
+        <w:pStyle w:val="FirstParagraph"/>
+        <w:numPr>
+          <w:ilvl w:val="0"/>
+          <w:numId w:val="3"/>
+        </w:numPr>
+        <w:spacing w:before="0" w:after="0" w:line="360" w:lineRule="exact"/>
+        <w:ind w:left="709" w:hanging="425"/>
+        <w:jc w:val="both"/>
+      </w:pPr>
+      <w:r>
+        <w:rPr>
+          <w:i/>
+          <w:sz w:val="28"/>
+        </w:rPr>
+        <w:t>TechCrunch</w:t>
+      </w:r>
+      <w:r>
+        <w:rPr>
+          <w:sz w:val="28"/>
+        </w:rPr>
+        <w:t xml:space="preserve">. </w:t>
+      </w:r>
+      <w:r>
+        <w:rPr>
+          <w:i/>
+          <w:sz w:val="28"/>
+        </w:rPr>
+        <w:t>Fundamental</w:t>
+      </w:r>
+      <w:r>
+        <w:rPr>
+          <w:sz w:val="28"/>
+        </w:rPr>
+        <w:t xml:space="preserve"> </w:t>
+      </w:r>
+      <w:r>
+        <w:rPr>
+          <w:i/>
+          <w:sz w:val="28"/>
+        </w:rPr>
+        <w:t>Research</w:t>
+      </w:r>
+      <w:r>
+        <w:rPr>
+          <w:sz w:val="28"/>
+        </w:rPr>
+        <w:t xml:space="preserve"> </w:t>
+      </w:r>
+      <w:r>
+        <w:rPr>
+          <w:i/>
+          <w:sz w:val="28"/>
+        </w:rPr>
+        <w:t>Labs</w:t>
+      </w:r>
+      <w:r>
+        <w:rPr>
+          <w:sz w:val="28"/>
+        </w:rPr>
+        <w:t xml:space="preserve"> </w:t>
+      </w:r>
+      <w:r>
+        <w:rPr>
+          <w:i/>
+          <w:sz w:val="28"/>
+        </w:rPr>
+        <w:t>nabs</w:t>
+      </w:r>
+      <w:r>
+        <w:rPr>
+          <w:sz w:val="28"/>
+        </w:rPr>
+        <w:t xml:space="preserve"> $30</w:t>
+      </w:r>
+      <w:r>
+        <w:rPr>
+          <w:i/>
+          <w:sz w:val="28"/>
+        </w:rPr>
+        <w:t>M</w:t>
+      </w:r>
+      <w:r>
+        <w:rPr>
+          <w:sz w:val="28"/>
+        </w:rPr>
+        <w:t xml:space="preserve"> </w:t>
+      </w:r>
+      <w:r>
+        <w:rPr>
+          <w:i/>
+          <w:sz w:val="28"/>
+        </w:rPr>
+        <w:t>from</w:t>
+      </w:r>
+      <w:r>
+        <w:rPr>
+          <w:sz w:val="28"/>
+        </w:rPr>
+        <w:t xml:space="preserve"> </w:t>
+      </w:r>
+      <w:r>
+        <w:rPr>
+          <w:i/>
+          <w:sz w:val="28"/>
+        </w:rPr>
+        <w:t>Prosus</w:t>
+      </w:r>
+      <w:r>
+        <w:rPr>
+          <w:sz w:val="28"/>
+        </w:rPr>
+        <w:t xml:space="preserve"> </w:t>
+      </w:r>
+      <w:r>
+        <w:rPr>
+          <w:i/>
+          <w:sz w:val="28"/>
+        </w:rPr>
+        <w:t>to</w:t>
+      </w:r>
+      <w:r>
+        <w:rPr>
+          <w:sz w:val="28"/>
+        </w:rPr>
+        <w:t xml:space="preserve"> </w:t>
+      </w:r>
+      <w:r>
+        <w:rPr>
+          <w:i/>
+          <w:sz w:val="28"/>
+        </w:rPr>
+        <w:t>build</w:t>
+      </w:r>
+      <w:r>
+        <w:rPr>
+          <w:sz w:val="28"/>
+        </w:rPr>
+        <w:t xml:space="preserve"> </w:t>
+      </w:r>
+      <w:r>
+        <w:rPr>
+          <w:i/>
+          <w:sz w:val="28"/>
+        </w:rPr>
+        <w:t>AI</w:t>
+      </w:r>
+      <w:r>
+        <w:rPr>
+          <w:sz w:val="28"/>
+        </w:rPr>
+        <w:t xml:space="preserve"> </w:t>
+      </w:r>
+      <w:r>
+        <w:rPr>
+          <w:i/>
+          <w:sz w:val="28"/>
+        </w:rPr>
+        <w:t>agents</w:t>
+      </w:r>
+      <w:r>
+        <w:rPr>
+          <w:sz w:val="28"/>
+        </w:rPr>
+        <w:t xml:space="preserve"> </w:t>
+      </w:r>
+      <w:r>
+        <w:rPr>
+          <w:i/>
+          <w:sz w:val="28"/>
+        </w:rPr>
+        <w:t>for</w:t>
+      </w:r>
+      <w:r>
+        <w:rPr>
+          <w:sz w:val="28"/>
+        </w:rPr>
+        <w:t xml:space="preserve"> </w:t>
+      </w:r>
+      <w:r>
+        <w:rPr>
+          <w:i/>
+          <w:sz w:val="28"/>
+        </w:rPr>
+        <w:t>multiple</w:t>
+      </w:r>
+      <w:r>
+        <w:rPr>
+          <w:sz w:val="28"/>
+        </w:rPr>
+        <w:t xml:space="preserve"> </w:t>
+      </w:r>
+      <w:r>
+        <w:rPr>
+          <w:i/>
+          <w:sz w:val="28"/>
+        </w:rPr>
+        <w:t>verticals</w:t>
+      </w:r>
+      <w:r>
+        <w:rPr>
+          <w:sz w:val="28"/>
+        </w:rPr>
+        <w:t xml:space="preserve"> [Электронный ресурс]. – Режим доступа: https://techcrunch.com/2025/08/01/fundamental-research-labs-nabs-30-million-from-prosus-to-build-ai-agents-for-multiple-verticals. – Дата доступа: 03.10.2026.</w:t>
+      </w:r>
+    </w:p>
+    <w:p>
+      <w:pPr>
+        <w:pStyle w:val="FirstParagraph"/>
+        <w:numPr>
+          <w:ilvl w:val="0"/>
+          <w:numId w:val="3"/>
+        </w:numPr>
+        <w:spacing w:before="0" w:after="0" w:line="360" w:lineRule="exact"/>
+        <w:ind w:left="709" w:hanging="425"/>
+        <w:jc w:val="both"/>
+      </w:pPr>
+      <w:r>
+        <w:rPr>
+          <w:i/>
+          <w:sz w:val="28"/>
+        </w:rPr>
+        <w:t>PerfectXL</w:t>
+      </w:r>
+      <w:r>
+        <w:rPr>
+          <w:sz w:val="28"/>
+        </w:rPr>
+        <w:t xml:space="preserve">. </w:t>
+      </w:r>
+      <w:r>
+        <w:rPr>
+          <w:i/>
+          <w:sz w:val="28"/>
+        </w:rPr>
+        <w:t>History</w:t>
+      </w:r>
+      <w:r>
+        <w:rPr>
+          <w:sz w:val="28"/>
+        </w:rPr>
+        <w:t xml:space="preserve">; </w:t>
+      </w:r>
+      <w:r>
+        <w:rPr>
+          <w:i/>
+          <w:sz w:val="28"/>
+        </w:rPr>
+        <w:t>About</w:t>
+      </w:r>
+      <w:r>
+        <w:rPr>
+          <w:sz w:val="28"/>
+        </w:rPr>
+        <w:t xml:space="preserve"> [Электронный ресурс]. – Режим д</w:t>
+      </w:r>
+      <w:r>
+        <w:rPr>
+          <w:sz w:val="28"/>
+        </w:rPr>
+        <w:t>оступа: https://www.perfectxl.com/about-us/history/. – Дата доступа: 03.10.2026.</w:t>
+      </w:r>
+    </w:p>
+    <w:p>
+      <w:pPr>
         <w:pStyle w:val="1"/>
         <w:keepNext w:val="0"/>
         <w:pageBreakBefore/>
@@ -29843,7 +30468,7 @@
         <w:jc w:val="center"/>
       </w:pPr>
       <w:bookmarkStart w:id="30" w:name="_3d74faf1500c1b2a4a8bfa8e0e37c74206ce73d"/>
-      <w:bookmarkStart w:id="31" w:name="_Toc241934894"/>
+      <w:bookmarkStart w:id="31" w:name="_Toc241935067"/>
       <w:bookmarkEnd w:id="28"/>
       <w:r>
         <w:rPr>
@@ -29891,13 +30516,7 @@
         <w:rPr>
           <w:sz w:val="28"/>
         </w:rPr>
-        <w:t xml:space="preserve">В приложении собраны допущения ЛР5 в </w:t>
-      </w:r>
-      <w:r>
-        <w:rPr>
-          <w:sz w:val="28"/>
-        </w:rPr>
-        <w:t>дополнение к допущениям Д-01…Д-21 предыдущих работ.</w:t>
+        <w:t>В приложении собраны допущения ЛР5 в дополнение к допущениям Д-01…Д-21 предыдущих работ.</w:t>
       </w:r>
     </w:p>
     <w:p>
@@ -30590,7 +31209,7 @@
         <w:jc w:val="center"/>
       </w:pPr>
       <w:bookmarkStart w:id="32" w:name="_d684f183eb868ee4ace295916bed2e6be64d16e"/>
-      <w:bookmarkStart w:id="33" w:name="_Toc241934895"/>
+      <w:bookmarkStart w:id="33" w:name="_Toc241935068"/>
       <w:bookmarkEnd w:id="30"/>
       <w:r>
         <w:rPr>
@@ -31131,13 +31750,7 @@
               <w:rPr>
                 <w:sz w:val="24"/>
               </w:rPr>
-              <w:t>аудитория студен</w:t>
-            </w:r>
-            <w:r>
-              <w:rPr>
-                <w:sz w:val="24"/>
-              </w:rPr>
-              <w:t>тки</w:t>
+              <w:t>аудитория студентки</w:t>
             </w:r>
           </w:p>
         </w:tc>
@@ -31405,7 +32018,27 @@
               <w:rPr>
                 <w:sz w:val="24"/>
               </w:rPr>
-              <w:t>собрать по карточкам</w:t>
+              <w:t xml:space="preserve">финансирование найдено в открытых источниках (приложение Д); выручку и штат уточнить в </w:t>
+            </w:r>
+            <w:r>
+              <w:rPr>
+                <w:i/>
+                <w:sz w:val="24"/>
+              </w:rPr>
+              <w:t>Crunchbase</w:t>
+            </w:r>
+            <w:r>
+              <w:rPr>
+                <w:sz w:val="24"/>
+              </w:rPr>
+              <w:t xml:space="preserve"> и </w:t>
+            </w:r>
+            <w:r>
+              <w:rPr>
+                <w:i/>
+                <w:sz w:val="24"/>
+              </w:rPr>
+              <w:t>LinkedIn</w:t>
             </w:r>
           </w:p>
         </w:tc>
@@ -31441,13 +32074,7 @@
         <w:rPr>
           <w:sz w:val="28"/>
         </w:rPr>
-        <w:t>Пункты 1-4 выполняются в браузере под аккаунтом студентки; пункт 5 требует</w:t>
-      </w:r>
-      <w:r>
-        <w:rPr>
-          <w:sz w:val="28"/>
-        </w:rPr>
-        <w:t xml:space="preserve"> доступа к </w:t>
+        <w:t xml:space="preserve">Пункты 1-4 выполняются в браузере под аккаунтом студентки; пункт 5 требует доступа к </w:t>
       </w:r>
       <w:r>
         <w:rPr>
@@ -31485,7 +32112,7 @@
         <w:jc w:val="center"/>
       </w:pPr>
       <w:bookmarkStart w:id="34" w:name="_cb59224a7032ef66ab429e7df9b4e4c597bc187"/>
-      <w:bookmarkStart w:id="35" w:name="_Toc241934896"/>
+      <w:bookmarkStart w:id="35" w:name="_Toc241935069"/>
       <w:bookmarkEnd w:id="32"/>
       <w:r>
         <w:rPr>
@@ -31879,13 +32506,7 @@
               <w:rPr>
                 <w:sz w:val="24"/>
               </w:rPr>
-              <w:t xml:space="preserve"> горизонтального диапазона баллов и вертикального д</w:t>
-            </w:r>
-            <w:r>
-              <w:rPr>
-                <w:sz w:val="24"/>
-              </w:rPr>
-              <w:t>иапазона весов давал #ЗНАЧ!</w:t>
+              <w:t xml:space="preserve"> горизонтального диапазона баллов и вертикального диапазона весов давал #ЗНАЧ!</w:t>
             </w:r>
           </w:p>
         </w:tc>
@@ -32069,7 +32690,13 @@
               <w:rPr>
                 <w:sz w:val="24"/>
               </w:rPr>
-              <w:t>строка весов блоков была пустой, индекс силы делился на ноль</w:t>
+              <w:t>строка весов</w:t>
+            </w:r>
+            <w:r>
+              <w:rPr>
+                <w:sz w:val="24"/>
+              </w:rPr>
+              <w:t xml:space="preserve"> блоков была пустой, индекс силы делился на ноль</w:t>
             </w:r>
           </w:p>
         </w:tc>
@@ -32183,13 +32810,13 @@
               <w:rPr>
                 <w:sz w:val="24"/>
               </w:rPr>
-              <w:t>знаменатель заменен на 12</w:t>
-            </w:r>
-            <w:r>
-              <w:rPr>
-                <w:sz w:val="24"/>
-              </w:rPr>
-              <w:t>_Сводка!</w:t>
+              <w:t xml:space="preserve">знаменатель заменен на </w:t>
+            </w:r>
+            <w:r>
+              <w:rPr>
+                <w:sz w:val="24"/>
+              </w:rPr>
+              <w:t>12_Сводка!</w:t>
             </w:r>
             <w:r>
               <w:rPr>
@@ -32231,7 +32858,7 @@
         <w:jc w:val="center"/>
       </w:pPr>
       <w:bookmarkStart w:id="36" w:name="_c34bf756927ff692ee086e018f9b8545647766e"/>
-      <w:bookmarkStart w:id="37" w:name="_Toc241934897"/>
+      <w:bookmarkStart w:id="37" w:name="_Toc241935070"/>
       <w:bookmarkEnd w:id="34"/>
       <w:r>
         <w:rPr>
@@ -32279,7 +32906,13 @@
         <w:rPr>
           <w:sz w:val="28"/>
         </w:rPr>
-        <w:t xml:space="preserve">Для проверки методики Кано сгенерированы модельные ответы 30 условных респондентов на пары функциональных и дисфункциональных вопросов по 16 функциям (по решению студентки, Р-8; генератор и файлы - в папке 00_Общее/Опрос_модельный, </w:t>
+        <w:t>Для проверки методики Кано сгенерированы модельные ответы 30 условных респондентов на пары ф</w:t>
+      </w:r>
+      <w:r>
+        <w:rPr>
+          <w:sz w:val="28"/>
+        </w:rPr>
+        <w:t xml:space="preserve">ункциональных и дисфункциональных вопросов по 16 функциям (по решению студентки, Р-8; генератор и файлы - в папке 00_Общее/Опрос_модельный, </w:t>
       </w:r>
       <w:r>
         <w:rPr>
@@ -32292,7 +32925,13 @@
         <w:rPr>
           <w:sz w:val="28"/>
         </w:rPr>
-        <w:t xml:space="preserve"> 20261003). Это модельные данные, а не опрос людей: вероятность согласия с категорией аналитика задана параметром 58 %, поэтому совпадение с таблицей 6 неизбежно и подтверждает только работу расчета, а не истинность категорий.</w:t>
+        <w:t xml:space="preserve"> 20261003). Это модельные данные, а не опрос людей: вероятность согласия с категорией аналитика задана параметро</w:t>
+      </w:r>
+      <w:r>
+        <w:rPr>
+          <w:sz w:val="28"/>
+        </w:rPr>
+        <w:t>м 58 %, поэтому совпадение с таблицей 6 неизбежно и подтверждает только работу расчета, а не истинность категорий.</w:t>
       </w:r>
     </w:p>
     <w:p>
@@ -32306,13 +32945,7 @@
         <w:rPr>
           <w:sz w:val="28"/>
         </w:rPr>
-        <w:t>В таблице 24 представлено: мо</w:t>
-      </w:r>
-      <w:r>
-        <w:rPr>
-          <w:sz w:val="28"/>
-        </w:rPr>
-        <w:t>дельные категории Кано по функциям.</w:t>
+        <w:t>В таблице 24 представлено: модельные категории Кано по функциям.</w:t>
       </w:r>
     </w:p>
     <w:p>
@@ -34506,13 +35139,13 @@
         <w:rPr>
           <w:sz w:val="28"/>
         </w:rPr>
-        <w:t xml:space="preserve">Модальная категория совпала с назначенной аналитиком у 15 из 16 функций; расхождения: «Кейсы, </w:t>
-      </w:r>
-      <w:r>
-        <w:rPr>
-          <w:sz w:val="28"/>
-        </w:rPr>
-        <w:t>клиенты и отзывы» (аналитик: линейное, модель: обязательное). Наибольшее недовольство при отсутствии функции (</w:t>
+        <w:t xml:space="preserve">Модальная категория совпала с назначенной аналитиком у 15 из 16 функций; расхождения: «Кейсы, клиенты и отзывы» (аналитик: линейное, модель: обязательное). Наибольшее </w:t>
+      </w:r>
+      <w:r>
+        <w:rPr>
+          <w:sz w:val="28"/>
+        </w:rPr>
+        <w:t>недовольство при отсутствии функции (</w:t>
       </w:r>
       <w:r>
         <w:rPr>
@@ -34551,13 +35184,7 @@
         <w:rPr>
           <w:sz w:val="28"/>
         </w:rPr>
-        <w:t xml:space="preserve">) </w:t>
-      </w:r>
-      <w:r>
-        <w:rPr>
-          <w:sz w:val="28"/>
-        </w:rPr>
-        <w:t>дают «Автоматическое исправление ошибок», «</w:t>
+        <w:t>) дают «Автоматическое исправление ошибок», «</w:t>
       </w:r>
       <w:r>
         <w:rPr>
@@ -34570,7 +35197,13 @@
         <w:rPr>
           <w:sz w:val="28"/>
         </w:rPr>
-        <w:t>-пояснения и подсказки», «Сравнение версий файлов».</w:t>
+        <w:t>-пояснения и подсказки», «Ср</w:t>
+      </w:r>
+      <w:r>
+        <w:rPr>
+          <w:sz w:val="28"/>
+        </w:rPr>
+        <w:t>авнение версий файлов».</w:t>
       </w:r>
     </w:p>
     <w:p>
@@ -34597,16 +35230,1049 @@
         <w:rPr>
           <w:sz w:val="28"/>
         </w:rPr>
-        <w:t xml:space="preserve"> заменяется, а модальные категории и коэффициенты пересчитываются тем же ск</w:t>
-      </w:r>
-      <w:r>
-        <w:rPr>
-          <w:sz w:val="28"/>
-        </w:rPr>
-        <w:t>риптом; категории в листе 04_Кано книги корректируются по результату.</w:t>
+        <w:t xml:space="preserve"> заменяется, а модальные категории и коэффициенты пересчитываются тем же скриптом; категории в листе 04_Кано книги корректируются по результату.</w:t>
       </w:r>
     </w:p>
-    <w:bookmarkEnd w:id="36"/>
+    <w:p>
+      <w:pPr>
+        <w:pStyle w:val="1"/>
+        <w:keepNext w:val="0"/>
+        <w:pageBreakBefore/>
+        <w:spacing w:before="0" w:after="0" w:line="360" w:lineRule="exact"/>
+        <w:jc w:val="center"/>
+      </w:pPr>
+      <w:bookmarkStart w:id="38" w:name="_fced6403ae4a6291124e2bc0068517b8abae511"/>
+      <w:bookmarkStart w:id="39" w:name="_Toc241935071"/>
+      <w:bookmarkEnd w:id="36"/>
+      <w:r>
+        <w:rPr>
+          <w:b/>
+          <w:sz w:val="28"/>
+        </w:rPr>
+        <w:lastRenderedPageBreak/>
+        <w:t>ПРИ</w:t>
+      </w:r>
+      <w:r>
+        <w:rPr>
+          <w:b/>
+          <w:sz w:val="28"/>
+        </w:rPr>
+        <w:t>ЛОЖЕНИЕ Д</w:t>
+      </w:r>
+      <w:bookmarkEnd w:id="39"/>
+    </w:p>
+    <w:p>
+      <w:pPr>
+        <w:spacing w:after="0" w:line="360" w:lineRule="exact"/>
+        <w:jc w:val="center"/>
+      </w:pPr>
+      <w:r>
+        <w:rPr>
+          <w:sz w:val="28"/>
+        </w:rPr>
+        <w:t>(справочное)</w:t>
+      </w:r>
+    </w:p>
+    <w:p>
+      <w:pPr>
+        <w:spacing w:after="360" w:line="360" w:lineRule="exact"/>
+        <w:jc w:val="center"/>
+      </w:pPr>
+      <w:r>
+        <w:rPr>
+          <w:b/>
+          <w:sz w:val="28"/>
+        </w:rPr>
+        <w:t>Данные о компаниях из открытых источников</w:t>
+      </w:r>
+    </w:p>
+    <w:p>
+      <w:pPr>
+        <w:pStyle w:val="FirstParagraph"/>
+        <w:spacing w:before="0" w:after="0" w:line="360" w:lineRule="exact"/>
+        <w:ind w:firstLine="709"/>
+        <w:jc w:val="both"/>
+      </w:pPr>
+      <w:r>
+        <w:rPr>
+          <w:sz w:val="28"/>
+        </w:rPr>
+        <w:t xml:space="preserve">Вместо </w:t>
+      </w:r>
+      <w:r>
+        <w:rPr>
+          <w:i/>
+          <w:sz w:val="28"/>
+        </w:rPr>
+        <w:t>Crunchbase</w:t>
+      </w:r>
+      <w:r>
+        <w:rPr>
+          <w:sz w:val="28"/>
+        </w:rPr>
+        <w:t xml:space="preserve"> и </w:t>
+      </w:r>
+      <w:r>
+        <w:rPr>
+          <w:i/>
+          <w:sz w:val="28"/>
+        </w:rPr>
+        <w:t>LinkedIn</w:t>
+      </w:r>
+      <w:r>
+        <w:rPr>
+          <w:sz w:val="28"/>
+        </w:rPr>
+        <w:t xml:space="preserve">, доступ к которым требует личного аккаунта, финансирование и размер компаний найдены в новостях и пресс-релизах 03.10.2026. Значения справочные и в </w:t>
+      </w:r>
+      <w:r>
+        <w:rPr>
+          <w:sz w:val="28"/>
+        </w:rPr>
+        <w:t>расчетах баллов ЛР5 не использовались.</w:t>
+      </w:r>
+    </w:p>
+    <w:p>
+      <w:pPr>
+        <w:pStyle w:val="a0"/>
+        <w:spacing w:before="0" w:after="0" w:line="360" w:lineRule="exact"/>
+        <w:ind w:firstLine="709"/>
+        <w:jc w:val="both"/>
+      </w:pPr>
+      <w:r>
+        <w:rPr>
+          <w:sz w:val="28"/>
+        </w:rPr>
+        <w:t>В таблице 25 представлено: финансирование и размер конкурентов по открытым источникам.</w:t>
+      </w:r>
+    </w:p>
+    <w:p>
+      <w:pPr>
+        <w:pStyle w:val="a0"/>
+        <w:keepNext/>
+        <w:spacing w:before="0" w:after="0" w:line="360" w:lineRule="exact"/>
+      </w:pPr>
+      <w:r>
+        <w:rPr>
+          <w:sz w:val="28"/>
+        </w:rPr>
+        <w:t>Таблица 25 – Финансирование и размер конкурентов по открытым источникам</w:t>
+      </w:r>
+    </w:p>
+    <w:tbl>
+      <w:tblPr>
+        <w:tblStyle w:val="Table"/>
+        <w:tblW w:w="9355" w:type="dxa"/>
+        <w:jc w:val="center"/>
+        <w:tblBorders>
+          <w:top w:val="single" w:sz="4" w:space="0" w:color="000000"/>
+          <w:left w:val="single" w:sz="4" w:space="0" w:color="000000"/>
+          <w:bottom w:val="single" w:sz="4" w:space="0" w:color="000000"/>
+          <w:right w:val="single" w:sz="4" w:space="0" w:color="000000"/>
+          <w:insideH w:val="single" w:sz="4" w:space="0" w:color="000000"/>
+          <w:insideV w:val="single" w:sz="4" w:space="0" w:color="000000"/>
+        </w:tblBorders>
+        <w:tblLayout w:type="fixed"/>
+        <w:tblLook w:val="0020" w:firstRow="1" w:lastRow="0" w:firstColumn="0" w:lastColumn="0" w:noHBand="0" w:noVBand="0"/>
+      </w:tblPr>
+      <w:tblGrid>
+        <w:gridCol w:w="1629"/>
+        <w:gridCol w:w="1852"/>
+        <w:gridCol w:w="2424"/>
+        <w:gridCol w:w="1123"/>
+        <w:gridCol w:w="2327"/>
+      </w:tblGrid>
+      <w:tr>
+        <w:trPr>
+          <w:cnfStyle w:val="100000000000" w:firstRow="1" w:lastRow="0" w:firstColumn="0" w:lastColumn="0" w:oddVBand="0" w:evenVBand="0" w:oddHBand="0" w:evenHBand="0" w:firstRowFirstColumn="0" w:firstRowLastColumn="0" w:lastRowFirstColumn="0" w:lastRowLastColumn="0"/>
+          <w:cantSplit/>
+          <w:tblHeader/>
+          <w:jc w:val="center"/>
+        </w:trPr>
+        <w:tc>
+          <w:tcPr>
+            <w:tcW w:w="1629" w:type="dxa"/>
+            <w:vAlign w:val="center"/>
+          </w:tcPr>
+          <w:p>
+            <w:pPr>
+              <w:pStyle w:val="Compact"/>
+              <w:spacing w:before="0" w:after="0" w:line="280" w:lineRule="exact"/>
+              <w:jc w:val="center"/>
+            </w:pPr>
+            <w:r>
+              <w:rPr>
+                <w:b/>
+                <w:sz w:val="24"/>
+              </w:rPr>
+              <w:t>Компания</w:t>
+            </w:r>
+          </w:p>
+        </w:tc>
+        <w:tc>
+          <w:tcPr>
+            <w:tcW w:w="1852" w:type="dxa"/>
+            <w:vAlign w:val="center"/>
+          </w:tcPr>
+          <w:p>
+            <w:pPr>
+              <w:pStyle w:val="Compact"/>
+              <w:spacing w:before="0" w:after="0" w:line="280" w:lineRule="exact"/>
+              <w:jc w:val="center"/>
+            </w:pPr>
+            <w:r>
+              <w:rPr>
+                <w:b/>
+                <w:sz w:val="24"/>
+              </w:rPr>
+              <w:t>Показатель</w:t>
+            </w:r>
+          </w:p>
+        </w:tc>
+        <w:tc>
+          <w:tcPr>
+            <w:tcW w:w="2424" w:type="dxa"/>
+            <w:vAlign w:val="center"/>
+          </w:tcPr>
+          <w:p>
+            <w:pPr>
+              <w:pStyle w:val="Compact"/>
+              <w:spacing w:before="0" w:after="0" w:line="280" w:lineRule="exact"/>
+              <w:jc w:val="center"/>
+            </w:pPr>
+            <w:r>
+              <w:rPr>
+                <w:b/>
+                <w:sz w:val="24"/>
+              </w:rPr>
+              <w:t>Значение</w:t>
+            </w:r>
+          </w:p>
+        </w:tc>
+        <w:tc>
+          <w:tcPr>
+            <w:tcW w:w="1123" w:type="dxa"/>
+            <w:vAlign w:val="center"/>
+          </w:tcPr>
+          <w:p>
+            <w:pPr>
+              <w:pStyle w:val="Compact"/>
+              <w:spacing w:before="0" w:after="0" w:line="280" w:lineRule="exact"/>
+              <w:jc w:val="center"/>
+            </w:pPr>
+            <w:r>
+              <w:rPr>
+                <w:b/>
+                <w:sz w:val="24"/>
+              </w:rPr>
+              <w:t>Источник</w:t>
+            </w:r>
+          </w:p>
+        </w:tc>
+        <w:tc>
+          <w:tcPr>
+            <w:tcW w:w="2327" w:type="dxa"/>
+            <w:vAlign w:val="center"/>
+          </w:tcPr>
+          <w:p>
+            <w:pPr>
+              <w:pStyle w:val="Compact"/>
+              <w:spacing w:before="0" w:after="0" w:line="280" w:lineRule="exact"/>
+              <w:jc w:val="center"/>
+            </w:pPr>
+            <w:r>
+              <w:rPr>
+                <w:b/>
+                <w:sz w:val="24"/>
+              </w:rPr>
+              <w:t>Надежность</w:t>
+            </w:r>
+          </w:p>
+        </w:tc>
+      </w:tr>
+      <w:tr>
+        <w:trPr>
+          <w:cantSplit/>
+          <w:jc w:val="center"/>
+        </w:trPr>
+        <w:tc>
+          <w:tcPr>
+            <w:tcW w:w="1629" w:type="dxa"/>
+            <w:vAlign w:val="center"/>
+          </w:tcPr>
+          <w:p>
+            <w:pPr>
+              <w:pStyle w:val="Compact"/>
+              <w:spacing w:before="0" w:after="0" w:line="280" w:lineRule="exact"/>
+              <w:jc w:val="center"/>
+            </w:pPr>
+            <w:r>
+              <w:rPr>
+                <w:i/>
+                <w:sz w:val="24"/>
+              </w:rPr>
+              <w:t>DataSnipper</w:t>
+            </w:r>
+          </w:p>
+        </w:tc>
+        <w:tc>
+          <w:tcPr>
+            <w:tcW w:w="1852" w:type="dxa"/>
+            <w:vAlign w:val="center"/>
+          </w:tcPr>
+          <w:p>
+            <w:pPr>
+              <w:pStyle w:val="Compact"/>
+              <w:spacing w:before="0" w:after="0" w:line="280" w:lineRule="exact"/>
+              <w:jc w:val="center"/>
+            </w:pPr>
+            <w:r>
+              <w:rPr>
+                <w:sz w:val="24"/>
+              </w:rPr>
+              <w:t>Финансирование и оценка</w:t>
+            </w:r>
+          </w:p>
+        </w:tc>
+        <w:tc>
+          <w:tcPr>
+            <w:tcW w:w="2424" w:type="dxa"/>
+            <w:vAlign w:val="center"/>
+          </w:tcPr>
+          <w:p>
+            <w:pPr>
+              <w:pStyle w:val="Compact"/>
+              <w:spacing w:before="0" w:after="0" w:line="280" w:lineRule="exact"/>
+              <w:jc w:val="center"/>
+            </w:pPr>
+            <w:r>
+              <w:rPr>
+                <w:i/>
+                <w:sz w:val="24"/>
+              </w:rPr>
+              <w:t>Series</w:t>
+            </w:r>
+            <w:r>
+              <w:rPr>
+                <w:sz w:val="24"/>
+              </w:rPr>
+              <w:t xml:space="preserve"> </w:t>
+            </w:r>
+            <w:r>
+              <w:rPr>
+                <w:i/>
+                <w:sz w:val="24"/>
+              </w:rPr>
+              <w:t>B</w:t>
+            </w:r>
+            <w:r>
+              <w:rPr>
+                <w:sz w:val="24"/>
+              </w:rPr>
+              <w:t xml:space="preserve"> 100 млн </w:t>
+            </w:r>
+            <w:r>
+              <w:rPr>
+                <w:i/>
+                <w:sz w:val="24"/>
+              </w:rPr>
+              <w:t>USD</w:t>
+            </w:r>
+            <w:r>
+              <w:rPr>
+                <w:sz w:val="24"/>
+              </w:rPr>
+              <w:t xml:space="preserve"> (февраль 2024), оценка 1 млрд </w:t>
+            </w:r>
+            <w:r>
+              <w:rPr>
+                <w:i/>
+                <w:sz w:val="24"/>
+              </w:rPr>
+              <w:t>USD</w:t>
+            </w:r>
+            <w:r>
+              <w:rPr>
+                <w:sz w:val="24"/>
+              </w:rPr>
+              <w:t>; более 400 тыс. аудиторов в 125 странах; около 289 сотрудников (2025)</w:t>
+            </w:r>
+          </w:p>
+        </w:tc>
+        <w:tc>
+          <w:tcPr>
+            <w:tcW w:w="1123" w:type="dxa"/>
+            <w:vAlign w:val="center"/>
+          </w:tcPr>
+          <w:p>
+            <w:pPr>
+              <w:pStyle w:val="Compact"/>
+              <w:spacing w:before="0" w:after="0" w:line="280" w:lineRule="exact"/>
+              <w:jc w:val="center"/>
+            </w:pPr>
+            <w:r>
+              <w:rPr>
+                <w:sz w:val="24"/>
+              </w:rPr>
+              <w:t>[17]</w:t>
+            </w:r>
+          </w:p>
+        </w:tc>
+        <w:tc>
+          <w:tcPr>
+            <w:tcW w:w="2327" w:type="dxa"/>
+            <w:vAlign w:val="center"/>
+          </w:tcPr>
+          <w:p>
+            <w:pPr>
+              <w:pStyle w:val="Compact"/>
+              <w:spacing w:before="0" w:after="0" w:line="280" w:lineRule="exact"/>
+              <w:jc w:val="center"/>
+            </w:pPr>
+            <w:r>
+              <w:rPr>
+                <w:sz w:val="24"/>
+              </w:rPr>
+              <w:t>высокая (пресс-релиз компании); число сотрудников - оценка каталога</w:t>
+            </w:r>
+          </w:p>
+        </w:tc>
+      </w:tr>
+      <w:tr>
+        <w:trPr>
+          <w:cantSplit/>
+          <w:jc w:val="center"/>
+        </w:trPr>
+        <w:tc>
+          <w:tcPr>
+            <w:tcW w:w="1629" w:type="dxa"/>
+            <w:vAlign w:val="center"/>
+          </w:tcPr>
+          <w:p>
+            <w:pPr>
+              <w:pStyle w:val="Compact"/>
+              <w:spacing w:before="0" w:after="0" w:line="280" w:lineRule="exact"/>
+              <w:jc w:val="center"/>
+            </w:pPr>
+            <w:r>
+              <w:rPr>
+                <w:i/>
+                <w:sz w:val="24"/>
+              </w:rPr>
+              <w:t>Datarails</w:t>
+            </w:r>
+          </w:p>
+        </w:tc>
+        <w:tc>
+          <w:tcPr>
+            <w:tcW w:w="1852" w:type="dxa"/>
+            <w:vAlign w:val="center"/>
+          </w:tcPr>
+          <w:p>
+            <w:pPr>
+              <w:pStyle w:val="Compact"/>
+              <w:spacing w:before="0" w:after="0" w:line="280" w:lineRule="exact"/>
+              <w:jc w:val="center"/>
+            </w:pPr>
+            <w:r>
+              <w:rPr>
+                <w:sz w:val="24"/>
+              </w:rPr>
+              <w:t>Финансирование и оценка</w:t>
+            </w:r>
+          </w:p>
+        </w:tc>
+        <w:tc>
+          <w:tcPr>
+            <w:tcW w:w="2424" w:type="dxa"/>
+            <w:vAlign w:val="center"/>
+          </w:tcPr>
+          <w:p>
+            <w:pPr>
+              <w:pStyle w:val="Compact"/>
+              <w:spacing w:before="0" w:after="0" w:line="280" w:lineRule="exact"/>
+              <w:jc w:val="center"/>
+            </w:pPr>
+            <w:r>
+              <w:rPr>
+                <w:i/>
+                <w:sz w:val="24"/>
+              </w:rPr>
+              <w:t>Series</w:t>
+            </w:r>
+            <w:r>
+              <w:rPr>
+                <w:sz w:val="24"/>
+              </w:rPr>
+              <w:t xml:space="preserve"> </w:t>
+            </w:r>
+            <w:r>
+              <w:rPr>
+                <w:i/>
+                <w:sz w:val="24"/>
+              </w:rPr>
+              <w:t>C</w:t>
+            </w:r>
+            <w:r>
+              <w:rPr>
+                <w:sz w:val="24"/>
+              </w:rPr>
+              <w:t xml:space="preserve"> 70 млн </w:t>
+            </w:r>
+            <w:r>
+              <w:rPr>
+                <w:i/>
+                <w:sz w:val="24"/>
+              </w:rPr>
+              <w:t>USD</w:t>
+            </w:r>
+            <w:r>
+              <w:rPr>
+                <w:sz w:val="24"/>
+              </w:rPr>
+              <w:t xml:space="preserve">, оценка 550 млн </w:t>
+            </w:r>
+            <w:r>
+              <w:rPr>
+                <w:i/>
+                <w:sz w:val="24"/>
+              </w:rPr>
+              <w:t>USD</w:t>
+            </w:r>
+            <w:r>
+              <w:rPr>
+                <w:sz w:val="24"/>
+              </w:rPr>
+              <w:t xml:space="preserve">; привлечено около 175 млн </w:t>
+            </w:r>
+            <w:r>
+              <w:rPr>
+                <w:i/>
+                <w:sz w:val="24"/>
+              </w:rPr>
+              <w:t>USD</w:t>
+            </w:r>
+            <w:r>
+              <w:rPr>
+                <w:sz w:val="24"/>
+              </w:rPr>
+              <w:t>; более 400 сотрудников</w:t>
+            </w:r>
+          </w:p>
+        </w:tc>
+        <w:tc>
+          <w:tcPr>
+            <w:tcW w:w="1123" w:type="dxa"/>
+            <w:vAlign w:val="center"/>
+          </w:tcPr>
+          <w:p>
+            <w:pPr>
+              <w:pStyle w:val="Compact"/>
+              <w:spacing w:before="0" w:after="0" w:line="280" w:lineRule="exact"/>
+              <w:jc w:val="center"/>
+            </w:pPr>
+            <w:r>
+              <w:rPr>
+                <w:sz w:val="24"/>
+              </w:rPr>
+              <w:t>[18]</w:t>
+            </w:r>
+          </w:p>
+        </w:tc>
+        <w:tc>
+          <w:tcPr>
+            <w:tcW w:w="2327" w:type="dxa"/>
+            <w:vAlign w:val="center"/>
+          </w:tcPr>
+          <w:p>
+            <w:pPr>
+              <w:pStyle w:val="Compact"/>
+              <w:spacing w:before="0" w:after="0" w:line="280" w:lineRule="exact"/>
+              <w:jc w:val="center"/>
+            </w:pPr>
+            <w:r>
+              <w:rPr>
+                <w:sz w:val="24"/>
+              </w:rPr>
+              <w:t>высокая (деловая пресса)</w:t>
+            </w:r>
+          </w:p>
+        </w:tc>
+      </w:tr>
+      <w:tr>
+        <w:trPr>
+          <w:cantSplit/>
+          <w:jc w:val="center"/>
+        </w:trPr>
+        <w:tc>
+          <w:tcPr>
+            <w:tcW w:w="1629" w:type="dxa"/>
+            <w:vAlign w:val="center"/>
+          </w:tcPr>
+          <w:p>
+            <w:pPr>
+              <w:pStyle w:val="Compact"/>
+              <w:spacing w:before="0" w:after="0" w:line="280" w:lineRule="exact"/>
+              <w:jc w:val="center"/>
+            </w:pPr>
+            <w:r>
+              <w:rPr>
+                <w:i/>
+                <w:sz w:val="24"/>
+              </w:rPr>
+              <w:t>Shortcut</w:t>
+            </w:r>
+            <w:r>
+              <w:rPr>
+                <w:sz w:val="24"/>
+              </w:rPr>
+              <w:t xml:space="preserve"> (</w:t>
+            </w:r>
+            <w:r>
+              <w:rPr>
+                <w:i/>
+                <w:sz w:val="24"/>
+              </w:rPr>
+              <w:t>Fundamental</w:t>
+            </w:r>
+            <w:r>
+              <w:rPr>
+                <w:sz w:val="24"/>
+              </w:rPr>
+              <w:t xml:space="preserve"> </w:t>
+            </w:r>
+            <w:r>
+              <w:rPr>
+                <w:i/>
+                <w:sz w:val="24"/>
+              </w:rPr>
+              <w:t>Researc</w:t>
+            </w:r>
+            <w:r>
+              <w:rPr>
+                <w:i/>
+                <w:sz w:val="24"/>
+              </w:rPr>
+              <w:t>h</w:t>
+            </w:r>
+            <w:r>
+              <w:rPr>
+                <w:sz w:val="24"/>
+              </w:rPr>
+              <w:t xml:space="preserve"> </w:t>
+            </w:r>
+            <w:r>
+              <w:rPr>
+                <w:i/>
+                <w:sz w:val="24"/>
+              </w:rPr>
+              <w:t>Labs</w:t>
+            </w:r>
+            <w:r>
+              <w:rPr>
+                <w:sz w:val="24"/>
+              </w:rPr>
+              <w:t>)</w:t>
+            </w:r>
+          </w:p>
+        </w:tc>
+        <w:tc>
+          <w:tcPr>
+            <w:tcW w:w="1852" w:type="dxa"/>
+            <w:vAlign w:val="center"/>
+          </w:tcPr>
+          <w:p>
+            <w:pPr>
+              <w:pStyle w:val="Compact"/>
+              <w:spacing w:before="0" w:after="0" w:line="280" w:lineRule="exact"/>
+              <w:jc w:val="center"/>
+            </w:pPr>
+            <w:r>
+              <w:rPr>
+                <w:sz w:val="24"/>
+              </w:rPr>
+              <w:t>Финансирование</w:t>
+            </w:r>
+          </w:p>
+        </w:tc>
+        <w:tc>
+          <w:tcPr>
+            <w:tcW w:w="2424" w:type="dxa"/>
+            <w:vAlign w:val="center"/>
+          </w:tcPr>
+          <w:p>
+            <w:pPr>
+              <w:pStyle w:val="Compact"/>
+              <w:spacing w:before="0" w:after="0" w:line="280" w:lineRule="exact"/>
+              <w:jc w:val="center"/>
+            </w:pPr>
+            <w:r>
+              <w:rPr>
+                <w:i/>
+                <w:sz w:val="24"/>
+              </w:rPr>
+              <w:t>Seed</w:t>
+            </w:r>
+            <w:r>
+              <w:rPr>
+                <w:sz w:val="24"/>
+              </w:rPr>
+              <w:t xml:space="preserve"> 9 млн </w:t>
+            </w:r>
+            <w:r>
+              <w:rPr>
+                <w:i/>
+                <w:sz w:val="24"/>
+              </w:rPr>
+              <w:t>USD</w:t>
+            </w:r>
+            <w:r>
+              <w:rPr>
+                <w:sz w:val="24"/>
+              </w:rPr>
+              <w:t xml:space="preserve"> и </w:t>
+            </w:r>
+            <w:r>
+              <w:rPr>
+                <w:i/>
+                <w:sz w:val="24"/>
+              </w:rPr>
+              <w:t>Series</w:t>
+            </w:r>
+            <w:r>
+              <w:rPr>
+                <w:sz w:val="24"/>
+              </w:rPr>
+              <w:t xml:space="preserve"> </w:t>
+            </w:r>
+            <w:r>
+              <w:rPr>
+                <w:i/>
+                <w:sz w:val="24"/>
+              </w:rPr>
+              <w:t>A</w:t>
+            </w:r>
+            <w:r>
+              <w:rPr>
+                <w:sz w:val="24"/>
+              </w:rPr>
+              <w:t xml:space="preserve"> 33 млн </w:t>
+            </w:r>
+            <w:r>
+              <w:rPr>
+                <w:i/>
+                <w:sz w:val="24"/>
+              </w:rPr>
+              <w:t>USD</w:t>
+            </w:r>
+            <w:r>
+              <w:rPr>
+                <w:sz w:val="24"/>
+              </w:rPr>
+              <w:t xml:space="preserve"> (</w:t>
+            </w:r>
+            <w:r>
+              <w:rPr>
+                <w:i/>
+                <w:sz w:val="24"/>
+              </w:rPr>
+              <w:t>Prosus</w:t>
+            </w:r>
+            <w:r>
+              <w:rPr>
+                <w:sz w:val="24"/>
+              </w:rPr>
+              <w:t xml:space="preserve">); более 40 млн </w:t>
+            </w:r>
+            <w:r>
+              <w:rPr>
+                <w:i/>
+                <w:sz w:val="24"/>
+              </w:rPr>
+              <w:t>USD</w:t>
+            </w:r>
+            <w:r>
+              <w:rPr>
+                <w:sz w:val="24"/>
+              </w:rPr>
+              <w:t xml:space="preserve"> в сумме</w:t>
+            </w:r>
+          </w:p>
+        </w:tc>
+        <w:tc>
+          <w:tcPr>
+            <w:tcW w:w="1123" w:type="dxa"/>
+            <w:vAlign w:val="center"/>
+          </w:tcPr>
+          <w:p>
+            <w:pPr>
+              <w:pStyle w:val="Compact"/>
+              <w:spacing w:before="0" w:after="0" w:line="280" w:lineRule="exact"/>
+              <w:jc w:val="center"/>
+            </w:pPr>
+            <w:r>
+              <w:rPr>
+                <w:sz w:val="24"/>
+              </w:rPr>
+              <w:t>[19]</w:t>
+            </w:r>
+          </w:p>
+        </w:tc>
+        <w:tc>
+          <w:tcPr>
+            <w:tcW w:w="2327" w:type="dxa"/>
+            <w:vAlign w:val="center"/>
+          </w:tcPr>
+          <w:p>
+            <w:pPr>
+              <w:pStyle w:val="Compact"/>
+              <w:spacing w:before="0" w:after="0" w:line="280" w:lineRule="exact"/>
+              <w:jc w:val="center"/>
+            </w:pPr>
+            <w:r>
+              <w:rPr>
+                <w:sz w:val="24"/>
+              </w:rPr>
+              <w:t>высокая (деловая пресса)</w:t>
+            </w:r>
+          </w:p>
+        </w:tc>
+      </w:tr>
+      <w:tr>
+        <w:trPr>
+          <w:cantSplit/>
+          <w:jc w:val="center"/>
+        </w:trPr>
+        <w:tc>
+          <w:tcPr>
+            <w:tcW w:w="1629" w:type="dxa"/>
+            <w:vAlign w:val="center"/>
+          </w:tcPr>
+          <w:p>
+            <w:pPr>
+              <w:pStyle w:val="Compact"/>
+              <w:spacing w:before="0" w:after="0" w:line="280" w:lineRule="exact"/>
+              <w:jc w:val="center"/>
+            </w:pPr>
+            <w:r>
+              <w:rPr>
+                <w:i/>
+                <w:sz w:val="24"/>
+              </w:rPr>
+              <w:t>PerfectXL</w:t>
+            </w:r>
+            <w:r>
+              <w:rPr>
+                <w:sz w:val="24"/>
+              </w:rPr>
+              <w:t xml:space="preserve"> (</w:t>
+            </w:r>
+            <w:r>
+              <w:rPr>
+                <w:i/>
+                <w:sz w:val="24"/>
+              </w:rPr>
+              <w:t>Infotron</w:t>
+            </w:r>
+            <w:r>
+              <w:rPr>
+                <w:sz w:val="24"/>
+              </w:rPr>
+              <w:t xml:space="preserve"> </w:t>
+            </w:r>
+            <w:r>
+              <w:rPr>
+                <w:i/>
+                <w:sz w:val="24"/>
+              </w:rPr>
+              <w:t>BV</w:t>
+            </w:r>
+            <w:r>
+              <w:rPr>
+                <w:sz w:val="24"/>
+              </w:rPr>
+              <w:t>)</w:t>
+            </w:r>
+          </w:p>
+        </w:tc>
+        <w:tc>
+          <w:tcPr>
+            <w:tcW w:w="1852" w:type="dxa"/>
+            <w:vAlign w:val="center"/>
+          </w:tcPr>
+          <w:p>
+            <w:pPr>
+              <w:pStyle w:val="Compact"/>
+              <w:spacing w:before="0" w:after="0" w:line="280" w:lineRule="exact"/>
+              <w:jc w:val="center"/>
+            </w:pPr>
+            <w:r>
+              <w:rPr>
+                <w:sz w:val="24"/>
+              </w:rPr>
+              <w:t>Размер и история</w:t>
+            </w:r>
+          </w:p>
+        </w:tc>
+        <w:tc>
+          <w:tcPr>
+            <w:tcW w:w="2424" w:type="dxa"/>
+            <w:vAlign w:val="center"/>
+          </w:tcPr>
+          <w:p>
+            <w:pPr>
+              <w:pStyle w:val="Compact"/>
+              <w:spacing w:before="0" w:after="0" w:line="280" w:lineRule="exact"/>
+              <w:jc w:val="center"/>
+            </w:pPr>
+            <w:r>
+              <w:rPr>
+                <w:sz w:val="24"/>
+              </w:rPr>
+              <w:t>основана в Амстердаме, связана с Делфтским техническим университетом; по каталогам около 4 сотрудников, инвестиции не раскрыты</w:t>
+            </w:r>
+          </w:p>
+        </w:tc>
+        <w:tc>
+          <w:tcPr>
+            <w:tcW w:w="1123" w:type="dxa"/>
+            <w:vAlign w:val="center"/>
+          </w:tcPr>
+          <w:p>
+            <w:pPr>
+              <w:pStyle w:val="Compact"/>
+              <w:spacing w:before="0" w:after="0" w:line="280" w:lineRule="exact"/>
+              <w:jc w:val="center"/>
+            </w:pPr>
+            <w:r>
+              <w:rPr>
+                <w:sz w:val="24"/>
+              </w:rPr>
+              <w:t>[20]</w:t>
+            </w:r>
+          </w:p>
+        </w:tc>
+        <w:tc>
+          <w:tcPr>
+            <w:tcW w:w="2327" w:type="dxa"/>
+            <w:vAlign w:val="center"/>
+          </w:tcPr>
+          <w:p>
+            <w:pPr>
+              <w:pStyle w:val="Compact"/>
+              <w:spacing w:before="0" w:after="0" w:line="280" w:lineRule="exact"/>
+              <w:jc w:val="center"/>
+            </w:pPr>
+            <w:r>
+              <w:rPr>
+                <w:sz w:val="24"/>
+              </w:rPr>
+              <w:t>средняя (данные каталогов)</w:t>
+            </w:r>
+          </w:p>
+        </w:tc>
+      </w:tr>
+    </w:tbl>
+    <w:p>
+      <w:pPr>
+        <w:pStyle w:val="FirstParagraph"/>
+        <w:spacing w:before="0" w:after="0" w:line="360" w:lineRule="exact"/>
+        <w:ind w:firstLine="709"/>
+        <w:jc w:val="both"/>
+      </w:pPr>
+      <w:r>
+        <w:rPr>
+          <w:sz w:val="28"/>
+        </w:rPr>
+        <w:t>Конкуренты делятся на венчурные компании с оценкой от сотен миллионов до миллиарда долларов (</w:t>
+      </w:r>
+      <w:r>
+        <w:rPr>
+          <w:i/>
+          <w:sz w:val="28"/>
+        </w:rPr>
+        <w:t>Dat</w:t>
+      </w:r>
+      <w:r>
+        <w:rPr>
+          <w:i/>
+          <w:sz w:val="28"/>
+        </w:rPr>
+        <w:t>aSnipper</w:t>
+      </w:r>
+      <w:r>
+        <w:rPr>
+          <w:sz w:val="28"/>
+        </w:rPr>
+        <w:t xml:space="preserve">, </w:t>
+      </w:r>
+      <w:r>
+        <w:rPr>
+          <w:i/>
+          <w:sz w:val="28"/>
+        </w:rPr>
+        <w:t>Datarails</w:t>
+      </w:r>
+      <w:r>
+        <w:rPr>
+          <w:sz w:val="28"/>
+        </w:rPr>
+        <w:t xml:space="preserve">, </w:t>
+      </w:r>
+      <w:r>
+        <w:rPr>
+          <w:i/>
+          <w:sz w:val="28"/>
+        </w:rPr>
+        <w:t>Shortcut</w:t>
+      </w:r>
+      <w:r>
+        <w:rPr>
+          <w:sz w:val="28"/>
+        </w:rPr>
+        <w:t>) и малую специализированную компанию (</w:t>
+      </w:r>
+      <w:r>
+        <w:rPr>
+          <w:i/>
+          <w:sz w:val="28"/>
+        </w:rPr>
+        <w:t>PerfectXL</w:t>
+      </w:r>
+      <w:r>
+        <w:rPr>
+          <w:sz w:val="28"/>
+        </w:rPr>
+        <w:t xml:space="preserve">). Это поддерживает вывод ЛР4 и ЛР5: рядом с </w:t>
+      </w:r>
+      <w:r>
+        <w:rPr>
+          <w:i/>
+          <w:sz w:val="28"/>
+        </w:rPr>
+        <w:t>TableMind</w:t>
+      </w:r>
+      <w:r>
+        <w:rPr>
+          <w:sz w:val="28"/>
+        </w:rPr>
+        <w:t xml:space="preserve"> работают сильные, хорошо финансируемые игроки, поэтому ставка на независимость проверки, доказательство находок движком </w:t>
+      </w:r>
+      <w:r>
+        <w:rPr>
+          <w:sz w:val="28"/>
+        </w:rPr>
+        <w:lastRenderedPageBreak/>
+        <w:t>и пр</w:t>
+      </w:r>
+      <w:r>
+        <w:rPr>
+          <w:sz w:val="28"/>
+        </w:rPr>
+        <w:t>озрачную цену должна оставаться отличием, а не гонкой по числу функций.</w:t>
+      </w:r>
+    </w:p>
+    <w:bookmarkEnd w:id="38"/>
     <w:sectPr>
       <w:headerReference w:type="default" r:id="rId11"/>
       <w:footerReference w:type="default" r:id="rId12"/>
@@ -34711,7 +36377,7 @@
   <w:abstractNum w:abstractNumId="0" w15:restartNumberingAfterBreak="0">
     <w:nsid w:val="0000A990"/>
     <w:multiLevelType w:val="multilevel"/>
-    <w:tmpl w:val="77DE0670"/>
+    <w:tmpl w:val="70C0E784"/>
     <w:lvl w:ilvl="0">
       <w:numFmt w:val="bullet"/>
       <w:lvlText w:val=" "/>
@@ -34788,7 +36454,7 @@
   <w:abstractNum w:abstractNumId="1" w15:restartNumberingAfterBreak="0">
     <w:nsid w:val="00A99411"/>
     <w:multiLevelType w:val="multilevel"/>
-    <w:tmpl w:val="593CA83A"/>
+    <w:tmpl w:val="466C0050"/>
     <w:lvl w:ilvl="0">
       <w:start w:val="1"/>
       <w:numFmt w:val="decimal"/>
@@ -36266,7 +37932,7 @@
     <w:autoRedefine/>
     <w:uiPriority w:val="39"/>
     <w:unhideWhenUsed/>
-    <w:rsid w:val="00713457"/>
+    <w:rsid w:val="00AF3F4F"/>
     <w:pPr>
       <w:spacing w:after="100"/>
     </w:pPr>
@@ -36278,7 +37944,7 @@
     <w:autoRedefine/>
     <w:uiPriority w:val="39"/>
     <w:unhideWhenUsed/>
-    <w:rsid w:val="00713457"/>
+    <w:rsid w:val="00AF3F4F"/>
     <w:pPr>
       <w:spacing w:after="100"/>
       <w:ind w:left="240"/>

</xml_diff>

<commit_message>
lab5: competitor prices (Arixcel, Operis) recalculated in workbooks, reports rebuilt
</commit_message>
<xml_diff>
--- a/ЛР5_Анализ_конкурентов/ОТЧЕТ_ЛР5_TableMind.docx
+++ b/ЛР5_Анализ_конкурентов/ОТЧЕТ_ЛР5_TableMind.docx
@@ -245,7 +245,7 @@
       <w:r>
         <w:fldChar w:fldCharType="separate"/>
       </w:r>
-      <w:hyperlink w:anchor="_Toc241936239" w:history="1">
+      <w:hyperlink w:anchor="_Toc241936442" w:history="1">
         <w:r>
           <w:rPr>
             <w:rStyle w:val="af"/>
@@ -273,7 +273,7 @@
             <w:noProof/>
             <w:webHidden/>
           </w:rPr>
-          <w:instrText xml:space="preserve"> PAGEREF _Toc241936239 \h </w:instrText>
+          <w:instrText xml:space="preserve"> PAGEREF _Toc241936442 \h </w:instrText>
         </w:r>
         <w:r>
           <w:rPr>
@@ -314,7 +314,7 @@
           <w:noProof/>
         </w:rPr>
       </w:pPr>
-      <w:hyperlink w:anchor="_Toc241936240" w:history="1">
+      <w:hyperlink w:anchor="_Toc241936443" w:history="1">
         <w:r>
           <w:rPr>
             <w:rStyle w:val="af"/>
@@ -342,7 +342,7 @@
             <w:noProof/>
             <w:webHidden/>
           </w:rPr>
-          <w:instrText xml:space="preserve"> PAGEREF _Toc241936240 \h </w:instrText>
+          <w:instrText xml:space="preserve"> PAGEREF _Toc241936443 \h </w:instrText>
         </w:r>
         <w:r>
           <w:rPr>
@@ -383,7 +383,7 @@
           <w:noProof/>
         </w:rPr>
       </w:pPr>
-      <w:hyperlink w:anchor="_Toc241936241" w:history="1">
+      <w:hyperlink w:anchor="_Toc241936444" w:history="1">
         <w:r>
           <w:rPr>
             <w:rStyle w:val="af"/>
@@ -411,7 +411,7 @@
             <w:noProof/>
             <w:webHidden/>
           </w:rPr>
-          <w:instrText xml:space="preserve"> PAGEREF _Toc241936241 \h </w:instrText>
+          <w:instrText xml:space="preserve"> PAGEREF _Toc241936444 \h </w:instrText>
         </w:r>
         <w:r>
           <w:rPr>
@@ -452,7 +452,7 @@
           <w:noProof/>
         </w:rPr>
       </w:pPr>
-      <w:hyperlink w:anchor="_Toc241936242" w:history="1">
+      <w:hyperlink w:anchor="_Toc241936445" w:history="1">
         <w:r>
           <w:rPr>
             <w:rStyle w:val="af"/>
@@ -480,7 +480,7 @@
             <w:noProof/>
             <w:webHidden/>
           </w:rPr>
-          <w:instrText xml:space="preserve"> PAGEREF _Toc241936242 \h </w:instrText>
+          <w:instrText xml:space="preserve"> PAGEREF _Toc241936445 \h </w:instrText>
         </w:r>
         <w:r>
           <w:rPr>
@@ -521,7 +521,7 @@
           <w:noProof/>
         </w:rPr>
       </w:pPr>
-      <w:hyperlink w:anchor="_Toc241936243" w:history="1">
+      <w:hyperlink w:anchor="_Toc241936446" w:history="1">
         <w:r>
           <w:rPr>
             <w:rStyle w:val="af"/>
@@ -549,7 +549,7 @@
             <w:noProof/>
             <w:webHidden/>
           </w:rPr>
-          <w:instrText xml:space="preserve"> PAGEREF _Toc241936243 \h </w:instrText>
+          <w:instrText xml:space="preserve"> PAGEREF _Toc241936446 \h </w:instrText>
         </w:r>
         <w:r>
           <w:rPr>
@@ -590,7 +590,7 @@
           <w:noProof/>
         </w:rPr>
       </w:pPr>
-      <w:hyperlink w:anchor="_Toc241936244" w:history="1">
+      <w:hyperlink w:anchor="_Toc241936447" w:history="1">
         <w:r>
           <w:rPr>
             <w:rStyle w:val="af"/>
@@ -618,7 +618,7 @@
             <w:noProof/>
             <w:webHidden/>
           </w:rPr>
-          <w:instrText xml:space="preserve"> PAGEREF _Toc241936244 \h </w:instrText>
+          <w:instrText xml:space="preserve"> PAGEREF _Toc241936447 \h </w:instrText>
         </w:r>
         <w:r>
           <w:rPr>
@@ -659,7 +659,7 @@
           <w:noProof/>
         </w:rPr>
       </w:pPr>
-      <w:hyperlink w:anchor="_Toc241936245" w:history="1">
+      <w:hyperlink w:anchor="_Toc241936448" w:history="1">
         <w:r>
           <w:rPr>
             <w:rStyle w:val="af"/>
@@ -687,7 +687,7 @@
             <w:noProof/>
             <w:webHidden/>
           </w:rPr>
-          <w:instrText xml:space="preserve"> PAGEREF _Toc241936245 \h </w:instrText>
+          <w:instrText xml:space="preserve"> PAGEREF _Toc241936448 \h </w:instrText>
         </w:r>
         <w:r>
           <w:rPr>
@@ -728,7 +728,7 @@
           <w:noProof/>
         </w:rPr>
       </w:pPr>
-      <w:hyperlink w:anchor="_Toc241936246" w:history="1">
+      <w:hyperlink w:anchor="_Toc241936449" w:history="1">
         <w:r>
           <w:rPr>
             <w:rStyle w:val="af"/>
@@ -756,7 +756,7 @@
             <w:noProof/>
             <w:webHidden/>
           </w:rPr>
-          <w:instrText xml:space="preserve"> PAGEREF _Toc241936246 \h </w:instrText>
+          <w:instrText xml:space="preserve"> PAGEREF _Toc241936449 \h </w:instrText>
         </w:r>
         <w:r>
           <w:rPr>
@@ -797,7 +797,7 @@
           <w:noProof/>
         </w:rPr>
       </w:pPr>
-      <w:hyperlink w:anchor="_Toc241936247" w:history="1">
+      <w:hyperlink w:anchor="_Toc241936450" w:history="1">
         <w:r>
           <w:rPr>
             <w:rStyle w:val="af"/>
@@ -825,7 +825,7 @@
             <w:noProof/>
             <w:webHidden/>
           </w:rPr>
-          <w:instrText xml:space="preserve"> PAGEREF _Toc241936247 \h </w:instrText>
+          <w:instrText xml:space="preserve"> PAGEREF _Toc241936450 \h </w:instrText>
         </w:r>
         <w:r>
           <w:rPr>
@@ -866,7 +866,7 @@
           <w:noProof/>
         </w:rPr>
       </w:pPr>
-      <w:hyperlink w:anchor="_Toc241936248" w:history="1">
+      <w:hyperlink w:anchor="_Toc241936451" w:history="1">
         <w:r>
           <w:rPr>
             <w:rStyle w:val="af"/>
@@ -894,7 +894,7 @@
             <w:noProof/>
             <w:webHidden/>
           </w:rPr>
-          <w:instrText xml:space="preserve"> PAGEREF _Toc241936248 \h </w:instrText>
+          <w:instrText xml:space="preserve"> PAGEREF _Toc241936451 \h </w:instrText>
         </w:r>
         <w:r>
           <w:rPr>
@@ -935,7 +935,7 @@
           <w:noProof/>
         </w:rPr>
       </w:pPr>
-      <w:hyperlink w:anchor="_Toc241936249" w:history="1">
+      <w:hyperlink w:anchor="_Toc241936452" w:history="1">
         <w:r>
           <w:rPr>
             <w:rStyle w:val="af"/>
@@ -972,7 +972,7 @@
             <w:noProof/>
             <w:webHidden/>
           </w:rPr>
-          <w:instrText xml:space="preserve"> PAGEREF _Toc241936249 \h </w:instrText>
+          <w:instrText xml:space="preserve"> PAGEREF _Toc241936452 \h </w:instrText>
         </w:r>
         <w:r>
           <w:rPr>
@@ -992,7 +992,7 @@
             <w:noProof/>
             <w:webHidden/>
           </w:rPr>
-          <w:t>20</w:t>
+          <w:t>21</w:t>
         </w:r>
         <w:r>
           <w:rPr>
@@ -1013,7 +1013,7 @@
           <w:noProof/>
         </w:rPr>
       </w:pPr>
-      <w:hyperlink w:anchor="_Toc241936250" w:history="1">
+      <w:hyperlink w:anchor="_Toc241936453" w:history="1">
         <w:r>
           <w:rPr>
             <w:rStyle w:val="af"/>
@@ -1041,7 +1041,7 @@
             <w:noProof/>
             <w:webHidden/>
           </w:rPr>
-          <w:instrText xml:space="preserve"> PAGEREF _Toc241936250 \h </w:instrText>
+          <w:instrText xml:space="preserve"> PAGEREF _Toc241936453 \h </w:instrText>
         </w:r>
         <w:r>
           <w:rPr>
@@ -1082,7 +1082,7 @@
           <w:noProof/>
         </w:rPr>
       </w:pPr>
-      <w:hyperlink w:anchor="_Toc241936251" w:history="1">
+      <w:hyperlink w:anchor="_Toc241936454" w:history="1">
         <w:r>
           <w:rPr>
             <w:rStyle w:val="af"/>
@@ -1110,7 +1110,7 @@
             <w:noProof/>
             <w:webHidden/>
           </w:rPr>
-          <w:instrText xml:space="preserve"> PAGEREF _Toc241936251 \h </w:instrText>
+          <w:instrText xml:space="preserve"> PAGEREF _Toc241936454 \h </w:instrText>
         </w:r>
         <w:r>
           <w:rPr>
@@ -1151,7 +1151,7 @@
           <w:noProof/>
         </w:rPr>
       </w:pPr>
-      <w:hyperlink w:anchor="_Toc241936252" w:history="1">
+      <w:hyperlink w:anchor="_Toc241936455" w:history="1">
         <w:r>
           <w:rPr>
             <w:rStyle w:val="af"/>
@@ -1179,7 +1179,7 @@
             <w:noProof/>
             <w:webHidden/>
           </w:rPr>
-          <w:instrText xml:space="preserve"> PAGEREF _Toc241936252 \h </w:instrText>
+          <w:instrText xml:space="preserve"> PAGEREF _Toc241936455 \h </w:instrText>
         </w:r>
         <w:r>
           <w:rPr>
@@ -1220,7 +1220,7 @@
           <w:noProof/>
         </w:rPr>
       </w:pPr>
-      <w:hyperlink w:anchor="_Toc241936253" w:history="1">
+      <w:hyperlink w:anchor="_Toc241936456" w:history="1">
         <w:r>
           <w:rPr>
             <w:rStyle w:val="af"/>
@@ -1248,7 +1248,7 @@
             <w:noProof/>
             <w:webHidden/>
           </w:rPr>
-          <w:instrText xml:space="preserve"> PAGEREF _Toc241936253 \h </w:instrText>
+          <w:instrText xml:space="preserve"> PAGEREF _Toc241936456 \h </w:instrText>
         </w:r>
         <w:r>
           <w:rPr>
@@ -1289,7 +1289,7 @@
           <w:noProof/>
         </w:rPr>
       </w:pPr>
-      <w:hyperlink w:anchor="_Toc241936254" w:history="1">
+      <w:hyperlink w:anchor="_Toc241936457" w:history="1">
         <w:r>
           <w:rPr>
             <w:rStyle w:val="af"/>
@@ -1317,7 +1317,7 @@
             <w:noProof/>
             <w:webHidden/>
           </w:rPr>
-          <w:instrText xml:space="preserve"> PAGEREF _Toc241936254 \h </w:instrText>
+          <w:instrText xml:space="preserve"> PAGEREF _Toc241936457 \h </w:instrText>
         </w:r>
         <w:r>
           <w:rPr>
@@ -1358,7 +1358,7 @@
           <w:noProof/>
         </w:rPr>
       </w:pPr>
-      <w:hyperlink w:anchor="_Toc241936255" w:history="1">
+      <w:hyperlink w:anchor="_Toc241936458" w:history="1">
         <w:r>
           <w:rPr>
             <w:rStyle w:val="af"/>
@@ -1386,7 +1386,7 @@
             <w:noProof/>
             <w:webHidden/>
           </w:rPr>
-          <w:instrText xml:space="preserve"> PAGEREF _Toc241936255 \h </w:instrText>
+          <w:instrText xml:space="preserve"> PAGEREF _Toc241936458 \h </w:instrText>
         </w:r>
         <w:r>
           <w:rPr>
@@ -1427,7 +1427,7 @@
           <w:noProof/>
         </w:rPr>
       </w:pPr>
-      <w:hyperlink w:anchor="_Toc241936256" w:history="1">
+      <w:hyperlink w:anchor="_Toc241936459" w:history="1">
         <w:r>
           <w:rPr>
             <w:rStyle w:val="af"/>
@@ -1455,7 +1455,7 @@
             <w:noProof/>
             <w:webHidden/>
           </w:rPr>
-          <w:instrText xml:space="preserve"> PAGEREF _Toc241936256 \h </w:instrText>
+          <w:instrText xml:space="preserve"> PAGEREF _Toc241936459 \h </w:instrText>
         </w:r>
         <w:r>
           <w:rPr>
@@ -1496,7 +1496,7 @@
           <w:noProof/>
         </w:rPr>
       </w:pPr>
-      <w:hyperlink w:anchor="_Toc241936257" w:history="1">
+      <w:hyperlink w:anchor="_Toc241936460" w:history="1">
         <w:r>
           <w:rPr>
             <w:rStyle w:val="af"/>
@@ -1524,7 +1524,7 @@
             <w:noProof/>
             <w:webHidden/>
           </w:rPr>
-          <w:instrText xml:space="preserve"> PAGEREF _Toc241936257 \h </w:instrText>
+          <w:instrText xml:space="preserve"> PAGEREF _Toc241936460 \h </w:instrText>
         </w:r>
         <w:r>
           <w:rPr>
@@ -1565,7 +1565,7 @@
           <w:noProof/>
         </w:rPr>
       </w:pPr>
-      <w:hyperlink w:anchor="_Toc241936258" w:history="1">
+      <w:hyperlink w:anchor="_Toc241936461" w:history="1">
         <w:r>
           <w:rPr>
             <w:rStyle w:val="af"/>
@@ -1593,7 +1593,7 @@
             <w:noProof/>
             <w:webHidden/>
           </w:rPr>
-          <w:instrText xml:space="preserve"> PAGEREF _Toc241936258 \h </w:instrText>
+          <w:instrText xml:space="preserve"> PAGEREF _Toc241936461 \h </w:instrText>
         </w:r>
         <w:r>
           <w:rPr>
@@ -1639,7 +1639,7 @@
         <w:spacing w:before="0" w:after="360" w:line="360" w:lineRule="exact"/>
         <w:ind w:firstLine="709"/>
       </w:pPr>
-      <w:bookmarkStart w:id="1" w:name="_Toc241936239"/>
+      <w:bookmarkStart w:id="1" w:name="_Toc241936442"/>
       <w:r>
         <w:rPr>
           <w:b/>
@@ -1789,7 +1789,7 @@
         <w:ind w:firstLine="709"/>
       </w:pPr>
       <w:bookmarkStart w:id="2" w:name="_b608aa976fc82a0faaf3b83f58c735968afd03b"/>
-      <w:bookmarkStart w:id="3" w:name="_Toc241936240"/>
+      <w:bookmarkStart w:id="3" w:name="_Toc241936443"/>
       <w:bookmarkEnd w:id="0"/>
       <w:r>
         <w:rPr>
@@ -1848,7 +1848,7 @@
         <w:ind w:firstLine="709"/>
       </w:pPr>
       <w:bookmarkStart w:id="4" w:name="_c3cf235f67897fccdd158c7c34ca81091dc06e0"/>
-      <w:bookmarkStart w:id="5" w:name="_Toc241936241"/>
+      <w:bookmarkStart w:id="5" w:name="_Toc241936444"/>
       <w:r>
         <w:rPr>
           <w:b/>
@@ -3580,7 +3580,7 @@
         <w:ind w:firstLine="709"/>
       </w:pPr>
       <w:bookmarkStart w:id="6" w:name="_6c38f46d6252626ee19bec51dca515ea8eb3483"/>
-      <w:bookmarkStart w:id="7" w:name="_Toc241936242"/>
+      <w:bookmarkStart w:id="7" w:name="_Toc241936445"/>
       <w:bookmarkEnd w:id="4"/>
       <w:r>
         <w:rPr>
@@ -6350,7 +6350,7 @@
         </w:rPr>
         <w:lastRenderedPageBreak/>
         <w:drawing>
-          <wp:inline distT="0" distB="0" distL="0" distR="0" wp14:anchorId="60A93B44" wp14:editId="57537951">
+          <wp:inline distT="0" distB="0" distL="0" distR="0" wp14:anchorId="352D6390" wp14:editId="29516A40">
             <wp:extent cx="5334000" cy="3122341"/>
             <wp:effectExtent l="0" t="0" r="0" b="0"/>
             <wp:docPr id="12" name="Picture"/>
@@ -6614,7 +6614,7 @@
         <w:ind w:firstLine="709"/>
       </w:pPr>
       <w:bookmarkStart w:id="8" w:name="_e6ba0285e0e0ccc17e7a33a4e535fa387865e88"/>
-      <w:bookmarkStart w:id="9" w:name="_Toc241936243"/>
+      <w:bookmarkStart w:id="9" w:name="_Toc241936446"/>
       <w:bookmarkEnd w:id="6"/>
       <w:r>
         <w:rPr>
@@ -9027,7 +9027,7 @@
         <w:ind w:firstLine="709"/>
       </w:pPr>
       <w:bookmarkStart w:id="10" w:name="_b8f6f14603ee9e71fb2e4d1c108750035f950c7"/>
-      <w:bookmarkStart w:id="11" w:name="_Toc241936244"/>
+      <w:bookmarkStart w:id="11" w:name="_Toc241936447"/>
       <w:bookmarkEnd w:id="8"/>
       <w:r>
         <w:rPr>
@@ -12009,7 +12009,7 @@
           <w:sz w:val="28"/>
         </w:rPr>
         <w:drawing>
-          <wp:inline distT="0" distB="0" distL="0" distR="0" wp14:anchorId="3861FB8F" wp14:editId="21FC5C57">
+          <wp:inline distT="0" distB="0" distL="0" distR="0" wp14:anchorId="3365D20C" wp14:editId="6437E40F">
             <wp:extent cx="5334000" cy="3187390"/>
             <wp:effectExtent l="0" t="0" r="0" b="0"/>
             <wp:docPr id="17" name="Picture"/>
@@ -12556,7 +12556,7 @@
         <w:ind w:firstLine="709"/>
       </w:pPr>
       <w:bookmarkStart w:id="12" w:name="_823200a59a4cf40c51f7f0e02566c010f838ed7"/>
-      <w:bookmarkStart w:id="13" w:name="_Toc241936245"/>
+      <w:bookmarkStart w:id="13" w:name="_Toc241936448"/>
       <w:bookmarkEnd w:id="10"/>
       <w:r>
         <w:rPr>
@@ -13266,7 +13266,7 @@
         </w:rPr>
         <w:lastRenderedPageBreak/>
         <w:drawing>
-          <wp:inline distT="0" distB="0" distL="0" distR="0" wp14:anchorId="696F42B4" wp14:editId="6C5EF012">
+          <wp:inline distT="0" distB="0" distL="0" distR="0" wp14:anchorId="4F34FB26" wp14:editId="3E93C9A1">
             <wp:extent cx="5334000" cy="2862146"/>
             <wp:effectExtent l="0" t="0" r="0" b="0"/>
             <wp:docPr id="21" name="Picture"/>
@@ -13361,7 +13361,7 @@
         <w:ind w:firstLine="709"/>
       </w:pPr>
       <w:bookmarkStart w:id="14" w:name="_9d579ff3219dd0c08e87cdba2a2a6d1ef61e3cc"/>
-      <w:bookmarkStart w:id="15" w:name="_Toc241936246"/>
+      <w:bookmarkStart w:id="15" w:name="_Toc241936449"/>
       <w:bookmarkEnd w:id="12"/>
       <w:r>
         <w:rPr>
@@ -15275,7 +15275,7 @@
         <w:ind w:firstLine="709"/>
       </w:pPr>
       <w:bookmarkStart w:id="16" w:name="_8be076d9797953e124cfe81356f035b108674c3"/>
-      <w:bookmarkStart w:id="17" w:name="_Toc241936247"/>
+      <w:bookmarkStart w:id="17" w:name="_Toc241936450"/>
       <w:bookmarkEnd w:id="14"/>
       <w:r>
         <w:rPr>
@@ -15330,10 +15330,10 @@
         <w:tblLook w:val="0020" w:firstRow="1" w:lastRow="0" w:firstColumn="0" w:lastColumn="0" w:noHBand="0" w:noVBand="0"/>
       </w:tblPr>
       <w:tblGrid>
-        <w:gridCol w:w="1563"/>
-        <w:gridCol w:w="2716"/>
-        <w:gridCol w:w="2771"/>
-        <w:gridCol w:w="2305"/>
+        <w:gridCol w:w="1557"/>
+        <w:gridCol w:w="2599"/>
+        <w:gridCol w:w="2653"/>
+        <w:gridCol w:w="2546"/>
       </w:tblGrid>
       <w:tr>
         <w:trPr>
@@ -15344,7 +15344,7 @@
         </w:trPr>
         <w:tc>
           <w:tcPr>
-            <w:tcW w:w="1562" w:type="dxa"/>
+            <w:tcW w:w="1556" w:type="dxa"/>
             <w:vAlign w:val="center"/>
           </w:tcPr>
           <w:p>
@@ -15364,7 +15364,7 @@
         </w:tc>
         <w:tc>
           <w:tcPr>
-            <w:tcW w:w="2716" w:type="dxa"/>
+            <w:tcW w:w="2599" w:type="dxa"/>
             <w:vAlign w:val="center"/>
           </w:tcPr>
           <w:p>
@@ -15384,7 +15384,7 @@
         </w:tc>
         <w:tc>
           <w:tcPr>
-            <w:tcW w:w="2771" w:type="dxa"/>
+            <w:tcW w:w="2653" w:type="dxa"/>
             <w:vAlign w:val="center"/>
           </w:tcPr>
           <w:p>
@@ -15404,7 +15404,7 @@
         </w:tc>
         <w:tc>
           <w:tcPr>
-            <w:tcW w:w="2305" w:type="dxa"/>
+            <w:tcW w:w="2546" w:type="dxa"/>
             <w:vAlign w:val="center"/>
           </w:tcPr>
           <w:p>
@@ -15430,7 +15430,7 @@
         </w:trPr>
         <w:tc>
           <w:tcPr>
-            <w:tcW w:w="1562" w:type="dxa"/>
+            <w:tcW w:w="1556" w:type="dxa"/>
             <w:vAlign w:val="center"/>
           </w:tcPr>
           <w:p>
@@ -15450,7 +15450,7 @@
         </w:tc>
         <w:tc>
           <w:tcPr>
-            <w:tcW w:w="2716" w:type="dxa"/>
+            <w:tcW w:w="2599" w:type="dxa"/>
             <w:vAlign w:val="center"/>
           </w:tcPr>
           <w:p>
@@ -15600,7 +15600,7 @@
         </w:tc>
         <w:tc>
           <w:tcPr>
-            <w:tcW w:w="2771" w:type="dxa"/>
+            <w:tcW w:w="2653" w:type="dxa"/>
             <w:vAlign w:val="center"/>
           </w:tcPr>
           <w:p>
@@ -15625,7 +15625,7 @@
         </w:tc>
         <w:tc>
           <w:tcPr>
-            <w:tcW w:w="2305" w:type="dxa"/>
+            <w:tcW w:w="2546" w:type="dxa"/>
             <w:vAlign w:val="center"/>
           </w:tcPr>
           <w:p>
@@ -15650,27 +15650,28 @@
         </w:trPr>
         <w:tc>
           <w:tcPr>
-            <w:tcW w:w="1562" w:type="dxa"/>
-            <w:vAlign w:val="center"/>
-          </w:tcPr>
-          <w:p>
-            <w:pPr>
-              <w:pStyle w:val="Compact"/>
-              <w:spacing w:before="0" w:after="0" w:line="280" w:lineRule="exact"/>
-              <w:jc w:val="center"/>
-            </w:pPr>
-            <w:r>
-              <w:rPr>
-                <w:i/>
-                <w:sz w:val="24"/>
-              </w:rPr>
+            <w:tcW w:w="1556" w:type="dxa"/>
+            <w:vAlign w:val="center"/>
+          </w:tcPr>
+          <w:p>
+            <w:pPr>
+              <w:pStyle w:val="Compact"/>
+              <w:spacing w:before="0" w:after="0" w:line="280" w:lineRule="exact"/>
+              <w:jc w:val="center"/>
+            </w:pPr>
+            <w:r>
+              <w:rPr>
+                <w:i/>
+                <w:sz w:val="24"/>
+              </w:rPr>
+              <w:lastRenderedPageBreak/>
               <w:t>Arixcel</w:t>
             </w:r>
           </w:p>
         </w:tc>
         <w:tc>
           <w:tcPr>
-            <w:tcW w:w="2716" w:type="dxa"/>
+            <w:tcW w:w="2599" w:type="dxa"/>
             <w:vAlign w:val="center"/>
           </w:tcPr>
           <w:p>
@@ -15709,7 +15710,7 @@
         </w:tc>
         <w:tc>
           <w:tcPr>
-            <w:tcW w:w="2771" w:type="dxa"/>
+            <w:tcW w:w="2653" w:type="dxa"/>
             <w:vAlign w:val="center"/>
           </w:tcPr>
           <w:p>
@@ -15741,20 +15742,33 @@
         </w:tc>
         <w:tc>
           <w:tcPr>
-            <w:tcW w:w="2305" w:type="dxa"/>
-            <w:vAlign w:val="center"/>
-          </w:tcPr>
-          <w:p>
-            <w:pPr>
-              <w:pStyle w:val="Compact"/>
-              <w:spacing w:before="0" w:after="0" w:line="280" w:lineRule="exact"/>
-              <w:jc w:val="center"/>
-            </w:pPr>
-            <w:r>
-              <w:rPr>
-                <w:sz w:val="24"/>
-              </w:rPr>
-              <w:t>лицензия на надстройку (цена не показана)</w:t>
+            <w:tcW w:w="2546" w:type="dxa"/>
+            <w:vAlign w:val="center"/>
+          </w:tcPr>
+          <w:p>
+            <w:pPr>
+              <w:pStyle w:val="Compact"/>
+              <w:spacing w:before="0" w:after="0" w:line="280" w:lineRule="exact"/>
+              <w:jc w:val="center"/>
+            </w:pPr>
+            <w:r>
+              <w:rPr>
+                <w:sz w:val="24"/>
+              </w:rPr>
+              <w:t xml:space="preserve">лицензия на надстройку (2,75 </w:t>
+            </w:r>
+            <w:r>
+              <w:rPr>
+                <w:i/>
+                <w:sz w:val="24"/>
+              </w:rPr>
+              <w:t>GBP</w:t>
+            </w:r>
+            <w:r>
+              <w:rPr>
+                <w:sz w:val="24"/>
+              </w:rPr>
+              <w:t xml:space="preserve"> за пользователя в месяц, срок 12-36 месяцев)</w:t>
             </w:r>
           </w:p>
         </w:tc>
@@ -15766,28 +15780,27 @@
         </w:trPr>
         <w:tc>
           <w:tcPr>
-            <w:tcW w:w="1562" w:type="dxa"/>
-            <w:vAlign w:val="center"/>
-          </w:tcPr>
-          <w:p>
-            <w:pPr>
-              <w:pStyle w:val="Compact"/>
-              <w:spacing w:before="0" w:after="0" w:line="280" w:lineRule="exact"/>
-              <w:jc w:val="center"/>
-            </w:pPr>
-            <w:r>
-              <w:rPr>
-                <w:i/>
-                <w:sz w:val="24"/>
-              </w:rPr>
-              <w:lastRenderedPageBreak/>
+            <w:tcW w:w="1556" w:type="dxa"/>
+            <w:vAlign w:val="center"/>
+          </w:tcPr>
+          <w:p>
+            <w:pPr>
+              <w:pStyle w:val="Compact"/>
+              <w:spacing w:before="0" w:after="0" w:line="280" w:lineRule="exact"/>
+              <w:jc w:val="center"/>
+            </w:pPr>
+            <w:r>
+              <w:rPr>
+                <w:i/>
+                <w:sz w:val="24"/>
+              </w:rPr>
               <w:t>Operis</w:t>
             </w:r>
           </w:p>
         </w:tc>
         <w:tc>
           <w:tcPr>
-            <w:tcW w:w="2716" w:type="dxa"/>
+            <w:tcW w:w="2599" w:type="dxa"/>
             <w:vAlign w:val="center"/>
           </w:tcPr>
           <w:p>
@@ -15852,7 +15865,7 @@
         </w:tc>
         <w:tc>
           <w:tcPr>
-            <w:tcW w:w="2771" w:type="dxa"/>
+            <w:tcW w:w="2653" w:type="dxa"/>
             <w:vAlign w:val="center"/>
           </w:tcPr>
           <w:p>
@@ -15871,7 +15884,7 @@
         </w:tc>
         <w:tc>
           <w:tcPr>
-            <w:tcW w:w="2305" w:type="dxa"/>
+            <w:tcW w:w="2546" w:type="dxa"/>
             <w:vAlign w:val="center"/>
           </w:tcPr>
           <w:p>
@@ -15909,7 +15922,7 @@
         </w:trPr>
         <w:tc>
           <w:tcPr>
-            <w:tcW w:w="1562" w:type="dxa"/>
+            <w:tcW w:w="1556" w:type="dxa"/>
             <w:vAlign w:val="center"/>
           </w:tcPr>
           <w:p>
@@ -15929,7 +15942,7 @@
         </w:tc>
         <w:tc>
           <w:tcPr>
-            <w:tcW w:w="2716" w:type="dxa"/>
+            <w:tcW w:w="2599" w:type="dxa"/>
             <w:vAlign w:val="center"/>
           </w:tcPr>
           <w:p>
@@ -15949,13 +15962,7 @@
               <w:rPr>
                 <w:sz w:val="24"/>
               </w:rPr>
-              <w:t>-агент для финансового моделирован</w:t>
-            </w:r>
-            <w:r>
-              <w:rPr>
-                <w:sz w:val="24"/>
-              </w:rPr>
-              <w:t xml:space="preserve">ия в </w:t>
+              <w:t xml:space="preserve">-агент для финансового моделирования в </w:t>
             </w:r>
             <w:r>
               <w:rPr>
@@ -15981,7 +15988,7 @@
         </w:tc>
         <w:tc>
           <w:tcPr>
-            <w:tcW w:w="2771" w:type="dxa"/>
+            <w:tcW w:w="2653" w:type="dxa"/>
             <w:vAlign w:val="center"/>
           </w:tcPr>
           <w:p>
@@ -16039,7 +16046,7 @@
         </w:tc>
         <w:tc>
           <w:tcPr>
-            <w:tcW w:w="2305" w:type="dxa"/>
+            <w:tcW w:w="2546" w:type="dxa"/>
             <w:vAlign w:val="center"/>
           </w:tcPr>
           <w:p>
@@ -16110,7 +16117,7 @@
         </w:trPr>
         <w:tc>
           <w:tcPr>
-            <w:tcW w:w="1562" w:type="dxa"/>
+            <w:tcW w:w="1556" w:type="dxa"/>
             <w:vAlign w:val="center"/>
           </w:tcPr>
           <w:p>
@@ -16130,7 +16137,7 @@
         </w:tc>
         <w:tc>
           <w:tcPr>
-            <w:tcW w:w="2716" w:type="dxa"/>
+            <w:tcW w:w="2599" w:type="dxa"/>
             <w:vAlign w:val="center"/>
           </w:tcPr>
           <w:p>
@@ -16208,7 +16215,7 @@
         </w:tc>
         <w:tc>
           <w:tcPr>
-            <w:tcW w:w="2771" w:type="dxa"/>
+            <w:tcW w:w="2653" w:type="dxa"/>
             <w:vAlign w:val="center"/>
           </w:tcPr>
           <w:p>
@@ -16227,7 +16234,7 @@
         </w:tc>
         <w:tc>
           <w:tcPr>
-            <w:tcW w:w="2305" w:type="dxa"/>
+            <w:tcW w:w="2546" w:type="dxa"/>
             <w:vAlign w:val="center"/>
           </w:tcPr>
           <w:p>
@@ -16265,7 +16272,7 @@
         </w:trPr>
         <w:tc>
           <w:tcPr>
-            <w:tcW w:w="1562" w:type="dxa"/>
+            <w:tcW w:w="1556" w:type="dxa"/>
             <w:vAlign w:val="center"/>
           </w:tcPr>
           <w:p>
@@ -16285,7 +16292,7 @@
         </w:tc>
         <w:tc>
           <w:tcPr>
-            <w:tcW w:w="2716" w:type="dxa"/>
+            <w:tcW w:w="2599" w:type="dxa"/>
             <w:vAlign w:val="center"/>
           </w:tcPr>
           <w:p>
@@ -16337,7 +16344,7 @@
         </w:tc>
         <w:tc>
           <w:tcPr>
-            <w:tcW w:w="2771" w:type="dxa"/>
+            <w:tcW w:w="2653" w:type="dxa"/>
             <w:vAlign w:val="center"/>
           </w:tcPr>
           <w:p>
@@ -16363,7 +16370,7 @@
         </w:tc>
         <w:tc>
           <w:tcPr>
-            <w:tcW w:w="2305" w:type="dxa"/>
+            <w:tcW w:w="2546" w:type="dxa"/>
             <w:vAlign w:val="center"/>
           </w:tcPr>
           <w:p>
@@ -16388,7 +16395,7 @@
         </w:trPr>
         <w:tc>
           <w:tcPr>
-            <w:tcW w:w="1562" w:type="dxa"/>
+            <w:tcW w:w="1556" w:type="dxa"/>
             <w:vAlign w:val="center"/>
           </w:tcPr>
           <w:p>
@@ -16408,7 +16415,7 @@
         </w:tc>
         <w:tc>
           <w:tcPr>
-            <w:tcW w:w="2716" w:type="dxa"/>
+            <w:tcW w:w="2599" w:type="dxa"/>
             <w:vAlign w:val="center"/>
           </w:tcPr>
           <w:p>
@@ -16440,7 +16447,7 @@
         </w:tc>
         <w:tc>
           <w:tcPr>
-            <w:tcW w:w="2771" w:type="dxa"/>
+            <w:tcW w:w="2653" w:type="dxa"/>
             <w:vAlign w:val="center"/>
           </w:tcPr>
           <w:p>
@@ -16459,7 +16466,7 @@
         </w:tc>
         <w:tc>
           <w:tcPr>
-            <w:tcW w:w="2305" w:type="dxa"/>
+            <w:tcW w:w="2546" w:type="dxa"/>
             <w:vAlign w:val="center"/>
           </w:tcPr>
           <w:p>
@@ -17358,6 +17365,7 @@
                 <w:i/>
                 <w:sz w:val="24"/>
               </w:rPr>
+              <w:lastRenderedPageBreak/>
               <w:t>A005</w:t>
             </w:r>
           </w:p>
@@ -17737,7 +17745,6 @@
                 <w:i/>
                 <w:sz w:val="24"/>
               </w:rPr>
-              <w:lastRenderedPageBreak/>
               <w:t>A008</w:t>
             </w:r>
           </w:p>
@@ -17945,7 +17952,7 @@
         <w:ind w:firstLine="709"/>
       </w:pPr>
       <w:bookmarkStart w:id="18" w:name="_0ab5b5274b575dfb9e5e85d7a9a12b82683e52c"/>
-      <w:bookmarkStart w:id="19" w:name="_Toc241936248"/>
+      <w:bookmarkStart w:id="19" w:name="_Toc241936451"/>
       <w:bookmarkEnd w:id="16"/>
       <w:r>
         <w:rPr>
@@ -18020,10 +18027,10 @@
         <w:tblLook w:val="0020" w:firstRow="1" w:lastRow="0" w:firstColumn="0" w:lastColumn="0" w:noHBand="0" w:noVBand="0"/>
       </w:tblPr>
       <w:tblGrid>
-        <w:gridCol w:w="1557"/>
-        <w:gridCol w:w="2754"/>
-        <w:gridCol w:w="2506"/>
-        <w:gridCol w:w="2538"/>
+        <w:gridCol w:w="1558"/>
+        <w:gridCol w:w="2735"/>
+        <w:gridCol w:w="2488"/>
+        <w:gridCol w:w="2574"/>
       </w:tblGrid>
       <w:tr>
         <w:trPr>
@@ -18034,7 +18041,7 @@
         </w:trPr>
         <w:tc>
           <w:tcPr>
-            <w:tcW w:w="1558" w:type="dxa"/>
+            <w:tcW w:w="1557" w:type="dxa"/>
             <w:vAlign w:val="center"/>
           </w:tcPr>
           <w:p>
@@ -18054,7 +18061,7 @@
         </w:tc>
         <w:tc>
           <w:tcPr>
-            <w:tcW w:w="2753" w:type="dxa"/>
+            <w:tcW w:w="2735" w:type="dxa"/>
             <w:vAlign w:val="center"/>
           </w:tcPr>
           <w:p>
@@ -18074,7 +18081,7 @@
         </w:tc>
         <w:tc>
           <w:tcPr>
-            <w:tcW w:w="2505" w:type="dxa"/>
+            <w:tcW w:w="2488" w:type="dxa"/>
             <w:vAlign w:val="center"/>
           </w:tcPr>
           <w:p>
@@ -18094,7 +18101,7 @@
         </w:tc>
         <w:tc>
           <w:tcPr>
-            <w:tcW w:w="2537" w:type="dxa"/>
+            <w:tcW w:w="2574" w:type="dxa"/>
             <w:vAlign w:val="center"/>
           </w:tcPr>
           <w:p>
@@ -18120,7 +18127,7 @@
         </w:trPr>
         <w:tc>
           <w:tcPr>
-            <w:tcW w:w="1558" w:type="dxa"/>
+            <w:tcW w:w="1557" w:type="dxa"/>
             <w:vAlign w:val="center"/>
           </w:tcPr>
           <w:p>
@@ -18140,26 +18147,32 @@
         </w:tc>
         <w:tc>
           <w:tcPr>
-            <w:tcW w:w="2753" w:type="dxa"/>
-            <w:vAlign w:val="center"/>
-          </w:tcPr>
-          <w:p>
-            <w:pPr>
-              <w:pStyle w:val="Compact"/>
-              <w:spacing w:before="0" w:after="0" w:line="280" w:lineRule="exact"/>
-              <w:jc w:val="center"/>
-            </w:pPr>
-            <w:r>
-              <w:rPr>
-                <w:sz w:val="24"/>
-              </w:rPr>
-              <w:t>аудит, налоги, консалтинг, страхование и пенсии; контролеры и проверяющие модели</w:t>
-            </w:r>
-          </w:p>
-        </w:tc>
-        <w:tc>
-          <w:tcPr>
-            <w:tcW w:w="2505" w:type="dxa"/>
+            <w:tcW w:w="2735" w:type="dxa"/>
+            <w:vAlign w:val="center"/>
+          </w:tcPr>
+          <w:p>
+            <w:pPr>
+              <w:pStyle w:val="Compact"/>
+              <w:spacing w:before="0" w:after="0" w:line="280" w:lineRule="exact"/>
+              <w:jc w:val="center"/>
+            </w:pPr>
+            <w:r>
+              <w:rPr>
+                <w:sz w:val="24"/>
+              </w:rPr>
+              <w:t>аудит, налоги, консалтинг, страхование и пенсии; контролеры</w:t>
+            </w:r>
+            <w:r>
+              <w:rPr>
+                <w:sz w:val="24"/>
+              </w:rPr>
+              <w:t xml:space="preserve"> и проверяющие модели</w:t>
+            </w:r>
+          </w:p>
+        </w:tc>
+        <w:tc>
+          <w:tcPr>
+            <w:tcW w:w="2488" w:type="dxa"/>
             <w:vAlign w:val="center"/>
           </w:tcPr>
           <w:p>
@@ -18191,7 +18204,7 @@
         </w:tc>
         <w:tc>
           <w:tcPr>
-            <w:tcW w:w="2537" w:type="dxa"/>
+            <w:tcW w:w="2574" w:type="dxa"/>
             <w:vAlign w:val="center"/>
           </w:tcPr>
           <w:p>
@@ -18229,7 +18242,7 @@
         </w:trPr>
         <w:tc>
           <w:tcPr>
-            <w:tcW w:w="1558" w:type="dxa"/>
+            <w:tcW w:w="1557" w:type="dxa"/>
             <w:vAlign w:val="center"/>
           </w:tcPr>
           <w:p>
@@ -18249,7 +18262,7 @@
         </w:tc>
         <w:tc>
           <w:tcPr>
-            <w:tcW w:w="2753" w:type="dxa"/>
+            <w:tcW w:w="2735" w:type="dxa"/>
             <w:vAlign w:val="center"/>
           </w:tcPr>
           <w:p>
@@ -18275,7 +18288,7 @@
         </w:tc>
         <w:tc>
           <w:tcPr>
-            <w:tcW w:w="2505" w:type="dxa"/>
+            <w:tcW w:w="2488" w:type="dxa"/>
             <w:vAlign w:val="center"/>
           </w:tcPr>
           <w:p>
@@ -18294,20 +18307,33 @@
         </w:tc>
         <w:tc>
           <w:tcPr>
-            <w:tcW w:w="2537" w:type="dxa"/>
-            <w:vAlign w:val="center"/>
-          </w:tcPr>
-          <w:p>
-            <w:pPr>
-              <w:pStyle w:val="Compact"/>
-              <w:spacing w:before="0" w:after="0" w:line="280" w:lineRule="exact"/>
-              <w:jc w:val="center"/>
-            </w:pPr>
-            <w:r>
-              <w:rPr>
-                <w:sz w:val="24"/>
-              </w:rPr>
-              <w:t>лицензия (цена не показана)</w:t>
+            <w:tcW w:w="2574" w:type="dxa"/>
+            <w:vAlign w:val="center"/>
+          </w:tcPr>
+          <w:p>
+            <w:pPr>
+              <w:pStyle w:val="Compact"/>
+              <w:spacing w:before="0" w:after="0" w:line="280" w:lineRule="exact"/>
+              <w:jc w:val="center"/>
+            </w:pPr>
+            <w:r>
+              <w:rPr>
+                <w:sz w:val="24"/>
+              </w:rPr>
+              <w:t xml:space="preserve">лицензия 2,75 </w:t>
+            </w:r>
+            <w:r>
+              <w:rPr>
+                <w:i/>
+                <w:sz w:val="24"/>
+              </w:rPr>
+              <w:t>GBP</w:t>
+            </w:r>
+            <w:r>
+              <w:rPr>
+                <w:sz w:val="24"/>
+              </w:rPr>
+              <w:t xml:space="preserve"> за пользователя в месяц (срок 12-36 месяцев)</w:t>
             </w:r>
           </w:p>
         </w:tc>
@@ -18319,7 +18345,7 @@
         </w:trPr>
         <w:tc>
           <w:tcPr>
-            <w:tcW w:w="1558" w:type="dxa"/>
+            <w:tcW w:w="1557" w:type="dxa"/>
             <w:vAlign w:val="center"/>
           </w:tcPr>
           <w:p>
@@ -18339,7 +18365,7 @@
         </w:tc>
         <w:tc>
           <w:tcPr>
-            <w:tcW w:w="2753" w:type="dxa"/>
+            <w:tcW w:w="2735" w:type="dxa"/>
             <w:vAlign w:val="center"/>
           </w:tcPr>
           <w:p>
@@ -18358,7 +18384,7 @@
         </w:tc>
         <w:tc>
           <w:tcPr>
-            <w:tcW w:w="2505" w:type="dxa"/>
+            <w:tcW w:w="2488" w:type="dxa"/>
             <w:vAlign w:val="center"/>
           </w:tcPr>
           <w:p>
@@ -18377,26 +18403,26 @@
         </w:tc>
         <w:tc>
           <w:tcPr>
-            <w:tcW w:w="2537" w:type="dxa"/>
-            <w:vAlign w:val="center"/>
-          </w:tcPr>
-          <w:p>
-            <w:pPr>
-              <w:pStyle w:val="Compact"/>
-              <w:spacing w:before="0" w:after="0" w:line="280" w:lineRule="exact"/>
-              <w:jc w:val="center"/>
-            </w:pPr>
-            <w:r>
-              <w:rPr>
-                <w:sz w:val="24"/>
-              </w:rPr>
-              <w:t>гонорары за аудит и консалтинг, обучение, на</w:t>
-            </w:r>
-            <w:r>
-              <w:rPr>
-                <w:sz w:val="24"/>
-              </w:rPr>
-              <w:t>дстройка</w:t>
+            <w:tcW w:w="2574" w:type="dxa"/>
+            <w:vAlign w:val="center"/>
+          </w:tcPr>
+          <w:p>
+            <w:pPr>
+              <w:pStyle w:val="Compact"/>
+              <w:spacing w:before="0" w:after="0" w:line="280" w:lineRule="exact"/>
+              <w:jc w:val="center"/>
+            </w:pPr>
+            <w:r>
+              <w:rPr>
+                <w:sz w:val="24"/>
+              </w:rPr>
+              <w:t>гонорары за аудит и консалтинг, обучение, над</w:t>
+            </w:r>
+            <w:r>
+              <w:rPr>
+                <w:sz w:val="24"/>
+              </w:rPr>
+              <w:t>стройка</w:t>
             </w:r>
           </w:p>
         </w:tc>
@@ -18408,7 +18434,7 @@
         </w:trPr>
         <w:tc>
           <w:tcPr>
-            <w:tcW w:w="1558" w:type="dxa"/>
+            <w:tcW w:w="1557" w:type="dxa"/>
             <w:vAlign w:val="center"/>
           </w:tcPr>
           <w:p>
@@ -18428,7 +18454,7 @@
         </w:tc>
         <w:tc>
           <w:tcPr>
-            <w:tcW w:w="2753" w:type="dxa"/>
+            <w:tcW w:w="2735" w:type="dxa"/>
             <w:vAlign w:val="center"/>
           </w:tcPr>
           <w:p>
@@ -18486,7 +18512,7 @@
         </w:tc>
         <w:tc>
           <w:tcPr>
-            <w:tcW w:w="2505" w:type="dxa"/>
+            <w:tcW w:w="2488" w:type="dxa"/>
             <w:vAlign w:val="center"/>
           </w:tcPr>
           <w:p>
@@ -18518,7 +18544,7 @@
         </w:tc>
         <w:tc>
           <w:tcPr>
-            <w:tcW w:w="2537" w:type="dxa"/>
+            <w:tcW w:w="2574" w:type="dxa"/>
             <w:vAlign w:val="center"/>
           </w:tcPr>
           <w:p>
@@ -18628,7 +18654,7 @@
         </w:trPr>
         <w:tc>
           <w:tcPr>
-            <w:tcW w:w="1558" w:type="dxa"/>
+            <w:tcW w:w="1557" w:type="dxa"/>
             <w:vAlign w:val="center"/>
           </w:tcPr>
           <w:p>
@@ -18648,7 +18674,7 @@
         </w:tc>
         <w:tc>
           <w:tcPr>
-            <w:tcW w:w="2753" w:type="dxa"/>
+            <w:tcW w:w="2735" w:type="dxa"/>
             <w:vAlign w:val="center"/>
           </w:tcPr>
           <w:p>
@@ -18667,7 +18693,7 @@
         </w:tc>
         <w:tc>
           <w:tcPr>
-            <w:tcW w:w="2505" w:type="dxa"/>
+            <w:tcW w:w="2488" w:type="dxa"/>
             <w:vAlign w:val="center"/>
           </w:tcPr>
           <w:p>
@@ -18706,7 +18732,7 @@
         </w:tc>
         <w:tc>
           <w:tcPr>
-            <w:tcW w:w="2537" w:type="dxa"/>
+            <w:tcW w:w="2574" w:type="dxa"/>
             <w:vAlign w:val="center"/>
           </w:tcPr>
           <w:p>
@@ -18744,27 +18770,28 @@
         </w:trPr>
         <w:tc>
           <w:tcPr>
-            <w:tcW w:w="1558" w:type="dxa"/>
-            <w:vAlign w:val="center"/>
-          </w:tcPr>
-          <w:p>
-            <w:pPr>
-              <w:pStyle w:val="Compact"/>
-              <w:spacing w:before="0" w:after="0" w:line="280" w:lineRule="exact"/>
-              <w:jc w:val="center"/>
-            </w:pPr>
-            <w:r>
-              <w:rPr>
-                <w:i/>
-                <w:sz w:val="24"/>
-              </w:rPr>
+            <w:tcW w:w="1557" w:type="dxa"/>
+            <w:vAlign w:val="center"/>
+          </w:tcPr>
+          <w:p>
+            <w:pPr>
+              <w:pStyle w:val="Compact"/>
+              <w:spacing w:before="0" w:after="0" w:line="280" w:lineRule="exact"/>
+              <w:jc w:val="center"/>
+            </w:pPr>
+            <w:r>
+              <w:rPr>
+                <w:i/>
+                <w:sz w:val="24"/>
+              </w:rPr>
+              <w:lastRenderedPageBreak/>
               <w:t>Datarails</w:t>
             </w:r>
           </w:p>
         </w:tc>
         <w:tc>
           <w:tcPr>
-            <w:tcW w:w="2753" w:type="dxa"/>
+            <w:tcW w:w="2735" w:type="dxa"/>
             <w:vAlign w:val="center"/>
           </w:tcPr>
           <w:p>
@@ -18790,7 +18817,7 @@
         </w:tc>
         <w:tc>
           <w:tcPr>
-            <w:tcW w:w="2505" w:type="dxa"/>
+            <w:tcW w:w="2488" w:type="dxa"/>
             <w:vAlign w:val="center"/>
           </w:tcPr>
           <w:p>
@@ -18829,7 +18856,7 @@
         </w:tc>
         <w:tc>
           <w:tcPr>
-            <w:tcW w:w="2537" w:type="dxa"/>
+            <w:tcW w:w="2574" w:type="dxa"/>
             <w:vAlign w:val="center"/>
           </w:tcPr>
           <w:p>
@@ -18854,7 +18881,7 @@
         </w:trPr>
         <w:tc>
           <w:tcPr>
-            <w:tcW w:w="1558" w:type="dxa"/>
+            <w:tcW w:w="1557" w:type="dxa"/>
             <w:vAlign w:val="center"/>
           </w:tcPr>
           <w:p>
@@ -18874,7 +18901,7 @@
         </w:tc>
         <w:tc>
           <w:tcPr>
-            <w:tcW w:w="2753" w:type="dxa"/>
+            <w:tcW w:w="2735" w:type="dxa"/>
             <w:vAlign w:val="center"/>
           </w:tcPr>
           <w:p>
@@ -18893,7 +18920,7 @@
         </w:tc>
         <w:tc>
           <w:tcPr>
-            <w:tcW w:w="2505" w:type="dxa"/>
+            <w:tcW w:w="2488" w:type="dxa"/>
             <w:vAlign w:val="center"/>
           </w:tcPr>
           <w:p>
@@ -18912,7 +18939,7 @@
         </w:tc>
         <w:tc>
           <w:tcPr>
-            <w:tcW w:w="2537" w:type="dxa"/>
+            <w:tcW w:w="2574" w:type="dxa"/>
             <w:vAlign w:val="center"/>
           </w:tcPr>
           <w:p>
@@ -18942,7 +18969,6 @@
         <w:rPr>
           <w:sz w:val="28"/>
         </w:rPr>
-        <w:lastRenderedPageBreak/>
         <w:t>Блоки показывают две модели: самообслуживание с п</w:t>
       </w:r>
       <w:r>
@@ -19561,7 +19587,13 @@
               <w:rPr>
                 <w:sz w:val="24"/>
               </w:rPr>
-              <w:t>эксперты и репутация, более 1 200 проектов</w:t>
+              <w:t>эксперты и репутация, бо</w:t>
+            </w:r>
+            <w:r>
+              <w:rPr>
+                <w:sz w:val="24"/>
+              </w:rPr>
+              <w:t>лее 1 200 проектов</w:t>
             </w:r>
           </w:p>
         </w:tc>
@@ -19849,6 +19881,7 @@
                 <w:i/>
                 <w:sz w:val="24"/>
               </w:rPr>
+              <w:lastRenderedPageBreak/>
               <w:t>Datarails</w:t>
             </w:r>
           </w:p>
@@ -19945,13 +19978,7 @@
               <w:rPr>
                 <w:sz w:val="24"/>
               </w:rPr>
-              <w:t>консолидированные данные кли</w:t>
-            </w:r>
-            <w:r>
-              <w:rPr>
-                <w:sz w:val="24"/>
-              </w:rPr>
-              <w:t>ентов; умеренные эффекты данных</w:t>
+              <w:t>консолидированные данные клиентов; умеренные эффекты данных</w:t>
             </w:r>
           </w:p>
         </w:tc>
@@ -20096,14 +20123,13 @@
         <w:rPr>
           <w:sz w:val="28"/>
         </w:rPr>
-        <w:lastRenderedPageBreak/>
-        <w:t>Каналы большинства конкурентов - прямые заходы и органический поиск, платная реклама почти не используется (согласуется с ЛР4). Сетевые эффекты слабые у всех; сильнее всего эффект данны</w:t>
-      </w:r>
-      <w:r>
-        <w:rPr>
-          <w:sz w:val="28"/>
-        </w:rPr>
-        <w:t>х у платформ (</w:t>
+        <w:t>Каналы большинства конкуре</w:t>
+      </w:r>
+      <w:r>
+        <w:rPr>
+          <w:sz w:val="28"/>
+        </w:rPr>
+        <w:t>нтов - прямые заходы и органический поиск, платная реклама почти не используется (согласуется с ЛР4). Сетевые эффекты слабые у всех; сильнее всего эффект данных у платформ (</w:t>
       </w:r>
       <w:r>
         <w:rPr>
@@ -20176,13 +20202,13 @@
         <w:tblLook w:val="0020" w:firstRow="1" w:lastRow="0" w:firstColumn="0" w:lastColumn="0" w:noHBand="0" w:noVBand="0"/>
       </w:tblPr>
       <w:tblGrid>
-        <w:gridCol w:w="1313"/>
-        <w:gridCol w:w="1526"/>
-        <w:gridCol w:w="1696"/>
-        <w:gridCol w:w="1205"/>
-        <w:gridCol w:w="1205"/>
-        <w:gridCol w:w="1419"/>
-        <w:gridCol w:w="991"/>
+        <w:gridCol w:w="1284"/>
+        <w:gridCol w:w="1492"/>
+        <w:gridCol w:w="1866"/>
+        <w:gridCol w:w="1178"/>
+        <w:gridCol w:w="1178"/>
+        <w:gridCol w:w="1388"/>
+        <w:gridCol w:w="969"/>
       </w:tblGrid>
       <w:tr>
         <w:trPr>
@@ -20193,7 +20219,7 @@
         </w:trPr>
         <w:tc>
           <w:tcPr>
-            <w:tcW w:w="1312" w:type="dxa"/>
+            <w:tcW w:w="1283" w:type="dxa"/>
             <w:vAlign w:val="center"/>
           </w:tcPr>
           <w:p>
@@ -20213,7 +20239,7 @@
         </w:tc>
         <w:tc>
           <w:tcPr>
-            <w:tcW w:w="1526" w:type="dxa"/>
+            <w:tcW w:w="1492" w:type="dxa"/>
             <w:vAlign w:val="center"/>
           </w:tcPr>
           <w:p>
@@ -20233,7 +20259,7 @@
         </w:tc>
         <w:tc>
           <w:tcPr>
-            <w:tcW w:w="1696" w:type="dxa"/>
+            <w:tcW w:w="1866" w:type="dxa"/>
             <w:vAlign w:val="center"/>
           </w:tcPr>
           <w:p>
@@ -20253,7 +20279,7 @@
         </w:tc>
         <w:tc>
           <w:tcPr>
-            <w:tcW w:w="1205" w:type="dxa"/>
+            <w:tcW w:w="1178" w:type="dxa"/>
             <w:vAlign w:val="center"/>
           </w:tcPr>
           <w:p>
@@ -20273,7 +20299,7 @@
         </w:tc>
         <w:tc>
           <w:tcPr>
-            <w:tcW w:w="1205" w:type="dxa"/>
+            <w:tcW w:w="1178" w:type="dxa"/>
             <w:vAlign w:val="center"/>
           </w:tcPr>
           <w:p>
@@ -20293,7 +20319,7 @@
         </w:tc>
         <w:tc>
           <w:tcPr>
-            <w:tcW w:w="1419" w:type="dxa"/>
+            <w:tcW w:w="1388" w:type="dxa"/>
             <w:vAlign w:val="center"/>
           </w:tcPr>
           <w:p>
@@ -20313,7 +20339,7 @@
         </w:tc>
         <w:tc>
           <w:tcPr>
-            <w:tcW w:w="991" w:type="dxa"/>
+            <w:tcW w:w="969" w:type="dxa"/>
             <w:vAlign w:val="center"/>
           </w:tcPr>
           <w:p>
@@ -20339,7 +20365,7 @@
         </w:trPr>
         <w:tc>
           <w:tcPr>
-            <w:tcW w:w="1312" w:type="dxa"/>
+            <w:tcW w:w="1283" w:type="dxa"/>
             <w:vAlign w:val="center"/>
           </w:tcPr>
           <w:p>
@@ -20359,7 +20385,7 @@
         </w:tc>
         <w:tc>
           <w:tcPr>
-            <w:tcW w:w="1526" w:type="dxa"/>
+            <w:tcW w:w="1492" w:type="dxa"/>
             <w:vAlign w:val="center"/>
           </w:tcPr>
           <w:p>
@@ -20378,7 +20404,7 @@
         </w:tc>
         <w:tc>
           <w:tcPr>
-            <w:tcW w:w="1696" w:type="dxa"/>
+            <w:tcW w:w="1866" w:type="dxa"/>
             <w:vAlign w:val="center"/>
           </w:tcPr>
           <w:p>
@@ -20397,7 +20423,7 @@
         </w:tc>
         <w:tc>
           <w:tcPr>
-            <w:tcW w:w="1205" w:type="dxa"/>
+            <w:tcW w:w="1178" w:type="dxa"/>
             <w:vAlign w:val="center"/>
           </w:tcPr>
           <w:p>
@@ -20416,7 +20442,7 @@
         </w:tc>
         <w:tc>
           <w:tcPr>
-            <w:tcW w:w="1205" w:type="dxa"/>
+            <w:tcW w:w="1178" w:type="dxa"/>
             <w:vAlign w:val="center"/>
           </w:tcPr>
           <w:p>
@@ -20461,7 +20487,7 @@
         </w:tc>
         <w:tc>
           <w:tcPr>
-            <w:tcW w:w="1419" w:type="dxa"/>
+            <w:tcW w:w="1388" w:type="dxa"/>
             <w:vAlign w:val="center"/>
           </w:tcPr>
           <w:p>
@@ -20480,7 +20506,7 @@
         </w:tc>
         <w:tc>
           <w:tcPr>
-            <w:tcW w:w="991" w:type="dxa"/>
+            <w:tcW w:w="969" w:type="dxa"/>
             <w:vAlign w:val="center"/>
           </w:tcPr>
           <w:p>
@@ -20505,7 +20531,7 @@
         </w:trPr>
         <w:tc>
           <w:tcPr>
-            <w:tcW w:w="1312" w:type="dxa"/>
+            <w:tcW w:w="1283" w:type="dxa"/>
             <w:vAlign w:val="center"/>
           </w:tcPr>
           <w:p>
@@ -20525,7 +20551,7 @@
         </w:tc>
         <w:tc>
           <w:tcPr>
-            <w:tcW w:w="1526" w:type="dxa"/>
+            <w:tcW w:w="1492" w:type="dxa"/>
             <w:vAlign w:val="center"/>
           </w:tcPr>
           <w:p>
@@ -20544,26 +20570,26 @@
         </w:tc>
         <w:tc>
           <w:tcPr>
-            <w:tcW w:w="1696" w:type="dxa"/>
-            <w:vAlign w:val="center"/>
-          </w:tcPr>
-          <w:p>
-            <w:pPr>
-              <w:pStyle w:val="Compact"/>
-              <w:spacing w:before="0" w:after="0" w:line="280" w:lineRule="exact"/>
-              <w:jc w:val="center"/>
-            </w:pPr>
-            <w:r>
-              <w:rPr>
-                <w:sz w:val="24"/>
-              </w:rPr>
-              <w:t>не показано</w:t>
-            </w:r>
-          </w:p>
-        </w:tc>
-        <w:tc>
-          <w:tcPr>
-            <w:tcW w:w="1205" w:type="dxa"/>
+            <w:tcW w:w="1866" w:type="dxa"/>
+            <w:vAlign w:val="center"/>
+          </w:tcPr>
+          <w:p>
+            <w:pPr>
+              <w:pStyle w:val="Compact"/>
+              <w:spacing w:before="0" w:after="0" w:line="280" w:lineRule="exact"/>
+              <w:jc w:val="center"/>
+            </w:pPr>
+            <w:r>
+              <w:rPr>
+                <w:sz w:val="24"/>
+              </w:rPr>
+              <w:t>arixcel.com/explorer/download</w:t>
+            </w:r>
+          </w:p>
+        </w:tc>
+        <w:tc>
+          <w:tcPr>
+            <w:tcW w:w="1178" w:type="dxa"/>
             <w:vAlign w:val="center"/>
           </w:tcPr>
           <w:p>
@@ -20582,45 +20608,45 @@
         </w:tc>
         <w:tc>
           <w:tcPr>
-            <w:tcW w:w="1205" w:type="dxa"/>
-            <w:vAlign w:val="center"/>
-          </w:tcPr>
-          <w:p>
-            <w:pPr>
-              <w:pStyle w:val="Compact"/>
-              <w:spacing w:before="0" w:after="0" w:line="280" w:lineRule="exact"/>
-              <w:jc w:val="center"/>
-            </w:pPr>
-            <w:r>
-              <w:rPr>
-                <w:sz w:val="24"/>
-              </w:rPr>
-              <w:t>не показано</w:t>
-            </w:r>
-          </w:p>
-        </w:tc>
-        <w:tc>
-          <w:tcPr>
-            <w:tcW w:w="1419" w:type="dxa"/>
-            <w:vAlign w:val="center"/>
-          </w:tcPr>
-          <w:p>
-            <w:pPr>
-              <w:pStyle w:val="Compact"/>
-              <w:spacing w:before="0" w:after="0" w:line="280" w:lineRule="exact"/>
-              <w:jc w:val="center"/>
-            </w:pPr>
-            <w:r>
-              <w:rPr>
-                <w:sz w:val="24"/>
-              </w:rPr>
-              <w:t>1</w:t>
-            </w:r>
-          </w:p>
-        </w:tc>
-        <w:tc>
-          <w:tcPr>
-            <w:tcW w:w="991" w:type="dxa"/>
+            <w:tcW w:w="1178" w:type="dxa"/>
+            <w:vAlign w:val="center"/>
+          </w:tcPr>
+          <w:p>
+            <w:pPr>
+              <w:pStyle w:val="Compact"/>
+              <w:spacing w:before="0" w:after="0" w:line="280" w:lineRule="exact"/>
+              <w:jc w:val="center"/>
+            </w:pPr>
+            <w:r>
+              <w:rPr>
+                <w:sz w:val="24"/>
+              </w:rPr>
+              <w:t>да (пробный режим)</w:t>
+            </w:r>
+          </w:p>
+        </w:tc>
+        <w:tc>
+          <w:tcPr>
+            <w:tcW w:w="1388" w:type="dxa"/>
+            <w:vAlign w:val="center"/>
+          </w:tcPr>
+          <w:p>
+            <w:pPr>
+              <w:pStyle w:val="Compact"/>
+              <w:spacing w:before="0" w:after="0" w:line="280" w:lineRule="exact"/>
+              <w:jc w:val="center"/>
+            </w:pPr>
+            <w:r>
+              <w:rPr>
+                <w:sz w:val="24"/>
+              </w:rPr>
+              <w:t>3</w:t>
+            </w:r>
+          </w:p>
+        </w:tc>
+        <w:tc>
+          <w:tcPr>
+            <w:tcW w:w="969" w:type="dxa"/>
             <w:vAlign w:val="center"/>
           </w:tcPr>
           <w:p>
@@ -20645,7 +20671,7 @@
         </w:trPr>
         <w:tc>
           <w:tcPr>
-            <w:tcW w:w="1312" w:type="dxa"/>
+            <w:tcW w:w="1283" w:type="dxa"/>
             <w:vAlign w:val="center"/>
           </w:tcPr>
           <w:p>
@@ -20665,7 +20691,7 @@
         </w:tc>
         <w:tc>
           <w:tcPr>
-            <w:tcW w:w="1526" w:type="dxa"/>
+            <w:tcW w:w="1492" w:type="dxa"/>
             <w:vAlign w:val="center"/>
           </w:tcPr>
           <w:p>
@@ -20684,26 +20710,26 @@
         </w:tc>
         <w:tc>
           <w:tcPr>
-            <w:tcW w:w="1696" w:type="dxa"/>
-            <w:vAlign w:val="center"/>
-          </w:tcPr>
-          <w:p>
-            <w:pPr>
-              <w:pStyle w:val="Compact"/>
-              <w:spacing w:before="0" w:after="0" w:line="280" w:lineRule="exact"/>
-              <w:jc w:val="center"/>
-            </w:pPr>
-            <w:r>
-              <w:rPr>
-                <w:sz w:val="24"/>
-              </w:rPr>
-              <w:t>не показано</w:t>
-            </w:r>
-          </w:p>
-        </w:tc>
-        <w:tc>
-          <w:tcPr>
-            <w:tcW w:w="1205" w:type="dxa"/>
+            <w:tcW w:w="1866" w:type="dxa"/>
+            <w:vAlign w:val="center"/>
+          </w:tcPr>
+          <w:p>
+            <w:pPr>
+              <w:pStyle w:val="Compact"/>
+              <w:spacing w:before="0" w:after="0" w:line="280" w:lineRule="exact"/>
+              <w:jc w:val="center"/>
+            </w:pPr>
+            <w:r>
+              <w:rPr>
+                <w:sz w:val="24"/>
+              </w:rPr>
+              <w:t>operisanalysiskit.com/oak-price</w:t>
+            </w:r>
+          </w:p>
+        </w:tc>
+        <w:tc>
+          <w:tcPr>
+            <w:tcW w:w="1178" w:type="dxa"/>
             <w:vAlign w:val="center"/>
           </w:tcPr>
           <w:p>
@@ -20722,45 +20748,45 @@
         </w:tc>
         <w:tc>
           <w:tcPr>
-            <w:tcW w:w="1205" w:type="dxa"/>
-            <w:vAlign w:val="center"/>
-          </w:tcPr>
-          <w:p>
-            <w:pPr>
-              <w:pStyle w:val="Compact"/>
-              <w:spacing w:before="0" w:after="0" w:line="280" w:lineRule="exact"/>
-              <w:jc w:val="center"/>
-            </w:pPr>
-            <w:r>
-              <w:rPr>
-                <w:sz w:val="24"/>
-              </w:rPr>
-              <w:t>нет</w:t>
-            </w:r>
-          </w:p>
-        </w:tc>
-        <w:tc>
-          <w:tcPr>
-            <w:tcW w:w="1419" w:type="dxa"/>
-            <w:vAlign w:val="center"/>
-          </w:tcPr>
-          <w:p>
-            <w:pPr>
-              <w:pStyle w:val="Compact"/>
-              <w:spacing w:before="0" w:after="0" w:line="280" w:lineRule="exact"/>
-              <w:jc w:val="center"/>
-            </w:pPr>
-            <w:r>
-              <w:rPr>
-                <w:sz w:val="24"/>
-              </w:rPr>
-              <w:t>1</w:t>
-            </w:r>
-          </w:p>
-        </w:tc>
-        <w:tc>
-          <w:tcPr>
-            <w:tcW w:w="991" w:type="dxa"/>
+            <w:tcW w:w="1178" w:type="dxa"/>
+            <w:vAlign w:val="center"/>
+          </w:tcPr>
+          <w:p>
+            <w:pPr>
+              <w:pStyle w:val="Compact"/>
+              <w:spacing w:before="0" w:after="0" w:line="280" w:lineRule="exact"/>
+              <w:jc w:val="center"/>
+            </w:pPr>
+            <w:r>
+              <w:rPr>
+                <w:sz w:val="24"/>
+              </w:rPr>
+              <w:t>да (30 дней по запросу)</w:t>
+            </w:r>
+          </w:p>
+        </w:tc>
+        <w:tc>
+          <w:tcPr>
+            <w:tcW w:w="1388" w:type="dxa"/>
+            <w:vAlign w:val="center"/>
+          </w:tcPr>
+          <w:p>
+            <w:pPr>
+              <w:pStyle w:val="Compact"/>
+              <w:spacing w:before="0" w:after="0" w:line="280" w:lineRule="exact"/>
+              <w:jc w:val="center"/>
+            </w:pPr>
+            <w:r>
+              <w:rPr>
+                <w:sz w:val="24"/>
+              </w:rPr>
+              <w:t>3</w:t>
+            </w:r>
+          </w:p>
+        </w:tc>
+        <w:tc>
+          <w:tcPr>
+            <w:tcW w:w="969" w:type="dxa"/>
             <w:vAlign w:val="center"/>
           </w:tcPr>
           <w:p>
@@ -20785,7 +20811,7 @@
         </w:trPr>
         <w:tc>
           <w:tcPr>
-            <w:tcW w:w="1312" w:type="dxa"/>
+            <w:tcW w:w="1283" w:type="dxa"/>
             <w:vAlign w:val="center"/>
           </w:tcPr>
           <w:p>
@@ -20805,7 +20831,7 @@
         </w:tc>
         <w:tc>
           <w:tcPr>
-            <w:tcW w:w="1526" w:type="dxa"/>
+            <w:tcW w:w="1492" w:type="dxa"/>
             <w:vAlign w:val="center"/>
           </w:tcPr>
           <w:p>
@@ -20824,7 +20850,7 @@
         </w:tc>
         <w:tc>
           <w:tcPr>
-            <w:tcW w:w="1696" w:type="dxa"/>
+            <w:tcW w:w="1866" w:type="dxa"/>
             <w:vAlign w:val="center"/>
           </w:tcPr>
           <w:p>
@@ -20843,7 +20869,7 @@
         </w:tc>
         <w:tc>
           <w:tcPr>
-            <w:tcW w:w="1205" w:type="dxa"/>
+            <w:tcW w:w="1178" w:type="dxa"/>
             <w:vAlign w:val="center"/>
           </w:tcPr>
           <w:p>
@@ -20862,7 +20888,7 @@
         </w:tc>
         <w:tc>
           <w:tcPr>
-            <w:tcW w:w="1205" w:type="dxa"/>
+            <w:tcW w:w="1178" w:type="dxa"/>
             <w:vAlign w:val="center"/>
           </w:tcPr>
           <w:p>
@@ -20894,7 +20920,7 @@
         </w:tc>
         <w:tc>
           <w:tcPr>
-            <w:tcW w:w="1419" w:type="dxa"/>
+            <w:tcW w:w="1388" w:type="dxa"/>
             <w:vAlign w:val="center"/>
           </w:tcPr>
           <w:p>
@@ -20913,7 +20939,7 @@
         </w:tc>
         <w:tc>
           <w:tcPr>
-            <w:tcW w:w="991" w:type="dxa"/>
+            <w:tcW w:w="969" w:type="dxa"/>
             <w:vAlign w:val="center"/>
           </w:tcPr>
           <w:p>
@@ -20938,7 +20964,7 @@
         </w:trPr>
         <w:tc>
           <w:tcPr>
-            <w:tcW w:w="1312" w:type="dxa"/>
+            <w:tcW w:w="1283" w:type="dxa"/>
             <w:vAlign w:val="center"/>
           </w:tcPr>
           <w:p>
@@ -20958,7 +20984,7 @@
         </w:tc>
         <w:tc>
           <w:tcPr>
-            <w:tcW w:w="1526" w:type="dxa"/>
+            <w:tcW w:w="1492" w:type="dxa"/>
             <w:vAlign w:val="center"/>
           </w:tcPr>
           <w:p>
@@ -20977,7 +21003,7 @@
         </w:tc>
         <w:tc>
           <w:tcPr>
-            <w:tcW w:w="1696" w:type="dxa"/>
+            <w:tcW w:w="1866" w:type="dxa"/>
             <w:vAlign w:val="center"/>
           </w:tcPr>
           <w:p>
@@ -20996,7 +21022,7 @@
         </w:tc>
         <w:tc>
           <w:tcPr>
-            <w:tcW w:w="1205" w:type="dxa"/>
+            <w:tcW w:w="1178" w:type="dxa"/>
             <w:vAlign w:val="center"/>
           </w:tcPr>
           <w:p>
@@ -21015,7 +21041,7 @@
         </w:tc>
         <w:tc>
           <w:tcPr>
-            <w:tcW w:w="1205" w:type="dxa"/>
+            <w:tcW w:w="1178" w:type="dxa"/>
             <w:vAlign w:val="center"/>
           </w:tcPr>
           <w:p>
@@ -21047,7 +21073,7 @@
         </w:tc>
         <w:tc>
           <w:tcPr>
-            <w:tcW w:w="1419" w:type="dxa"/>
+            <w:tcW w:w="1388" w:type="dxa"/>
             <w:vAlign w:val="center"/>
           </w:tcPr>
           <w:p>
@@ -21066,7 +21092,7 @@
         </w:tc>
         <w:tc>
           <w:tcPr>
-            <w:tcW w:w="991" w:type="dxa"/>
+            <w:tcW w:w="969" w:type="dxa"/>
             <w:vAlign w:val="center"/>
           </w:tcPr>
           <w:p>
@@ -21091,7 +21117,7 @@
         </w:trPr>
         <w:tc>
           <w:tcPr>
-            <w:tcW w:w="1312" w:type="dxa"/>
+            <w:tcW w:w="1283" w:type="dxa"/>
             <w:vAlign w:val="center"/>
           </w:tcPr>
           <w:p>
@@ -21111,7 +21137,7 @@
         </w:tc>
         <w:tc>
           <w:tcPr>
-            <w:tcW w:w="1526" w:type="dxa"/>
+            <w:tcW w:w="1492" w:type="dxa"/>
             <w:vAlign w:val="center"/>
           </w:tcPr>
           <w:p>
@@ -21130,7 +21156,7 @@
         </w:tc>
         <w:tc>
           <w:tcPr>
-            <w:tcW w:w="1696" w:type="dxa"/>
+            <w:tcW w:w="1866" w:type="dxa"/>
             <w:vAlign w:val="center"/>
           </w:tcPr>
           <w:p>
@@ -21149,7 +21175,7 @@
         </w:tc>
         <w:tc>
           <w:tcPr>
-            <w:tcW w:w="1205" w:type="dxa"/>
+            <w:tcW w:w="1178" w:type="dxa"/>
             <w:vAlign w:val="center"/>
           </w:tcPr>
           <w:p>
@@ -21168,7 +21194,7 @@
         </w:tc>
         <w:tc>
           <w:tcPr>
-            <w:tcW w:w="1205" w:type="dxa"/>
+            <w:tcW w:w="1178" w:type="dxa"/>
             <w:vAlign w:val="center"/>
           </w:tcPr>
           <w:p>
@@ -21187,7 +21213,7 @@
         </w:tc>
         <w:tc>
           <w:tcPr>
-            <w:tcW w:w="1419" w:type="dxa"/>
+            <w:tcW w:w="1388" w:type="dxa"/>
             <w:vAlign w:val="center"/>
           </w:tcPr>
           <w:p>
@@ -21206,7 +21232,7 @@
         </w:tc>
         <w:tc>
           <w:tcPr>
-            <w:tcW w:w="991" w:type="dxa"/>
+            <w:tcW w:w="969" w:type="dxa"/>
             <w:vAlign w:val="center"/>
           </w:tcPr>
           <w:p>
@@ -21231,7 +21257,7 @@
         </w:trPr>
         <w:tc>
           <w:tcPr>
-            <w:tcW w:w="1312" w:type="dxa"/>
+            <w:tcW w:w="1283" w:type="dxa"/>
             <w:vAlign w:val="center"/>
           </w:tcPr>
           <w:p>
@@ -21251,7 +21277,7 @@
         </w:tc>
         <w:tc>
           <w:tcPr>
-            <w:tcW w:w="1526" w:type="dxa"/>
+            <w:tcW w:w="1492" w:type="dxa"/>
             <w:vAlign w:val="center"/>
           </w:tcPr>
           <w:p>
@@ -21270,7 +21296,7 @@
         </w:tc>
         <w:tc>
           <w:tcPr>
-            <w:tcW w:w="1696" w:type="dxa"/>
+            <w:tcW w:w="1866" w:type="dxa"/>
             <w:vAlign w:val="center"/>
           </w:tcPr>
           <w:p>
@@ -21289,7 +21315,7 @@
         </w:tc>
         <w:tc>
           <w:tcPr>
-            <w:tcW w:w="1205" w:type="dxa"/>
+            <w:tcW w:w="1178" w:type="dxa"/>
             <w:vAlign w:val="center"/>
           </w:tcPr>
           <w:p>
@@ -21308,7 +21334,7 @@
         </w:tc>
         <w:tc>
           <w:tcPr>
-            <w:tcW w:w="1205" w:type="dxa"/>
+            <w:tcW w:w="1178" w:type="dxa"/>
             <w:vAlign w:val="center"/>
           </w:tcPr>
           <w:p>
@@ -21327,7 +21353,7 @@
         </w:tc>
         <w:tc>
           <w:tcPr>
-            <w:tcW w:w="1419" w:type="dxa"/>
+            <w:tcW w:w="1388" w:type="dxa"/>
             <w:vAlign w:val="center"/>
           </w:tcPr>
           <w:p>
@@ -21346,7 +21372,7 @@
         </w:tc>
         <w:tc>
           <w:tcPr>
-            <w:tcW w:w="991" w:type="dxa"/>
+            <w:tcW w:w="969" w:type="dxa"/>
             <w:vAlign w:val="center"/>
           </w:tcPr>
           <w:p>
@@ -21376,6 +21402,7 @@
         <w:rPr>
           <w:sz w:val="28"/>
         </w:rPr>
+        <w:lastRenderedPageBreak/>
         <w:t xml:space="preserve">Лестницу от бесплатного тарифа до корпоративного прозрачно показывают только </w:t>
       </w:r>
       <w:r>
@@ -21402,13 +21429,124 @@
         <w:rPr>
           <w:sz w:val="28"/>
         </w:rPr>
-        <w:t xml:space="preserve">; у специализированных игроков и платформ цена скрыта или по запросу. Прозрачная цена и бесплатный вход - </w:t>
-      </w:r>
-      <w:r>
-        <w:rPr>
-          <w:sz w:val="28"/>
-        </w:rPr>
-        <w:t>возможность дифференциации в нише проверки.</w:t>
+        <w:t>; у специализированных игроков показана единичная цена (</w:t>
+      </w:r>
+      <w:r>
+        <w:rPr>
+          <w:i/>
+          <w:sz w:val="28"/>
+        </w:rPr>
+        <w:t>Arixcel</w:t>
+      </w:r>
+      <w:r>
+        <w:rPr>
+          <w:sz w:val="28"/>
+        </w:rPr>
+        <w:t xml:space="preserve"> 2,75 </w:t>
+      </w:r>
+      <w:r>
+        <w:rPr>
+          <w:i/>
+          <w:sz w:val="28"/>
+        </w:rPr>
+        <w:t>GBP</w:t>
+      </w:r>
+      <w:r>
+        <w:rPr>
+          <w:sz w:val="28"/>
+        </w:rPr>
+        <w:t xml:space="preserve"> за пользователя в месяц, </w:t>
+      </w:r>
+      <w:r>
+        <w:rPr>
+          <w:i/>
+          <w:sz w:val="28"/>
+        </w:rPr>
+        <w:t>Operis</w:t>
+      </w:r>
+      <w:r>
+        <w:rPr>
+          <w:sz w:val="28"/>
+        </w:rPr>
+        <w:t xml:space="preserve"> </w:t>
+      </w:r>
+      <w:r>
+        <w:rPr>
+          <w:i/>
+          <w:sz w:val="28"/>
+        </w:rPr>
+        <w:t>OAK</w:t>
+      </w:r>
+      <w:r>
+        <w:rPr>
+          <w:sz w:val="28"/>
+        </w:rPr>
+        <w:t xml:space="preserve"> 311,66 </w:t>
+      </w:r>
+      <w:r>
+        <w:rPr>
+          <w:i/>
+          <w:sz w:val="28"/>
+        </w:rPr>
+        <w:t>GBP</w:t>
+      </w:r>
+      <w:r>
+        <w:rPr>
+          <w:sz w:val="28"/>
+        </w:rPr>
+        <w:t xml:space="preserve"> в год, </w:t>
+      </w:r>
+      <w:r>
+        <w:rPr>
+          <w:i/>
+          <w:sz w:val="28"/>
+        </w:rPr>
+        <w:t>PerfectXL</w:t>
+      </w:r>
+      <w:r>
+        <w:rPr>
+          <w:sz w:val="28"/>
+        </w:rPr>
+        <w:t xml:space="preserve"> от 69 </w:t>
+      </w:r>
+      <w:r>
+        <w:rPr>
+          <w:i/>
+          <w:sz w:val="28"/>
+        </w:rPr>
+        <w:t>EUR</w:t>
+      </w:r>
+      <w:r>
+        <w:rPr>
+          <w:sz w:val="28"/>
+        </w:rPr>
+        <w:t>) без лестницы и бесплатного входа, а у платформ (</w:t>
+      </w:r>
+      <w:r>
+        <w:rPr>
+          <w:i/>
+          <w:sz w:val="28"/>
+        </w:rPr>
+        <w:t>DataSnipper</w:t>
+      </w:r>
+      <w:r>
+        <w:rPr>
+          <w:sz w:val="28"/>
+        </w:rPr>
+        <w:t xml:space="preserve">, </w:t>
+      </w:r>
+      <w:r>
+        <w:rPr>
+          <w:i/>
+          <w:sz w:val="28"/>
+        </w:rPr>
+        <w:t>Datarails</w:t>
+      </w:r>
+      <w:r>
+        <w:rPr>
+          <w:sz w:val="28"/>
+        </w:rPr>
+        <w:t>) цена только по запросу. Прозрачная цена и бесплатный вход - возможность дифференциации в нише проверки.</w:t>
       </w:r>
     </w:p>
     <w:p>
@@ -21422,7 +21560,13 @@
         <w:rPr>
           <w:sz w:val="28"/>
         </w:rPr>
-        <w:t>В таблице 15 представлено: каналы и воронка конкурентов.</w:t>
+        <w:t>В та</w:t>
+      </w:r>
+      <w:r>
+        <w:rPr>
+          <w:sz w:val="28"/>
+        </w:rPr>
+        <w:t>блице 15 представлено: каналы и воронка конкурентов.</w:t>
       </w:r>
     </w:p>
     <w:p>
@@ -22203,7 +22347,6 @@
                 <w:i/>
                 <w:sz w:val="24"/>
               </w:rPr>
-              <w:lastRenderedPageBreak/>
               <w:t>Numerous.ai</w:t>
             </w:r>
           </w:p>
@@ -22678,7 +22821,13 @@
         <w:rPr>
           <w:sz w:val="28"/>
         </w:rPr>
-        <w:t xml:space="preserve"> должна сочетать быстрый бесплатный вход и элементы доверия.</w:t>
+        <w:t xml:space="preserve"> должна сочетать быстрый бесплатный вход и элементы д</w:t>
+      </w:r>
+      <w:r>
+        <w:rPr>
+          <w:sz w:val="28"/>
+        </w:rPr>
+        <w:t>оверия.</w:t>
       </w:r>
     </w:p>
     <w:p>
@@ -22795,14 +22944,7 @@
                 <w:b/>
                 <w:sz w:val="24"/>
               </w:rPr>
-              <w:t>Тех</w:t>
-            </w:r>
-            <w:r>
-              <w:rPr>
-                <w:b/>
-                <w:sz w:val="24"/>
-              </w:rPr>
-              <w:t>нологии</w:t>
+              <w:t>Технологии</w:t>
             </w:r>
           </w:p>
         </w:tc>
@@ -23285,6 +23427,7 @@
                 <w:i/>
                 <w:sz w:val="24"/>
               </w:rPr>
+              <w:lastRenderedPageBreak/>
               <w:t>Shortcut</w:t>
             </w:r>
           </w:p>
@@ -23919,7 +24062,6 @@
         <w:rPr>
           <w:sz w:val="28"/>
         </w:rPr>
-        <w:lastRenderedPageBreak/>
         <w:t>В таблице 17 представлено: индекс силы бизнес-модели.</w:t>
       </w:r>
     </w:p>
@@ -24906,8 +25048,9 @@
           <w:noProof/>
           <w:sz w:val="28"/>
         </w:rPr>
+        <w:lastRenderedPageBreak/>
         <w:drawing>
-          <wp:inline distT="0" distB="0" distL="0" distR="0" wp14:anchorId="112CC5F9" wp14:editId="7DB3966E">
+          <wp:inline distT="0" distB="0" distL="0" distR="0" wp14:anchorId="46AB03BF" wp14:editId="29BBA38F">
             <wp:extent cx="5334000" cy="2471853"/>
             <wp:effectExtent l="0" t="0" r="0" b="0"/>
             <wp:docPr id="27" name="Picture"/>
@@ -25560,7 +25703,6 @@
               <w:rPr>
                 <w:sz w:val="24"/>
               </w:rPr>
-              <w:lastRenderedPageBreak/>
               <w:t>Запрос демо / консультация как основной вход</w:t>
             </w:r>
           </w:p>
@@ -26476,6 +26618,7 @@
         <w:rPr>
           <w:sz w:val="28"/>
         </w:rPr>
+        <w:lastRenderedPageBreak/>
         <w:t xml:space="preserve">Рыночными стандартами по порогу 70 % являются надстройка </w:t>
       </w:r>
       <w:r>
@@ -26518,7 +26661,7 @@
         <w:ind w:firstLine="709"/>
       </w:pPr>
       <w:bookmarkStart w:id="20" w:name="_79cbfa74df5b3f3beef1cd24c3ad9f089a58d7a"/>
-      <w:bookmarkStart w:id="21" w:name="_Toc241936249"/>
+      <w:bookmarkStart w:id="21" w:name="_Toc241936452"/>
       <w:bookmarkEnd w:id="18"/>
       <w:r>
         <w:rPr>
@@ -26853,7 +26996,13 @@
               <w:rPr>
                 <w:sz w:val="24"/>
               </w:rPr>
-              <w:t>), бесплатный тариф и пробный аудит</w:t>
+              <w:t xml:space="preserve">), бесплатный тариф и </w:t>
+            </w:r>
+            <w:r>
+              <w:rPr>
+                <w:sz w:val="24"/>
+              </w:rPr>
+              <w:t>пробный аудит</w:t>
             </w:r>
           </w:p>
         </w:tc>
@@ -26960,7 +27109,6 @@
               <w:rPr>
                 <w:sz w:val="24"/>
               </w:rPr>
-              <w:lastRenderedPageBreak/>
               <w:t>Зоны дифференциации</w:t>
             </w:r>
           </w:p>
@@ -27029,7 +27177,13 @@
         <w:rPr>
           <w:sz w:val="28"/>
         </w:rPr>
-        <w:t>Минимальный товар включает признаки стандарта и обязательных разрывов, а ставка делается на доказательность вывода и прозрачность цены. Эти группы переходят в ЛР6 как вход для ценностного предложения и требований к первому релизу.</w:t>
+        <w:t>Минимальный товар включает признаки стандарта и обязательных разрывов, а ставка дел</w:t>
+      </w:r>
+      <w:r>
+        <w:rPr>
+          <w:sz w:val="28"/>
+        </w:rPr>
+        <w:t>ается на доказательность вывода и прозрачность цены. Эти группы переходят в ЛР6 как вход для ценностного предложения и требований к первому релизу.</w:t>
       </w:r>
     </w:p>
     <w:p>
@@ -27043,13 +27197,7 @@
         <w:rPr>
           <w:sz w:val="28"/>
         </w:rPr>
-        <w:t>В таблице 20 представлено</w:t>
-      </w:r>
-      <w:r>
-        <w:rPr>
-          <w:sz w:val="28"/>
-        </w:rPr>
-        <w:t xml:space="preserve">: гипотезы бизнес-модели </w:t>
+        <w:t xml:space="preserve">В таблице 20 представлено: гипотезы бизнес-модели </w:t>
       </w:r>
       <w:r>
         <w:rPr>
@@ -27075,7 +27223,13 @@
         <w:rPr>
           <w:sz w:val="28"/>
         </w:rPr>
-        <w:t xml:space="preserve">Таблица 20 – Гипотезы бизнес-модели </w:t>
+        <w:t>Таблица 20 – Гипотезы бизнес-м</w:t>
+      </w:r>
+      <w:r>
+        <w:rPr>
+          <w:sz w:val="28"/>
+        </w:rPr>
+        <w:t xml:space="preserve">одели </w:t>
       </w:r>
       <w:r>
         <w:rPr>
@@ -27263,6 +27417,7 @@
               <w:rPr>
                 <w:sz w:val="24"/>
               </w:rPr>
+              <w:lastRenderedPageBreak/>
               <w:t>Ценностное предложение</w:t>
             </w:r>
           </w:p>
@@ -27460,13 +27615,7 @@
               <w:rPr>
                 <w:sz w:val="24"/>
               </w:rPr>
-              <w:t>станда</w:t>
-            </w:r>
-            <w:r>
-              <w:rPr>
-                <w:sz w:val="24"/>
-              </w:rPr>
-              <w:t>рты: пробный доступ и документация</w:t>
+              <w:t>стандарты: пробный доступ и документация</w:t>
             </w:r>
           </w:p>
         </w:tc>
@@ -27517,7 +27666,13 @@
               <w:rPr>
                 <w:sz w:val="24"/>
               </w:rPr>
-              <w:t>, разовый аудит 9 </w:t>
+              <w:t xml:space="preserve">, разовый </w:t>
+            </w:r>
+            <w:r>
+              <w:rPr>
+                <w:sz w:val="24"/>
+              </w:rPr>
+              <w:t>аудит 9 </w:t>
             </w:r>
             <w:r>
               <w:rPr>
@@ -27684,13 +27839,7 @@
               <w:rPr>
                 <w:sz w:val="24"/>
               </w:rPr>
-              <w:t>барьер: доверие и данные; б</w:t>
-            </w:r>
-            <w:r>
-              <w:rPr>
-                <w:sz w:val="24"/>
-              </w:rPr>
-              <w:t>езопасность - обязательный разрыв</w:t>
+              <w:t>барьер: доверие и данные; безопасность - обязательный разрыв</w:t>
             </w:r>
           </w:p>
         </w:tc>
@@ -27997,14 +28146,13 @@
         <w:ind w:firstLine="709"/>
       </w:pPr>
       <w:bookmarkStart w:id="22" w:name="_339ae803435bd6b9a653c2b18dadc62dc9ad8e7"/>
-      <w:bookmarkStart w:id="23" w:name="_Toc241936250"/>
+      <w:bookmarkStart w:id="23" w:name="_Toc241936453"/>
       <w:bookmarkEnd w:id="20"/>
       <w:r>
         <w:rPr>
           <w:b/>
           <w:sz w:val="28"/>
         </w:rPr>
-        <w:lastRenderedPageBreak/>
         <w:t>2.10 Проверка расчетов и ограничения</w:t>
       </w:r>
       <w:bookmarkEnd w:id="23"/>
@@ -28131,13 +28279,13 @@
         <w:rPr>
           <w:sz w:val="28"/>
         </w:rPr>
-        <w:t xml:space="preserve"> найдены уже после расчета баллов,</w:t>
-      </w:r>
-      <w:r>
-        <w:rPr>
-          <w:sz w:val="28"/>
-        </w:rPr>
-        <w:t xml:space="preserve"> приложение Д); отзывы собраны на </w:t>
+        <w:t xml:space="preserve"> найдены в конце работы и внесены </w:t>
+      </w:r>
+      <w:r>
+        <w:rPr>
+          <w:sz w:val="28"/>
+        </w:rPr>
+        <w:t xml:space="preserve">в книгу бизнес-моделей, приложение Д); отзывы собраны на </w:t>
       </w:r>
       <w:r>
         <w:rPr>
@@ -28187,7 +28335,7 @@
         <w:ind w:firstLine="709"/>
       </w:pPr>
       <w:bookmarkStart w:id="24" w:name="_1bfdad9d2d88ddb6ca16c31c1d4d4943679f32f"/>
-      <w:bookmarkStart w:id="25" w:name="_Toc241936251"/>
+      <w:bookmarkStart w:id="25" w:name="_Toc241936454"/>
       <w:bookmarkEnd w:id="22"/>
       <w:bookmarkEnd w:id="2"/>
       <w:r>
@@ -28196,14 +28344,7 @@
           <w:sz w:val="28"/>
         </w:rPr>
         <w:lastRenderedPageBreak/>
-        <w:t>3 ОТВЕТЫ НА КОНТРОЛЬНЫ</w:t>
-      </w:r>
-      <w:r>
-        <w:rPr>
-          <w:b/>
-          <w:sz w:val="28"/>
-        </w:rPr>
-        <w:t>Е ВОПРОСЫ</w:t>
+        <w:t>3 ОТВЕТЫ НА КОНТРОЛЬНЫЕ ВОПРОСЫ</w:t>
       </w:r>
       <w:bookmarkEnd w:id="25"/>
     </w:p>
@@ -28218,7 +28359,13 @@
         <w:rPr>
           <w:sz w:val="28"/>
         </w:rPr>
-        <w:t>Ответы даны по контрольным показателям дашборда шаблона анализа товара [2] (раздел «Норма контроля») и по чек-листам методик [1], [3].</w:t>
+        <w:t>Ответы даны по контрольным показателям дашборда шаблона а</w:t>
+      </w:r>
+      <w:r>
+        <w:rPr>
+          <w:sz w:val="28"/>
+        </w:rPr>
+        <w:t>нализа товара [2] (раздел «Норма контроля») и по чек-листам методик [1], [3].</w:t>
       </w:r>
     </w:p>
     <w:p>
@@ -28236,13 +28383,7 @@
         <w:rPr>
           <w:sz w:val="28"/>
         </w:rPr>
-        <w:t>Сколько конкурентов в анализе и достаточно ли их (норма 5-12)? Семь конкурентов для товара и бизнес-модели и де</w:t>
-      </w:r>
-      <w:r>
-        <w:rPr>
-          <w:sz w:val="28"/>
-        </w:rPr>
-        <w:t>сять компаний для классификации; норма выполнена.</w:t>
+        <w:t>Сколько конкурентов в анализе и достаточно ли их (норма 5-12)? Семь конкурентов для товара и бизнес-модели и десять компаний для классификации; норма выполнена.</w:t>
       </w:r>
     </w:p>
     <w:p>
@@ -28260,7 +28401,13 @@
         <w:rPr>
           <w:sz w:val="28"/>
         </w:rPr>
-        <w:t>Сколько страниц проверено (норма 30 и более)? 16 страниц; норма не выполнена, недостающие страницы указаны в приложении Б.</w:t>
+        <w:t>Сколько страниц п</w:t>
+      </w:r>
+      <w:r>
+        <w:rPr>
+          <w:sz w:val="28"/>
+        </w:rPr>
+        <w:t>роверено (норма 30 и более)? 16 страниц; норма не выполнена, недостающие страницы указаны в приложении Б.</w:t>
       </w:r>
     </w:p>
     <w:p>
@@ -28278,13 +28425,7 @@
         <w:rPr>
           <w:sz w:val="28"/>
         </w:rPr>
-        <w:t>Сколько признаков по Левитту выделено (норма 40 и более)? 59 признаков; норма выпол</w:t>
-      </w:r>
-      <w:r>
-        <w:rPr>
-          <w:sz w:val="28"/>
-        </w:rPr>
-        <w:t>нена.</w:t>
+        <w:t>Сколько признаков по Левитту выделено (норма 40 и более)? 59 признаков; норма выполнена.</w:t>
       </w:r>
     </w:p>
     <w:p>
@@ -28302,7 +28443,13 @@
         <w:rPr>
           <w:sz w:val="28"/>
         </w:rPr>
-        <w:t>Сколько требований по Кано выделено (норма 25 и более)? 16 требований; норма не выполнена, список может быть расширен после опроса.</w:t>
+        <w:t>Сколько требований по Кано выделено (норма 25 и более)? 16 тр</w:t>
+      </w:r>
+      <w:r>
+        <w:rPr>
+          <w:sz w:val="28"/>
+        </w:rPr>
+        <w:t>ебований; норма не выполнена, список может быть расширен после опроса.</w:t>
       </w:r>
     </w:p>
     <w:p>
@@ -28338,13 +28485,7 @@
         <w:rPr>
           <w:sz w:val="28"/>
         </w:rPr>
-        <w:t xml:space="preserve">Есть ли у каждого вывода страница и факт? </w:t>
-      </w:r>
-      <w:r>
-        <w:rPr>
-          <w:sz w:val="28"/>
-        </w:rPr>
-        <w:t>Да, таблица 5; достоверность 3-5.</w:t>
+        <w:t>Есть ли у каждого вывода страница и факт? Да, таблица 5; достоверность 3-5.</w:t>
       </w:r>
     </w:p>
     <w:p>
@@ -28362,7 +28503,13 @@
         <w:rPr>
           <w:sz w:val="28"/>
         </w:rPr>
-        <w:t>Классифицированы ли компании по уровням конкуренции с ограничителями? Да, таблицы 3 и 4.</w:t>
+        <w:t>Классифицированы ли компании по у</w:t>
+      </w:r>
+      <w:r>
+        <w:rPr>
+          <w:sz w:val="28"/>
+        </w:rPr>
+        <w:t>ровням конкуренции с ограничителями? Да, таблицы 3 и 4.</w:t>
       </w:r>
     </w:p>
     <w:p>
@@ -28409,7 +28556,7 @@
         <w:jc w:val="center"/>
       </w:pPr>
       <w:bookmarkStart w:id="26" w:name="_выводы"/>
-      <w:bookmarkStart w:id="27" w:name="_Toc241936252"/>
+      <w:bookmarkStart w:id="27" w:name="_Toc241936455"/>
       <w:bookmarkEnd w:id="24"/>
       <w:r>
         <w:rPr>
@@ -28432,13 +28579,13 @@
         <w:rPr>
           <w:sz w:val="28"/>
         </w:rPr>
-        <w:t>Классификация по уровням конкуренции показала отсутствие строго прямых конкурентов: бл</w:t>
-      </w:r>
-      <w:r>
-        <w:rPr>
-          <w:sz w:val="28"/>
-        </w:rPr>
-        <w:t xml:space="preserve">иже всех </w:t>
+        <w:t>Классификация по уровням конку</w:t>
+      </w:r>
+      <w:r>
+        <w:rPr>
+          <w:sz w:val="28"/>
+        </w:rPr>
+        <w:t xml:space="preserve">ренции показала отсутствие строго прямых конкурентов: ближе всех </w:t>
       </w:r>
       <w:r>
         <w:rPr>
@@ -28503,7 +28650,13 @@
         <w:rPr>
           <w:sz w:val="28"/>
         </w:rPr>
-        <w:t xml:space="preserve"> относятся к близким альтернативным, остальные шесть - к косвенным и заменителям. Рыночный стандарт цифрового товара минимален: надстройка </w:t>
+        <w:t xml:space="preserve"> относятся к близким альтернативным, остальные шесть - к косвенным и заменителям. Рыночный стандарт цифрового товара минимален: н</w:t>
+      </w:r>
+      <w:r>
+        <w:rPr>
+          <w:sz w:val="28"/>
+        </w:rPr>
+        <w:t xml:space="preserve">адстройка </w:t>
       </w:r>
       <w:r>
         <w:rPr>
@@ -28516,13 +28669,7 @@
         <w:rPr>
           <w:sz w:val="28"/>
         </w:rPr>
-        <w:t xml:space="preserve"> (100 %); обязательные признаки поиска ош</w:t>
-      </w:r>
-      <w:r>
-        <w:rPr>
-          <w:sz w:val="28"/>
-        </w:rPr>
-        <w:t>ибок, безопасности и пробного доступа есть лишь у трех из семи конкурентов.</w:t>
+        <w:t xml:space="preserve"> (100 %); обязательные признаки поиска ошибок, безопасности и пробного доступа есть лишь у трех из семи конкурентов.</w:t>
       </w:r>
     </w:p>
     <w:p>
@@ -28536,13 +28683,13 @@
         <w:rPr>
           <w:sz w:val="28"/>
         </w:rPr>
-        <w:t>Зонами дифференциации являются доказательство вывода детерминированным движком (2 из 7), автоисправление (1 из 7), прозрачные тарифы (2 из 7) и сравнение файлов. Сильнейшие бизнес-</w:t>
-      </w:r>
-      <w:r>
-        <w:rPr>
-          <w:sz w:val="28"/>
-        </w:rPr>
-        <w:t xml:space="preserve">модели у </w:t>
+        <w:t>Зонами дифференциации являются доказательство вывода детерминированным движком (2 из 7), автоисправление (1 из 7), прозрачны</w:t>
+      </w:r>
+      <w:r>
+        <w:rPr>
+          <w:sz w:val="28"/>
+        </w:rPr>
+        <w:t xml:space="preserve">е тарифы (2 из 7) и сравнение файлов. Сильнейшие бизнес-модели у </w:t>
       </w:r>
       <w:r>
         <w:rPr>
@@ -28634,13 +28781,13 @@
         <w:rPr>
           <w:sz w:val="28"/>
         </w:rPr>
-        <w:t xml:space="preserve"> это означает следующее: минимальный товар должен закрыть стандарт и обязательные разрывы (надстройка и веб, поиск</w:t>
-      </w:r>
-      <w:r>
-        <w:rPr>
-          <w:sz w:val="28"/>
-        </w:rPr>
-        <w:t xml:space="preserve"> ошибок, </w:t>
+        <w:t xml:space="preserve"> это означает следующее: минимальный товар должен закрыть </w:t>
+      </w:r>
+      <w:r>
+        <w:rPr>
+          <w:sz w:val="28"/>
+        </w:rPr>
+        <w:t xml:space="preserve">стандарт и обязательные разрывы (надстройка и веб, поиск ошибок, </w:t>
       </w:r>
       <w:r>
         <w:rPr>
@@ -28653,7 +28800,13 @@
         <w:rPr>
           <w:sz w:val="28"/>
         </w:rPr>
-        <w:t>, бесплатный старт), а позиционирование строится на независимом доказательстве находок и прозрачной цене. Эти выводы передаются в ЛР6 как банк выводов, стандарт товара и зоны дифференциации.</w:t>
+        <w:t>, бесплатный старт), а позиционирование строится на независимом доказательстве находок и прозрачной цене. Эти выводы передаются в ЛР6 как банк выводов, стандарт товара и зоны дифференциац</w:t>
+      </w:r>
+      <w:r>
+        <w:rPr>
+          <w:sz w:val="28"/>
+        </w:rPr>
+        <w:t>ии.</w:t>
       </w:r>
     </w:p>
     <w:p>
@@ -28664,7 +28817,7 @@
         <w:jc w:val="center"/>
       </w:pPr>
       <w:bookmarkStart w:id="28" w:name="_274f6a444530ef90b0479dabf3d210f01e97699"/>
-      <w:bookmarkStart w:id="29" w:name="_Toc241936253"/>
+      <w:bookmarkStart w:id="29" w:name="_Toc241936456"/>
       <w:bookmarkEnd w:id="26"/>
       <w:r>
         <w:rPr>
@@ -28722,13 +28875,7 @@
         <w:rPr>
           <w:sz w:val="28"/>
         </w:rPr>
-        <w:t>Методика анализа конкурентов по сайтам: цифровой товар (модели Леви</w:t>
-      </w:r>
-      <w:r>
-        <w:rPr>
-          <w:sz w:val="28"/>
-        </w:rPr>
-        <w:t xml:space="preserve">тта и Кано); шаблон </w:t>
+        <w:t xml:space="preserve">Методика анализа конкурентов по сайтам: цифровой товар (модели Левитта и Кано); шаблон </w:t>
       </w:r>
       <w:r>
         <w:rPr>
@@ -28741,7 +28888,13 @@
         <w:rPr>
           <w:sz w:val="28"/>
         </w:rPr>
-        <w:t xml:space="preserve"> анализа конкурентов. Методические материалы дисциплины «Электронный бизнес». – Минск : БГУИР, 2026.</w:t>
+        <w:t xml:space="preserve"> анализа конкурентов. Методические материал</w:t>
+      </w:r>
+      <w:r>
+        <w:rPr>
+          <w:sz w:val="28"/>
+        </w:rPr>
+        <w:t>ы дисциплины «Электронный бизнес». – Минск : БГУИР, 2026.</w:t>
       </w:r>
     </w:p>
     <w:p>
@@ -28772,13 +28925,7 @@
         <w:rPr>
           <w:sz w:val="28"/>
         </w:rPr>
-        <w:t xml:space="preserve"> анализа бизнес-модели. Методические материалы дисциплины «Элект</w:t>
-      </w:r>
-      <w:r>
-        <w:rPr>
-          <w:sz w:val="28"/>
-        </w:rPr>
-        <w:t>ронный бизнес». – Минск : БГУИР, 2026.</w:t>
+        <w:t xml:space="preserve"> анализа бизнес-модели. Методические материалы дисциплины «Электронный бизнес». – Минск : БГУИР, 2026.</w:t>
       </w:r>
     </w:p>
     <w:p>
@@ -28796,7 +28943,13 @@
         <w:rPr>
           <w:sz w:val="28"/>
         </w:rPr>
-        <w:t>Земляник, Р. В. Отчеты по лабораторным работам № 1, № 2–3 и № 4 по дисциплине «Электронный бизнес» / Р. В. Земляник. – Минск : БГУИР, 2026.</w:t>
+        <w:t>Земляник, Р. В. Отчеты по лаб</w:t>
+      </w:r>
+      <w:r>
+        <w:rPr>
+          <w:sz w:val="28"/>
+        </w:rPr>
+        <w:t>ораторным работам № 1, № 2–3 и № 4 по дисциплине «Электронный бизнес» / Р. В. Земляник. – Минск : БГУИР, 2026.</w:t>
       </w:r>
     </w:p>
     <w:p>
@@ -28840,13 +28993,7 @@
         <w:rPr>
           <w:sz w:val="28"/>
         </w:rPr>
-        <w:t xml:space="preserve">, сетевой график и диаграмма </w:t>
-      </w:r>
-      <w:r>
-        <w:rPr>
-          <w:sz w:val="28"/>
-        </w:rPr>
-        <w:t xml:space="preserve">Ганта </w:t>
+        <w:t xml:space="preserve">, сетевой график и диаграмма Ганта </w:t>
       </w:r>
       <w:r>
         <w:rPr>
@@ -28859,7 +29006,13 @@
         <w:rPr>
           <w:sz w:val="28"/>
         </w:rPr>
-        <w:t>: отчеты по практическим занятиям по дисциплине «Управление проектами» / Р. В. Земляник. – Минск : БГУИР, 2026.</w:t>
+        <w:t>: отчеты по практическим занятиям по дисциплине «Упра</w:t>
+      </w:r>
+      <w:r>
+        <w:rPr>
+          <w:sz w:val="28"/>
+        </w:rPr>
+        <w:t>вление проектами» / Р. В. Земляник. – Минск : БГУИР, 2026.</w:t>
       </w:r>
     </w:p>
     <w:p>
@@ -28909,13 +29062,7 @@
         <w:rPr>
           <w:sz w:val="28"/>
         </w:rPr>
-        <w:t xml:space="preserve"> [Электронный ре</w:t>
-      </w:r>
-      <w:r>
-        <w:rPr>
-          <w:sz w:val="28"/>
-        </w:rPr>
-        <w:t>сурс]. – Режим доступа: https://www.shortcut.ai/. – Дата доступа: 03.10.2026.</w:t>
+        <w:t xml:space="preserve"> [Электронный ресурс]. – Режим доступа: https://www.shortcut.ai/. – Дата доступа: 03.10.2026.</w:t>
       </w:r>
     </w:p>
     <w:p>
@@ -28965,13 +29112,13 @@
         <w:rPr>
           <w:sz w:val="28"/>
         </w:rPr>
-        <w:t xml:space="preserve"> [Электронный ресурс]. – Режим доступа: https://datarails.com/. </w:t>
-      </w:r>
-      <w:r>
-        <w:rPr>
-          <w:sz w:val="28"/>
-        </w:rPr>
-        <w:t>– Дата доступа: 03.10.2026.</w:t>
+        <w:t xml:space="preserve"> [Электронный ресурс]. – Режим доступа: https://</w:t>
+      </w:r>
+      <w:r>
+        <w:rPr>
+          <w:sz w:val="28"/>
+        </w:rPr>
+        <w:t>datarails.com/. – Дата доступа: 03.10.2026.</w:t>
       </w:r>
     </w:p>
     <w:p>
@@ -29034,13 +29181,13 @@
         <w:rPr>
           <w:sz w:val="28"/>
         </w:rPr>
-        <w:t xml:space="preserve"> [Электронный ресурс]. – Режим доступа: https://www.arixcel.com/, https://www.operis.com/. – Дата доступ</w:t>
-      </w:r>
-      <w:r>
-        <w:rPr>
-          <w:sz w:val="28"/>
-        </w:rPr>
-        <w:t>а: 03.10.2026.</w:t>
+        <w:t xml:space="preserve"> [Электронный ресурс]. – Режим доступа: https://www.arixcel.com/, https://www.operis.com</w:t>
+      </w:r>
+      <w:r>
+        <w:rPr>
+          <w:sz w:val="28"/>
+        </w:rPr>
+        <w:t>/. – Дата доступа: 03.10.2026.</w:t>
       </w:r>
     </w:p>
     <w:p>
@@ -29194,7 +29341,13 @@
         <w:rPr>
           <w:sz w:val="28"/>
         </w:rPr>
-        <w:t xml:space="preserve"> [Электронный ресурс]. – Режим доступа: https://appsource.microsoft.com/. – Дата доступа: 03.10.2026.</w:t>
+        <w:t xml:space="preserve"> [Электронный ресурс]. – Режим доступа: https://apps</w:t>
+      </w:r>
+      <w:r>
+        <w:rPr>
+          <w:sz w:val="28"/>
+        </w:rPr>
+        <w:t>ource.microsoft.com/. – Дата доступа: 03.10.2026.</w:t>
       </w:r>
     </w:p>
     <w:p>
@@ -29447,14 +29600,7 @@
           <w:i/>
           <w:sz w:val="28"/>
         </w:rPr>
-        <w:t>Q</w:t>
-      </w:r>
-      <w:r>
-        <w:rPr>
-          <w:i/>
-          <w:sz w:val="28"/>
-        </w:rPr>
-        <w:t>uality</w:t>
+        <w:t>Quality</w:t>
       </w:r>
       <w:r>
         <w:rPr>
@@ -29965,7 +30111,13 @@
         <w:rPr>
           <w:sz w:val="28"/>
         </w:rPr>
-        <w:t xml:space="preserve"> $100</w:t>
+        <w:t xml:space="preserve"> $1</w:t>
+      </w:r>
+      <w:r>
+        <w:rPr>
+          <w:sz w:val="28"/>
+        </w:rPr>
+        <w:t>00</w:t>
       </w:r>
       <w:r>
         <w:rPr>
@@ -30107,13 +30259,7 @@
         <w:rPr>
           <w:sz w:val="28"/>
         </w:rPr>
-        <w:t xml:space="preserve"> $</w:t>
-      </w:r>
-      <w:r>
-        <w:rPr>
-          <w:sz w:val="28"/>
-        </w:rPr>
-        <w:t xml:space="preserve">70 </w:t>
+        <w:t xml:space="preserve"> $70 </w:t>
       </w:r>
       <w:r>
         <w:rPr>
@@ -30398,7 +30544,13 @@
         <w:rPr>
           <w:sz w:val="28"/>
         </w:rPr>
-        <w:t xml:space="preserve"> [Электронный ресурс]. – Режим доступа: https://techcrunch.com/2025/08/01/fundamental-research-labs-nabs-30-million-from-prosus-to-build-ai-agents-for-multiple-verticals. – Дата доступа: 03.10.2026.</w:t>
+        <w:t xml:space="preserve"> [Электронный ресурс]. – Ре</w:t>
+      </w:r>
+      <w:r>
+        <w:rPr>
+          <w:sz w:val="28"/>
+        </w:rPr>
+        <w:t>жим доступа: https://techcrunch.com/2025/08/01/fundamental-research-labs-nabs-30-million-from-prosus-to-build-ai-agents-for-multiple-verticals. – Дата доступа: 03.10.2026.</w:t>
       </w:r>
     </w:p>
     <w:p>
@@ -30449,13 +30601,13 @@
         <w:rPr>
           <w:sz w:val="28"/>
         </w:rPr>
-        <w:t xml:space="preserve"> [Э</w:t>
-      </w:r>
-      <w:r>
-        <w:rPr>
-          <w:sz w:val="28"/>
-        </w:rPr>
-        <w:t>лектронный ресурс]. – Режим доступа: https://www.perfectxl.com/about-us/history/. – Дата доступа: 03.10.2026.</w:t>
+        <w:t xml:space="preserve"> [Электронный ресурс]. – Режим доступа: https://www.perfect</w:t>
+      </w:r>
+      <w:r>
+        <w:rPr>
+          <w:sz w:val="28"/>
+        </w:rPr>
+        <w:t>xl.com/about-us/history/. – Дата доступа: 03.10.2026.</w:t>
       </w:r>
     </w:p>
     <w:p>
@@ -30467,7 +30619,7 @@
         <w:jc w:val="center"/>
       </w:pPr>
       <w:bookmarkStart w:id="30" w:name="_3d74faf1500c1b2a4a8bfa8e0e37c74206ce73d"/>
-      <w:bookmarkStart w:id="31" w:name="_Toc241936254"/>
+      <w:bookmarkStart w:id="31" w:name="_Toc241936457"/>
       <w:bookmarkEnd w:id="28"/>
       <w:r>
         <w:rPr>
@@ -31208,7 +31360,7 @@
         <w:jc w:val="center"/>
       </w:pPr>
       <w:bookmarkStart w:id="32" w:name="_d684f183eb868ee4ace295916bed2e6be64d16e"/>
-      <w:bookmarkStart w:id="33" w:name="_Toc241936255"/>
+      <w:bookmarkStart w:id="33" w:name="_Toc241936458"/>
       <w:bookmarkEnd w:id="30"/>
       <w:r>
         <w:rPr>
@@ -31616,14 +31768,7 @@
                 <w:i/>
                 <w:sz w:val="24"/>
               </w:rPr>
-              <w:t>DataSnip</w:t>
-            </w:r>
-            <w:r>
-              <w:rPr>
-                <w:i/>
-                <w:sz w:val="24"/>
-              </w:rPr>
-              <w:t>per</w:t>
+              <w:t>DataSnipper</w:t>
             </w:r>
             <w:r>
               <w:rPr>
@@ -31756,7 +31901,13 @@
               <w:rPr>
                 <w:sz w:val="24"/>
               </w:rPr>
-              <w:t>аудитория студентки</w:t>
+              <w:t>аудитория студен</w:t>
+            </w:r>
+            <w:r>
+              <w:rPr>
+                <w:sz w:val="24"/>
+              </w:rPr>
+              <w:t>тки</w:t>
             </w:r>
           </w:p>
         </w:tc>
@@ -32063,7 +32214,13 @@
               <w:rPr>
                 <w:sz w:val="24"/>
               </w:rPr>
-              <w:t>лист 08_Операц_модель</w:t>
+              <w:t>лист 08_О</w:t>
+            </w:r>
+            <w:r>
+              <w:rPr>
+                <w:sz w:val="24"/>
+              </w:rPr>
+              <w:t>перац_модель</w:t>
             </w:r>
           </w:p>
         </w:tc>
@@ -32118,7 +32275,7 @@
         <w:jc w:val="center"/>
       </w:pPr>
       <w:bookmarkStart w:id="34" w:name="_cb59224a7032ef66ab429e7df9b4e4c597bc187"/>
-      <w:bookmarkStart w:id="35" w:name="_Toc241936256"/>
+      <w:bookmarkStart w:id="35" w:name="_Toc241936459"/>
       <w:bookmarkEnd w:id="32"/>
       <w:r>
         <w:rPr>
@@ -32864,7 +33021,7 @@
         <w:jc w:val="center"/>
       </w:pPr>
       <w:bookmarkStart w:id="36" w:name="_c34bf756927ff692ee086e018f9b8545647766e"/>
-      <w:bookmarkStart w:id="37" w:name="_Toc241936257"/>
+      <w:bookmarkStart w:id="37" w:name="_Toc241936460"/>
       <w:bookmarkEnd w:id="34"/>
       <w:r>
         <w:rPr>
@@ -32912,13 +33069,7 @@
         <w:rPr>
           <w:sz w:val="28"/>
         </w:rPr>
-        <w:t>Для проверки методики Кано сгенерированы модельные ответы 30 условных респондентов на пары ф</w:t>
-      </w:r>
-      <w:r>
-        <w:rPr>
-          <w:sz w:val="28"/>
-        </w:rPr>
-        <w:t xml:space="preserve">ункциональных и дисфункциональных вопросов по 16 функциям (по решению студентки, Р-8; генератор и файлы - в папке 00_Общее/Опрос_модельный, </w:t>
+        <w:t xml:space="preserve">Для проверки методики Кано сгенерированы модельные ответы 30 условных респондентов на пары функциональных и дисфункциональных вопросов по 16 функциям (по решению студентки, Р-8; генератор и файлы - в папке 00_Общее/Опрос_модельный, </w:t>
       </w:r>
       <w:r>
         <w:rPr>
@@ -32931,13 +33082,13 @@
         <w:rPr>
           <w:sz w:val="28"/>
         </w:rPr>
-        <w:t xml:space="preserve"> 20261003). Это модельные данные, а не опрос людей: вероятность согласия с категорией аналитика задана параметро</w:t>
-      </w:r>
-      <w:r>
-        <w:rPr>
-          <w:sz w:val="28"/>
-        </w:rPr>
-        <w:t>м 58 %, поэтому совпадение с таблицей 6 неизбежно и подтверждает только работу расчета, а не истинность категорий.</w:t>
+        <w:t xml:space="preserve"> 20261003). Это моде</w:t>
+      </w:r>
+      <w:r>
+        <w:rPr>
+          <w:sz w:val="28"/>
+        </w:rPr>
+        <w:t>льные данные, а не опрос людей: вероятность согласия с категорией аналитика задана параметром 58 %, поэтому совпадение с таблицей 6 неизбежно и подтверждает только работу расчета, а не истинность категорий.</w:t>
       </w:r>
     </w:p>
     <w:p>
@@ -32951,7 +33102,13 @@
         <w:rPr>
           <w:sz w:val="28"/>
         </w:rPr>
-        <w:t>В таблице 24 представлено: модельные категории Кано по функциям.</w:t>
+        <w:t>В таблице 24 представлено: модельные категории Ка</w:t>
+      </w:r>
+      <w:r>
+        <w:rPr>
+          <w:sz w:val="28"/>
+        </w:rPr>
+        <w:t>но по функциям.</w:t>
       </w:r>
     </w:p>
     <w:p>
@@ -35203,13 +35360,13 @@
         <w:rPr>
           <w:sz w:val="28"/>
         </w:rPr>
-        <w:t>-пояснения и подсказки», «Ср</w:t>
-      </w:r>
-      <w:r>
-        <w:rPr>
-          <w:sz w:val="28"/>
-        </w:rPr>
-        <w:t>авнение версий файлов».</w:t>
+        <w:t xml:space="preserve">-пояснения и </w:t>
+      </w:r>
+      <w:r>
+        <w:rPr>
+          <w:sz w:val="28"/>
+        </w:rPr>
+        <w:t>подсказки», «Сравнение версий файлов».</w:t>
       </w:r>
     </w:p>
     <w:p>
@@ -35236,7 +35393,13 @@
         <w:rPr>
           <w:sz w:val="28"/>
         </w:rPr>
-        <w:t xml:space="preserve"> заменяется, а модальные категории и коэффициенты пересчитываются тем же скриптом; категории в листе 04_Кано книги корректируются по результату.</w:t>
+        <w:t xml:space="preserve"> заменяется, а модальные категории и коэффициенты пересчитываются тем же скриптом; категории в листе 04_Кано книги корректируются по </w:t>
+      </w:r>
+      <w:r>
+        <w:rPr>
+          <w:sz w:val="28"/>
+        </w:rPr>
+        <w:t>результату.</w:t>
       </w:r>
     </w:p>
     <w:p>
@@ -35248,7 +35411,7 @@
         <w:jc w:val="center"/>
       </w:pPr>
       <w:bookmarkStart w:id="38" w:name="_fced6403ae4a6291124e2bc0068517b8abae511"/>
-      <w:bookmarkStart w:id="39" w:name="_Toc241936258"/>
+      <w:bookmarkStart w:id="39" w:name="_Toc241936461"/>
       <w:bookmarkEnd w:id="36"/>
       <w:r>
         <w:rPr>
@@ -35256,14 +35419,7 @@
           <w:sz w:val="28"/>
         </w:rPr>
         <w:lastRenderedPageBreak/>
-        <w:t>ПРИ</w:t>
-      </w:r>
-      <w:r>
-        <w:rPr>
-          <w:b/>
-          <w:sz w:val="28"/>
-        </w:rPr>
-        <w:t>ЛОЖЕНИЕ Д</w:t>
+        <w:t>ПРИЛОЖЕНИЕ Д</w:t>
       </w:r>
       <w:bookmarkEnd w:id="39"/>
     </w:p>
@@ -35329,13 +35485,13 @@
         <w:rPr>
           <w:sz w:val="28"/>
         </w:rPr>
-        <w:t xml:space="preserve">, доступ к которым требует личного аккаунта, финансирование и размер компаний найдены в новостях и пресс-релизах 03.10.2026. Значения справочные и в </w:t>
-      </w:r>
-      <w:r>
-        <w:rPr>
-          <w:sz w:val="28"/>
-        </w:rPr>
-        <w:t>расчетах баллов ЛР5 не использовались.</w:t>
+        <w:t xml:space="preserve">, доступ к которым требует личного аккаунта, финансирование и размер компаний найдены в новостях и пресс-релизах 03.10.2026. Значения </w:t>
+      </w:r>
+      <w:r>
+        <w:rPr>
+          <w:sz w:val="28"/>
+        </w:rPr>
+        <w:t>справочные и в расчетах баллов ЛР5 не использовались.</w:t>
       </w:r>
     </w:p>
     <w:p>
@@ -35491,7 +35647,14 @@
                 <w:b/>
                 <w:sz w:val="24"/>
               </w:rPr>
-              <w:t>Надежность</w:t>
+              <w:t>Надеж</w:t>
+            </w:r>
+            <w:r>
+              <w:rPr>
+                <w:b/>
+                <w:sz w:val="24"/>
+              </w:rPr>
+              <w:t>ность</w:t>
             </w:r>
           </w:p>
         </w:tc>
@@ -35852,14 +36015,7 @@
                 <w:i/>
                 <w:sz w:val="24"/>
               </w:rPr>
-              <w:t>Researc</w:t>
-            </w:r>
-            <w:r>
-              <w:rPr>
-                <w:i/>
-                <w:sz w:val="24"/>
-              </w:rPr>
-              <w:t>h</w:t>
+              <w:t>Research</w:t>
             </w:r>
             <w:r>
               <w:rPr>
@@ -36947,13 +37103,13 @@
               <w:rPr>
                 <w:sz w:val="24"/>
               </w:rPr>
-              <w:t xml:space="preserve">», </w:t>
-            </w:r>
-            <w:r>
-              <w:rPr>
-                <w:sz w:val="24"/>
-              </w:rPr>
-              <w:t>пробного периода нет</w:t>
+              <w:t>», проб</w:t>
+            </w:r>
+            <w:r>
+              <w:rPr>
+                <w:sz w:val="24"/>
+              </w:rPr>
+              <w:t>ного периода нет</w:t>
             </w:r>
           </w:p>
         </w:tc>
@@ -37075,13 +37231,13 @@
               <w:rPr>
                 <w:sz w:val="24"/>
               </w:rPr>
-              <w:t>, есть пробный режим и раздел информационной безопасности, ве</w:t>
-            </w:r>
-            <w:r>
-              <w:rPr>
-                <w:sz w:val="24"/>
-              </w:rPr>
-              <w:t>рсия 9.0</w:t>
+              <w:t>, есть пробный режим и раздел информационной безопасности, версия</w:t>
+            </w:r>
+            <w:r>
+              <w:rPr>
+                <w:sz w:val="24"/>
+              </w:rPr>
+              <w:t xml:space="preserve"> 9.0</w:t>
             </w:r>
           </w:p>
         </w:tc>
@@ -37100,20 +37256,7 @@
               <w:rPr>
                 <w:sz w:val="24"/>
               </w:rPr>
-              <w:t xml:space="preserve">цена не скрыта, как принято в таблицах ЛР5; оценка прозрачности </w:t>
-            </w:r>
-            <w:r>
-              <w:rPr>
-                <w:i/>
-                <w:sz w:val="24"/>
-              </w:rPr>
-              <w:t>Arixcel</w:t>
-            </w:r>
-            <w:r>
-              <w:rPr>
-                <w:sz w:val="24"/>
-              </w:rPr>
-              <w:t xml:space="preserve"> (1) занижена</w:t>
+              <w:t>цена не скрыта: в книгу бизнес-моделей внесены цена и пробный режим, оценка прозрачности повышена с 1 до 3</w:t>
             </w:r>
           </w:p>
         </w:tc>
@@ -37280,20 +37423,7 @@
               <w:rPr>
                 <w:sz w:val="24"/>
               </w:rPr>
-              <w:t xml:space="preserve">цена не скрыта, как принято в ЛР5; оценка прозрачности </w:t>
-            </w:r>
-            <w:r>
-              <w:rPr>
-                <w:i/>
-                <w:sz w:val="24"/>
-              </w:rPr>
-              <w:t>Operis</w:t>
-            </w:r>
-            <w:r>
-              <w:rPr>
-                <w:sz w:val="24"/>
-              </w:rPr>
-              <w:t xml:space="preserve"> (1) занижена</w:t>
+              <w:t>цена не скрыта: в книгу внесены цена и пробная версия, оценка прозрачности повышена с 1 до 3</w:t>
             </w:r>
           </w:p>
         </w:tc>
@@ -37462,7 +37592,13 @@
               <w:rPr>
                 <w:sz w:val="24"/>
               </w:rPr>
-              <w:t>, ролевой доступ</w:t>
+              <w:t>, рол</w:t>
+            </w:r>
+            <w:r>
+              <w:rPr>
+                <w:sz w:val="24"/>
+              </w:rPr>
+              <w:t>евой доступ</w:t>
             </w:r>
           </w:p>
         </w:tc>
@@ -37481,13 +37617,7 @@
               <w:rPr>
                 <w:sz w:val="24"/>
               </w:rPr>
-              <w:t>заявле</w:t>
-            </w:r>
-            <w:r>
-              <w:rPr>
-                <w:sz w:val="24"/>
-              </w:rPr>
-              <w:t xml:space="preserve">ние </w:t>
+              <w:t xml:space="preserve">заявление </w:t>
             </w:r>
             <w:r>
               <w:rPr>
@@ -37596,7 +37726,13 @@
               <w:rPr>
                 <w:sz w:val="24"/>
               </w:rPr>
-              <w:t>подтверждает слабое раскрытие безопасности у специализированных игроков</w:t>
+              <w:t>подтвер</w:t>
+            </w:r>
+            <w:r>
+              <w:rPr>
+                <w:sz w:val="24"/>
+              </w:rPr>
+              <w:t>ждает слабое раскрытие безопасности у специализированных игроков</w:t>
             </w:r>
           </w:p>
         </w:tc>
@@ -37680,13 +37816,7 @@
               <w:rPr>
                 <w:sz w:val="24"/>
               </w:rPr>
-              <w:t>Страницы без</w:t>
-            </w:r>
-            <w:r>
-              <w:rPr>
-                <w:sz w:val="24"/>
-              </w:rPr>
-              <w:t>опасности</w:t>
+              <w:t>Страницы безопасности</w:t>
             </w:r>
           </w:p>
         </w:tc>
@@ -37805,7 +37935,39 @@
         <w:rPr>
           <w:sz w:val="28"/>
         </w:rPr>
-        <w:t>водителей. Поэтому оценки прозрачности цен у этих двух компаний (1 из 5) занижены, а их место среди слабейших бизнес-моделей может измениться.</w:t>
+        <w:t xml:space="preserve">водителей. Поэтому в книгу бизнес-моделей внесены их цены и пробные режимы, а оценки прозрачности цен повышены с 1 до 3 из 5; 70 независимых проверок </w:t>
+      </w:r>
+      <w:r>
+        <w:rPr>
+          <w:i/>
+          <w:sz w:val="28"/>
+        </w:rPr>
+        <w:t>Python</w:t>
+      </w:r>
+      <w:r>
+        <w:rPr>
+          <w:sz w:val="28"/>
+        </w:rPr>
+        <w:t xml:space="preserve"> и </w:t>
+      </w:r>
+      <w:r>
+        <w:rPr>
+          <w:i/>
+          <w:sz w:val="28"/>
+        </w:rPr>
+        <w:t>Excel</w:t>
+      </w:r>
+      <w:r>
+        <w:rPr>
+          <w:sz w:val="28"/>
+        </w:rPr>
+        <w:t xml:space="preserve"> по-прежнему сходятся, а индексы бизнес-моделей не изменились, так как оценка прозрачности в</w:t>
+      </w:r>
+      <w:r>
+        <w:rPr>
+          <w:sz w:val="28"/>
+        </w:rPr>
+        <w:t xml:space="preserve"> них не входит.</w:t>
       </w:r>
     </w:p>
     <w:p>
@@ -37826,14 +37988,33 @@
           <w:i/>
           <w:sz w:val="28"/>
         </w:rPr>
-        <w:t>Shortc</w:t>
+        <w:t>Shortcut</w:t>
+      </w:r>
+      <w:r>
+        <w:rPr>
+          <w:sz w:val="28"/>
+        </w:rPr>
+        <w:t xml:space="preserve"> и </w:t>
       </w:r>
       <w:r>
         <w:rPr>
           <w:i/>
           <w:sz w:val="28"/>
         </w:rPr>
-        <w:t>ut</w:t>
+        <w:t>Numerous.ai</w:t>
+      </w:r>
+      <w:r>
+        <w:rPr>
+          <w:sz w:val="28"/>
+        </w:rPr>
+        <w:t xml:space="preserve">, 2 из 7), поэтому единичные цены </w:t>
+      </w:r>
+      <w:r>
+        <w:rPr>
+          <w:i/>
+          <w:sz w:val="28"/>
+        </w:rPr>
+        <w:t>Arixcel</w:t>
       </w:r>
       <w:r>
         <w:rPr>
@@ -37846,19 +38027,38 @@
           <w:i/>
           <w:sz w:val="28"/>
         </w:rPr>
-        <w:t>Numerous.ai</w:t>
-      </w:r>
-      <w:r>
-        <w:rPr>
-          <w:sz w:val="28"/>
-        </w:rPr>
-        <w:t xml:space="preserve">, 2 из 7), поэтому единичные цены </w:t>
+        <w:t>Operis</w:t>
+      </w:r>
+      <w:r>
+        <w:rPr>
+          <w:sz w:val="28"/>
+        </w:rPr>
+        <w:t xml:space="preserve"> не меняют статус «зона дифференциации». Если считать признак</w:t>
+      </w:r>
+      <w:r>
+        <w:rPr>
+          <w:sz w:val="28"/>
+        </w:rPr>
+        <w:t xml:space="preserve">ом любую опубликованную цену, показатель вырастет до 5 из 7 (71 %) и перейдет порог 70 % в рыночный стандарт; тогда возможностью дифференциации остаются лестница тарифов с бесплатным входом и доказательство вывода. Книги </w:t>
       </w:r>
       <w:r>
         <w:rPr>
           <w:i/>
           <w:sz w:val="28"/>
         </w:rPr>
+        <w:t>Excel</w:t>
+      </w:r>
+      <w:r>
+        <w:rPr>
+          <w:sz w:val="28"/>
+        </w:rPr>
+        <w:t xml:space="preserve"> пересчитаны после внесения цен </w:t>
+      </w:r>
+      <w:r>
+        <w:rPr>
+          <w:i/>
+          <w:sz w:val="28"/>
+        </w:rPr>
         <w:t>Arixcel</w:t>
       </w:r>
       <w:r>
@@ -37878,65 +38078,33 @@
         <w:rPr>
           <w:sz w:val="28"/>
         </w:rPr>
-        <w:t xml:space="preserve"> не меняют статус «зона дифференциации». Если считать признаком любую опубликованную цену, показатель вырастет до 5 из 7 (71 %) и перейдет порог 70 % в рыночный стандарт; тогда возможностью </w:t>
-      </w:r>
-      <w:r>
-        <w:rPr>
-          <w:sz w:val="28"/>
-        </w:rPr>
-        <w:t xml:space="preserve">дифференциации остаются лестница тарифов с бесплатным входом и доказательство вывода. Баллы в книгах </w:t>
+        <w:t xml:space="preserve"> (скрипты </w:t>
       </w:r>
       <w:r>
         <w:rPr>
           <w:i/>
           <w:sz w:val="28"/>
         </w:rPr>
-        <w:t>Excel</w:t>
-      </w:r>
-      <w:r>
-        <w:rPr>
-          <w:sz w:val="28"/>
-        </w:rPr>
-        <w:t xml:space="preserve"> не пересчитывались, чтобы не нарушать согласованность ЛР5-ЛР7; пересчет выполняется изменением </w:t>
+        <w:t>fill5.py</w:t>
+      </w:r>
+      <w:r>
+        <w:rPr>
+          <w:sz w:val="28"/>
+        </w:rPr>
+        <w:t xml:space="preserve"> и </w:t>
       </w:r>
       <w:r>
         <w:rPr>
           <w:i/>
           <w:sz w:val="28"/>
         </w:rPr>
-        <w:t>data5.py</w:t>
-      </w:r>
-      <w:r>
-        <w:rPr>
-          <w:sz w:val="28"/>
-        </w:rPr>
-        <w:t xml:space="preserve"> и запуском </w:t>
-      </w:r>
-      <w:r>
-        <w:rPr>
-          <w:i/>
-          <w:sz w:val="28"/>
-        </w:rPr>
-        <w:t>fill5.py</w:t>
-      </w:r>
-      <w:r>
-        <w:rPr>
-          <w:sz w:val="28"/>
-        </w:rPr>
-        <w:t xml:space="preserve"> и </w:t>
-      </w:r>
-      <w:r>
-        <w:rPr>
-          <w:i/>
-          <w:sz w:val="28"/>
-        </w:rPr>
         <w:t>analysis5.py</w:t>
       </w:r>
       <w:r>
         <w:rPr>
           <w:sz w:val="28"/>
         </w:rPr>
-        <w:t>.</w:t>
+        <w:t>): индексы классификации, Левитта и Кано и бизнес-моделей не изменились, поэтому выводы ЛР5-ЛР7 остаются в силе.</w:t>
       </w:r>
     </w:p>
     <w:bookmarkEnd w:id="38"/>
@@ -38044,7 +38212,7 @@
   <w:abstractNum w:abstractNumId="0" w15:restartNumberingAfterBreak="0">
     <w:nsid w:val="0000A990"/>
     <w:multiLevelType w:val="multilevel"/>
-    <w:tmpl w:val="6A860B0A"/>
+    <w:tmpl w:val="53BE2B00"/>
     <w:lvl w:ilvl="0">
       <w:numFmt w:val="bullet"/>
       <w:lvlText w:val=" "/>
@@ -38121,7 +38289,7 @@
   <w:abstractNum w:abstractNumId="1" w15:restartNumberingAfterBreak="0">
     <w:nsid w:val="00A99411"/>
     <w:multiLevelType w:val="multilevel"/>
-    <w:tmpl w:val="BC1AC6B2"/>
+    <w:tmpl w:val="2A4AAA7A"/>
     <w:lvl w:ilvl="0">
       <w:start w:val="1"/>
       <w:numFmt w:val="decimal"/>
@@ -39599,7 +39767,7 @@
     <w:autoRedefine/>
     <w:uiPriority w:val="39"/>
     <w:unhideWhenUsed/>
-    <w:rsid w:val="0037123E"/>
+    <w:rsid w:val="001968F1"/>
     <w:pPr>
       <w:spacing w:after="100"/>
     </w:pPr>
@@ -39611,7 +39779,7 @@
     <w:autoRedefine/>
     <w:uiPriority w:val="39"/>
     <w:unhideWhenUsed/>
-    <w:rsid w:val="0037123E"/>
+    <w:rsid w:val="001968F1"/>
     <w:pPr>
       <w:spacing w:after="100"/>
       <w:ind w:left="240"/>

</xml_diff>

<commit_message>
lab5: more competitor pages, revenue and staff from open sources; docs rebuilt
</commit_message>
<xml_diff>
--- a/ЛР5_Анализ_конкурентов/ОТЧЕТ_ЛР5_TableMind.docx
+++ b/ЛР5_Анализ_конкурентов/ОТЧЕТ_ЛР5_TableMind.docx
@@ -245,7 +245,7 @@
       <w:r>
         <w:fldChar w:fldCharType="separate"/>
       </w:r>
-      <w:hyperlink w:anchor="_Toc241936442" w:history="1">
+      <w:hyperlink w:anchor="_Toc241937551" w:history="1">
         <w:r>
           <w:rPr>
             <w:rStyle w:val="af"/>
@@ -273,7 +273,7 @@
             <w:noProof/>
             <w:webHidden/>
           </w:rPr>
-          <w:instrText xml:space="preserve"> PAGEREF _Toc241936442 \h </w:instrText>
+          <w:instrText xml:space="preserve"> PAGEREF _Toc241937551 \h </w:instrText>
         </w:r>
         <w:r>
           <w:rPr>
@@ -314,7 +314,7 @@
           <w:noProof/>
         </w:rPr>
       </w:pPr>
-      <w:hyperlink w:anchor="_Toc241936443" w:history="1">
+      <w:hyperlink w:anchor="_Toc241937552" w:history="1">
         <w:r>
           <w:rPr>
             <w:rStyle w:val="af"/>
@@ -342,7 +342,7 @@
             <w:noProof/>
             <w:webHidden/>
           </w:rPr>
-          <w:instrText xml:space="preserve"> PAGEREF _Toc241936443 \h </w:instrText>
+          <w:instrText xml:space="preserve"> PAGEREF _Toc241937552 \h </w:instrText>
         </w:r>
         <w:r>
           <w:rPr>
@@ -383,7 +383,7 @@
           <w:noProof/>
         </w:rPr>
       </w:pPr>
-      <w:hyperlink w:anchor="_Toc241936444" w:history="1">
+      <w:hyperlink w:anchor="_Toc241937553" w:history="1">
         <w:r>
           <w:rPr>
             <w:rStyle w:val="af"/>
@@ -411,7 +411,7 @@
             <w:noProof/>
             <w:webHidden/>
           </w:rPr>
-          <w:instrText xml:space="preserve"> PAGEREF _Toc241936444 \h </w:instrText>
+          <w:instrText xml:space="preserve"> PAGEREF _Toc241937553 \h </w:instrText>
         </w:r>
         <w:r>
           <w:rPr>
@@ -452,7 +452,7 @@
           <w:noProof/>
         </w:rPr>
       </w:pPr>
-      <w:hyperlink w:anchor="_Toc241936445" w:history="1">
+      <w:hyperlink w:anchor="_Toc241937554" w:history="1">
         <w:r>
           <w:rPr>
             <w:rStyle w:val="af"/>
@@ -480,7 +480,7 @@
             <w:noProof/>
             <w:webHidden/>
           </w:rPr>
-          <w:instrText xml:space="preserve"> PAGEREF _Toc241936445 \h </w:instrText>
+          <w:instrText xml:space="preserve"> PAGEREF _Toc241937554 \h </w:instrText>
         </w:r>
         <w:r>
           <w:rPr>
@@ -521,7 +521,7 @@
           <w:noProof/>
         </w:rPr>
       </w:pPr>
-      <w:hyperlink w:anchor="_Toc241936446" w:history="1">
+      <w:hyperlink w:anchor="_Toc241937555" w:history="1">
         <w:r>
           <w:rPr>
             <w:rStyle w:val="af"/>
@@ -549,7 +549,7 @@
             <w:noProof/>
             <w:webHidden/>
           </w:rPr>
-          <w:instrText xml:space="preserve"> PAGEREF _Toc241936446 \h </w:instrText>
+          <w:instrText xml:space="preserve"> PAGEREF _Toc241937555 \h </w:instrText>
         </w:r>
         <w:r>
           <w:rPr>
@@ -590,7 +590,7 @@
           <w:noProof/>
         </w:rPr>
       </w:pPr>
-      <w:hyperlink w:anchor="_Toc241936447" w:history="1">
+      <w:hyperlink w:anchor="_Toc241937556" w:history="1">
         <w:r>
           <w:rPr>
             <w:rStyle w:val="af"/>
@@ -618,7 +618,7 @@
             <w:noProof/>
             <w:webHidden/>
           </w:rPr>
-          <w:instrText xml:space="preserve"> PAGEREF _Toc241936447 \h </w:instrText>
+          <w:instrText xml:space="preserve"> PAGEREF _Toc241937556 \h </w:instrText>
         </w:r>
         <w:r>
           <w:rPr>
@@ -659,7 +659,7 @@
           <w:noProof/>
         </w:rPr>
       </w:pPr>
-      <w:hyperlink w:anchor="_Toc241936448" w:history="1">
+      <w:hyperlink w:anchor="_Toc241937557" w:history="1">
         <w:r>
           <w:rPr>
             <w:rStyle w:val="af"/>
@@ -687,7 +687,7 @@
             <w:noProof/>
             <w:webHidden/>
           </w:rPr>
-          <w:instrText xml:space="preserve"> PAGEREF _Toc241936448 \h </w:instrText>
+          <w:instrText xml:space="preserve"> PAGEREF _Toc241937557 \h </w:instrText>
         </w:r>
         <w:r>
           <w:rPr>
@@ -728,7 +728,7 @@
           <w:noProof/>
         </w:rPr>
       </w:pPr>
-      <w:hyperlink w:anchor="_Toc241936449" w:history="1">
+      <w:hyperlink w:anchor="_Toc241937558" w:history="1">
         <w:r>
           <w:rPr>
             <w:rStyle w:val="af"/>
@@ -756,7 +756,7 @@
             <w:noProof/>
             <w:webHidden/>
           </w:rPr>
-          <w:instrText xml:space="preserve"> PAGEREF _Toc241936449 \h </w:instrText>
+          <w:instrText xml:space="preserve"> PAGEREF _Toc241937558 \h </w:instrText>
         </w:r>
         <w:r>
           <w:rPr>
@@ -797,7 +797,7 @@
           <w:noProof/>
         </w:rPr>
       </w:pPr>
-      <w:hyperlink w:anchor="_Toc241936450" w:history="1">
+      <w:hyperlink w:anchor="_Toc241937559" w:history="1">
         <w:r>
           <w:rPr>
             <w:rStyle w:val="af"/>
@@ -825,7 +825,7 @@
             <w:noProof/>
             <w:webHidden/>
           </w:rPr>
-          <w:instrText xml:space="preserve"> PAGEREF _Toc241936450 \h </w:instrText>
+          <w:instrText xml:space="preserve"> PAGEREF _Toc241937559 \h </w:instrText>
         </w:r>
         <w:r>
           <w:rPr>
@@ -866,7 +866,7 @@
           <w:noProof/>
         </w:rPr>
       </w:pPr>
-      <w:hyperlink w:anchor="_Toc241936451" w:history="1">
+      <w:hyperlink w:anchor="_Toc241937560" w:history="1">
         <w:r>
           <w:rPr>
             <w:rStyle w:val="af"/>
@@ -894,7 +894,7 @@
             <w:noProof/>
             <w:webHidden/>
           </w:rPr>
-          <w:instrText xml:space="preserve"> PAGEREF _Toc241936451 \h </w:instrText>
+          <w:instrText xml:space="preserve"> PAGEREF _Toc241937560 \h </w:instrText>
         </w:r>
         <w:r>
           <w:rPr>
@@ -935,7 +935,7 @@
           <w:noProof/>
         </w:rPr>
       </w:pPr>
-      <w:hyperlink w:anchor="_Toc241936452" w:history="1">
+      <w:hyperlink w:anchor="_Toc241937561" w:history="1">
         <w:r>
           <w:rPr>
             <w:rStyle w:val="af"/>
@@ -972,7 +972,7 @@
             <w:noProof/>
             <w:webHidden/>
           </w:rPr>
-          <w:instrText xml:space="preserve"> PAGEREF _Toc241936452 \h </w:instrText>
+          <w:instrText xml:space="preserve"> PAGEREF _Toc241937561 \h </w:instrText>
         </w:r>
         <w:r>
           <w:rPr>
@@ -1013,7 +1013,7 @@
           <w:noProof/>
         </w:rPr>
       </w:pPr>
-      <w:hyperlink w:anchor="_Toc241936453" w:history="1">
+      <w:hyperlink w:anchor="_Toc241937562" w:history="1">
         <w:r>
           <w:rPr>
             <w:rStyle w:val="af"/>
@@ -1041,7 +1041,7 @@
             <w:noProof/>
             <w:webHidden/>
           </w:rPr>
-          <w:instrText xml:space="preserve"> PAGEREF _Toc241936453 \h </w:instrText>
+          <w:instrText xml:space="preserve"> PAGEREF _Toc241937562 \h </w:instrText>
         </w:r>
         <w:r>
           <w:rPr>
@@ -1082,7 +1082,7 @@
           <w:noProof/>
         </w:rPr>
       </w:pPr>
-      <w:hyperlink w:anchor="_Toc241936454" w:history="1">
+      <w:hyperlink w:anchor="_Toc241937563" w:history="1">
         <w:r>
           <w:rPr>
             <w:rStyle w:val="af"/>
@@ -1110,7 +1110,7 @@
             <w:noProof/>
             <w:webHidden/>
           </w:rPr>
-          <w:instrText xml:space="preserve"> PAGEREF _Toc241936454 \h </w:instrText>
+          <w:instrText xml:space="preserve"> PAGEREF _Toc241937563 \h </w:instrText>
         </w:r>
         <w:r>
           <w:rPr>
@@ -1151,7 +1151,7 @@
           <w:noProof/>
         </w:rPr>
       </w:pPr>
-      <w:hyperlink w:anchor="_Toc241936455" w:history="1">
+      <w:hyperlink w:anchor="_Toc241937564" w:history="1">
         <w:r>
           <w:rPr>
             <w:rStyle w:val="af"/>
@@ -1179,7 +1179,7 @@
             <w:noProof/>
             <w:webHidden/>
           </w:rPr>
-          <w:instrText xml:space="preserve"> PAGEREF _Toc241936455 \h </w:instrText>
+          <w:instrText xml:space="preserve"> PAGEREF _Toc241937564 \h </w:instrText>
         </w:r>
         <w:r>
           <w:rPr>
@@ -1220,7 +1220,7 @@
           <w:noProof/>
         </w:rPr>
       </w:pPr>
-      <w:hyperlink w:anchor="_Toc241936456" w:history="1">
+      <w:hyperlink w:anchor="_Toc241937565" w:history="1">
         <w:r>
           <w:rPr>
             <w:rStyle w:val="af"/>
@@ -1248,7 +1248,7 @@
             <w:noProof/>
             <w:webHidden/>
           </w:rPr>
-          <w:instrText xml:space="preserve"> PAGEREF _Toc241936456 \h </w:instrText>
+          <w:instrText xml:space="preserve"> PAGEREF _Toc241937565 \h </w:instrText>
         </w:r>
         <w:r>
           <w:rPr>
@@ -1289,7 +1289,7 @@
           <w:noProof/>
         </w:rPr>
       </w:pPr>
-      <w:hyperlink w:anchor="_Toc241936457" w:history="1">
+      <w:hyperlink w:anchor="_Toc241937566" w:history="1">
         <w:r>
           <w:rPr>
             <w:rStyle w:val="af"/>
@@ -1317,7 +1317,7 @@
             <w:noProof/>
             <w:webHidden/>
           </w:rPr>
-          <w:instrText xml:space="preserve"> PAGEREF _Toc241936457 \h </w:instrText>
+          <w:instrText xml:space="preserve"> PAGEREF _Toc241937566 \h </w:instrText>
         </w:r>
         <w:r>
           <w:rPr>
@@ -1358,7 +1358,7 @@
           <w:noProof/>
         </w:rPr>
       </w:pPr>
-      <w:hyperlink w:anchor="_Toc241936458" w:history="1">
+      <w:hyperlink w:anchor="_Toc241937567" w:history="1">
         <w:r>
           <w:rPr>
             <w:rStyle w:val="af"/>
@@ -1386,7 +1386,7 @@
             <w:noProof/>
             <w:webHidden/>
           </w:rPr>
-          <w:instrText xml:space="preserve"> PAGEREF _Toc241936458 \h </w:instrText>
+          <w:instrText xml:space="preserve"> PAGEREF _Toc241937567 \h </w:instrText>
         </w:r>
         <w:r>
           <w:rPr>
@@ -1427,7 +1427,7 @@
           <w:noProof/>
         </w:rPr>
       </w:pPr>
-      <w:hyperlink w:anchor="_Toc241936459" w:history="1">
+      <w:hyperlink w:anchor="_Toc241937568" w:history="1">
         <w:r>
           <w:rPr>
             <w:rStyle w:val="af"/>
@@ -1455,76 +1455,7 @@
             <w:noProof/>
             <w:webHidden/>
           </w:rPr>
-          <w:instrText xml:space="preserve"> PAGEREF _Toc241936459 \h </w:instrText>
-        </w:r>
-        <w:r>
-          <w:rPr>
-            <w:noProof/>
-            <w:webHidden/>
-          </w:rPr>
-        </w:r>
-        <w:r>
-          <w:rPr>
-            <w:noProof/>
-            <w:webHidden/>
-          </w:rPr>
-          <w:fldChar w:fldCharType="separate"/>
-        </w:r>
-        <w:r>
-          <w:rPr>
-            <w:noProof/>
-            <w:webHidden/>
-          </w:rPr>
-          <w:t>29</w:t>
-        </w:r>
-        <w:r>
-          <w:rPr>
-            <w:noProof/>
-            <w:webHidden/>
-          </w:rPr>
-          <w:fldChar w:fldCharType="end"/>
-        </w:r>
-      </w:hyperlink>
-    </w:p>
-    <w:p>
-      <w:pPr>
-        <w:pStyle w:val="12"/>
-        <w:tabs>
-          <w:tab w:val="right" w:leader="dot" w:pos="9345"/>
-        </w:tabs>
-        <w:rPr>
-          <w:noProof/>
-        </w:rPr>
-      </w:pPr>
-      <w:hyperlink w:anchor="_Toc241936460" w:history="1">
-        <w:r>
-          <w:rPr>
-            <w:rStyle w:val="af"/>
-            <w:b/>
-            <w:noProof/>
-          </w:rPr>
-          <w:t>ПРИЛОЖЕНИЕ Г</w:t>
-        </w:r>
-        <w:r>
-          <w:rPr>
-            <w:noProof/>
-            <w:webHidden/>
-          </w:rPr>
-          <w:tab/>
-        </w:r>
-        <w:r>
-          <w:rPr>
-            <w:noProof/>
-            <w:webHidden/>
-          </w:rPr>
-          <w:fldChar w:fldCharType="begin"/>
-        </w:r>
-        <w:r>
-          <w:rPr>
-            <w:noProof/>
-            <w:webHidden/>
-          </w:rPr>
-          <w:instrText xml:space="preserve"> PAGEREF _Toc241936460 \h </w:instrText>
+          <w:instrText xml:space="preserve"> PAGEREF _Toc241937568 \h </w:instrText>
         </w:r>
         <w:r>
           <w:rPr>
@@ -1565,7 +1496,76 @@
           <w:noProof/>
         </w:rPr>
       </w:pPr>
-      <w:hyperlink w:anchor="_Toc241936461" w:history="1">
+      <w:hyperlink w:anchor="_Toc241937569" w:history="1">
+        <w:r>
+          <w:rPr>
+            <w:rStyle w:val="af"/>
+            <w:b/>
+            <w:noProof/>
+          </w:rPr>
+          <w:t>ПРИЛОЖЕНИЕ Г</w:t>
+        </w:r>
+        <w:r>
+          <w:rPr>
+            <w:noProof/>
+            <w:webHidden/>
+          </w:rPr>
+          <w:tab/>
+        </w:r>
+        <w:r>
+          <w:rPr>
+            <w:noProof/>
+            <w:webHidden/>
+          </w:rPr>
+          <w:fldChar w:fldCharType="begin"/>
+        </w:r>
+        <w:r>
+          <w:rPr>
+            <w:noProof/>
+            <w:webHidden/>
+          </w:rPr>
+          <w:instrText xml:space="preserve"> PAGEREF _Toc241937569 \h </w:instrText>
+        </w:r>
+        <w:r>
+          <w:rPr>
+            <w:noProof/>
+            <w:webHidden/>
+          </w:rPr>
+        </w:r>
+        <w:r>
+          <w:rPr>
+            <w:noProof/>
+            <w:webHidden/>
+          </w:rPr>
+          <w:fldChar w:fldCharType="separate"/>
+        </w:r>
+        <w:r>
+          <w:rPr>
+            <w:noProof/>
+            <w:webHidden/>
+          </w:rPr>
+          <w:t>31</w:t>
+        </w:r>
+        <w:r>
+          <w:rPr>
+            <w:noProof/>
+            <w:webHidden/>
+          </w:rPr>
+          <w:fldChar w:fldCharType="end"/>
+        </w:r>
+      </w:hyperlink>
+    </w:p>
+    <w:p>
+      <w:pPr>
+        <w:pStyle w:val="12"/>
+        <w:tabs>
+          <w:tab w:val="right" w:leader="dot" w:pos="9345"/>
+        </w:tabs>
+        <w:rPr>
+          <w:noProof/>
+        </w:rPr>
+      </w:pPr>
+      <w:hyperlink w:anchor="_Toc241937570" w:history="1">
         <w:r>
           <w:rPr>
             <w:rStyle w:val="af"/>
@@ -1593,7 +1593,7 @@
             <w:noProof/>
             <w:webHidden/>
           </w:rPr>
-          <w:instrText xml:space="preserve"> PAGEREF _Toc241936461 \h </w:instrText>
+          <w:instrText xml:space="preserve"> PAGEREF _Toc241937570 \h </w:instrText>
         </w:r>
         <w:r>
           <w:rPr>
@@ -1613,7 +1613,7 @@
             <w:noProof/>
             <w:webHidden/>
           </w:rPr>
-          <w:t>32</w:t>
+          <w:t>33</w:t>
         </w:r>
         <w:r>
           <w:rPr>
@@ -1639,7 +1639,7 @@
         <w:spacing w:before="0" w:after="360" w:line="360" w:lineRule="exact"/>
         <w:ind w:firstLine="709"/>
       </w:pPr>
-      <w:bookmarkStart w:id="1" w:name="_Toc241936442"/>
+      <w:bookmarkStart w:id="1" w:name="_Toc241937551"/>
       <w:r>
         <w:rPr>
           <w:b/>
@@ -1789,7 +1789,7 @@
         <w:ind w:firstLine="709"/>
       </w:pPr>
       <w:bookmarkStart w:id="2" w:name="_b608aa976fc82a0faaf3b83f58c735968afd03b"/>
-      <w:bookmarkStart w:id="3" w:name="_Toc241936443"/>
+      <w:bookmarkStart w:id="3" w:name="_Toc241937552"/>
       <w:bookmarkEnd w:id="0"/>
       <w:r>
         <w:rPr>
@@ -1848,7 +1848,7 @@
         <w:ind w:firstLine="709"/>
       </w:pPr>
       <w:bookmarkStart w:id="4" w:name="_c3cf235f67897fccdd158c7c34ca81091dc06e0"/>
-      <w:bookmarkStart w:id="5" w:name="_Toc241936444"/>
+      <w:bookmarkStart w:id="5" w:name="_Toc241937553"/>
       <w:r>
         <w:rPr>
           <w:b/>
@@ -3580,7 +3580,7 @@
         <w:ind w:firstLine="709"/>
       </w:pPr>
       <w:bookmarkStart w:id="6" w:name="_6c38f46d6252626ee19bec51dca515ea8eb3483"/>
-      <w:bookmarkStart w:id="7" w:name="_Toc241936445"/>
+      <w:bookmarkStart w:id="7" w:name="_Toc241937554"/>
       <w:bookmarkEnd w:id="4"/>
       <w:r>
         <w:rPr>
@@ -6350,7 +6350,7 @@
         </w:rPr>
         <w:lastRenderedPageBreak/>
         <w:drawing>
-          <wp:inline distT="0" distB="0" distL="0" distR="0" wp14:anchorId="352D6390" wp14:editId="29516A40">
+          <wp:inline distT="0" distB="0" distL="0" distR="0" wp14:anchorId="32842541" wp14:editId="1296095B">
             <wp:extent cx="5334000" cy="3122341"/>
             <wp:effectExtent l="0" t="0" r="0" b="0"/>
             <wp:docPr id="12" name="Picture"/>
@@ -6614,7 +6614,7 @@
         <w:ind w:firstLine="709"/>
       </w:pPr>
       <w:bookmarkStart w:id="8" w:name="_e6ba0285e0e0ccc17e7a33a4e535fa387865e88"/>
-      <w:bookmarkStart w:id="9" w:name="_Toc241936446"/>
+      <w:bookmarkStart w:id="9" w:name="_Toc241937555"/>
       <w:bookmarkEnd w:id="6"/>
       <w:r>
         <w:rPr>
@@ -9027,7 +9027,7 @@
         <w:ind w:firstLine="709"/>
       </w:pPr>
       <w:bookmarkStart w:id="10" w:name="_b8f6f14603ee9e71fb2e4d1c108750035f950c7"/>
-      <w:bookmarkStart w:id="11" w:name="_Toc241936447"/>
+      <w:bookmarkStart w:id="11" w:name="_Toc241937556"/>
       <w:bookmarkEnd w:id="8"/>
       <w:r>
         <w:rPr>
@@ -12009,7 +12009,7 @@
           <w:sz w:val="28"/>
         </w:rPr>
         <w:drawing>
-          <wp:inline distT="0" distB="0" distL="0" distR="0" wp14:anchorId="3365D20C" wp14:editId="6437E40F">
+          <wp:inline distT="0" distB="0" distL="0" distR="0" wp14:anchorId="20F19A43" wp14:editId="6FB7CAA3">
             <wp:extent cx="5334000" cy="3187390"/>
             <wp:effectExtent l="0" t="0" r="0" b="0"/>
             <wp:docPr id="17" name="Picture"/>
@@ -12556,7 +12556,7 @@
         <w:ind w:firstLine="709"/>
       </w:pPr>
       <w:bookmarkStart w:id="12" w:name="_823200a59a4cf40c51f7f0e02566c010f838ed7"/>
-      <w:bookmarkStart w:id="13" w:name="_Toc241936448"/>
+      <w:bookmarkStart w:id="13" w:name="_Toc241937557"/>
       <w:bookmarkEnd w:id="10"/>
       <w:r>
         <w:rPr>
@@ -13266,7 +13266,7 @@
         </w:rPr>
         <w:lastRenderedPageBreak/>
         <w:drawing>
-          <wp:inline distT="0" distB="0" distL="0" distR="0" wp14:anchorId="4F34FB26" wp14:editId="3E93C9A1">
+          <wp:inline distT="0" distB="0" distL="0" distR="0" wp14:anchorId="78E5C84C" wp14:editId="2241F9D5">
             <wp:extent cx="5334000" cy="2862146"/>
             <wp:effectExtent l="0" t="0" r="0" b="0"/>
             <wp:docPr id="21" name="Picture"/>
@@ -13361,7 +13361,7 @@
         <w:ind w:firstLine="709"/>
       </w:pPr>
       <w:bookmarkStart w:id="14" w:name="_9d579ff3219dd0c08e87cdba2a2a6d1ef61e3cc"/>
-      <w:bookmarkStart w:id="15" w:name="_Toc241936449"/>
+      <w:bookmarkStart w:id="15" w:name="_Toc241937558"/>
       <w:bookmarkEnd w:id="12"/>
       <w:r>
         <w:rPr>
@@ -15275,7 +15275,7 @@
         <w:ind w:firstLine="709"/>
       </w:pPr>
       <w:bookmarkStart w:id="16" w:name="_8be076d9797953e124cfe81356f035b108674c3"/>
-      <w:bookmarkStart w:id="17" w:name="_Toc241936450"/>
+      <w:bookmarkStart w:id="17" w:name="_Toc241937559"/>
       <w:bookmarkEnd w:id="14"/>
       <w:r>
         <w:rPr>
@@ -17952,7 +17952,7 @@
         <w:ind w:firstLine="709"/>
       </w:pPr>
       <w:bookmarkStart w:id="18" w:name="_0ab5b5274b575dfb9e5e85d7a9a12b82683e52c"/>
-      <w:bookmarkStart w:id="19" w:name="_Toc241936451"/>
+      <w:bookmarkStart w:id="19" w:name="_Toc241937560"/>
       <w:bookmarkEnd w:id="16"/>
       <w:r>
         <w:rPr>
@@ -25050,7 +25050,7 @@
         </w:rPr>
         <w:lastRenderedPageBreak/>
         <w:drawing>
-          <wp:inline distT="0" distB="0" distL="0" distR="0" wp14:anchorId="46AB03BF" wp14:editId="29BBA38F">
+          <wp:inline distT="0" distB="0" distL="0" distR="0" wp14:anchorId="581A1B59" wp14:editId="7C97FD4B">
             <wp:extent cx="5334000" cy="2471853"/>
             <wp:effectExtent l="0" t="0" r="0" b="0"/>
             <wp:docPr id="27" name="Picture"/>
@@ -26661,7 +26661,7 @@
         <w:ind w:firstLine="709"/>
       </w:pPr>
       <w:bookmarkStart w:id="20" w:name="_79cbfa74df5b3f3beef1cd24c3ad9f089a58d7a"/>
-      <w:bookmarkStart w:id="21" w:name="_Toc241936452"/>
+      <w:bookmarkStart w:id="21" w:name="_Toc241937561"/>
       <w:bookmarkEnd w:id="18"/>
       <w:r>
         <w:rPr>
@@ -28146,7 +28146,7 @@
         <w:ind w:firstLine="709"/>
       </w:pPr>
       <w:bookmarkStart w:id="22" w:name="_339ae803435bd6b9a653c2b18dadc62dc9ad8e7"/>
-      <w:bookmarkStart w:id="23" w:name="_Toc241936453"/>
+      <w:bookmarkStart w:id="23" w:name="_Toc241937562"/>
       <w:bookmarkEnd w:id="20"/>
       <w:r>
         <w:rPr>
@@ -28335,7 +28335,7 @@
         <w:ind w:firstLine="709"/>
       </w:pPr>
       <w:bookmarkStart w:id="24" w:name="_1bfdad9d2d88ddb6ca16c31c1d4d4943679f32f"/>
-      <w:bookmarkStart w:id="25" w:name="_Toc241936454"/>
+      <w:bookmarkStart w:id="25" w:name="_Toc241937563"/>
       <w:bookmarkEnd w:id="22"/>
       <w:bookmarkEnd w:id="2"/>
       <w:r>
@@ -28556,7 +28556,7 @@
         <w:jc w:val="center"/>
       </w:pPr>
       <w:bookmarkStart w:id="26" w:name="_выводы"/>
-      <w:bookmarkStart w:id="27" w:name="_Toc241936455"/>
+      <w:bookmarkStart w:id="27" w:name="_Toc241937564"/>
       <w:bookmarkEnd w:id="24"/>
       <w:r>
         <w:rPr>
@@ -28817,7 +28817,7 @@
         <w:jc w:val="center"/>
       </w:pPr>
       <w:bookmarkStart w:id="28" w:name="_274f6a444530ef90b0479dabf3d210f01e97699"/>
-      <w:bookmarkStart w:id="29" w:name="_Toc241936456"/>
+      <w:bookmarkStart w:id="29" w:name="_Toc241937565"/>
       <w:bookmarkEnd w:id="26"/>
       <w:r>
         <w:rPr>
@@ -30612,6 +30612,231 @@
     </w:p>
     <w:p>
       <w:pPr>
+        <w:pStyle w:val="FirstParagraph"/>
+        <w:numPr>
+          <w:ilvl w:val="0"/>
+          <w:numId w:val="3"/>
+        </w:numPr>
+        <w:spacing w:before="0" w:after="0" w:line="360" w:lineRule="exact"/>
+        <w:ind w:left="709" w:hanging="425"/>
+        <w:jc w:val="both"/>
+      </w:pPr>
+      <w:r>
+        <w:rPr>
+          <w:i/>
+          <w:sz w:val="28"/>
+        </w:rPr>
+        <w:t>Tracxn</w:t>
+      </w:r>
+      <w:r>
+        <w:rPr>
+          <w:sz w:val="28"/>
+        </w:rPr>
+        <w:t xml:space="preserve">. </w:t>
+      </w:r>
+      <w:r>
+        <w:rPr>
+          <w:i/>
+          <w:sz w:val="28"/>
+        </w:rPr>
+        <w:t>Operis</w:t>
+      </w:r>
+      <w:r>
+        <w:rPr>
+          <w:sz w:val="28"/>
+        </w:rPr>
+        <w:t xml:space="preserve"> </w:t>
+      </w:r>
+      <w:r>
+        <w:rPr>
+          <w:i/>
+          <w:sz w:val="28"/>
+        </w:rPr>
+        <w:t>Group</w:t>
+      </w:r>
+      <w:r>
+        <w:rPr>
+          <w:sz w:val="28"/>
+        </w:rPr>
+        <w:t xml:space="preserve"> </w:t>
+      </w:r>
+      <w:r>
+        <w:rPr>
+          <w:i/>
+          <w:sz w:val="28"/>
+        </w:rPr>
+        <w:t>Limited</w:t>
+      </w:r>
+      <w:r>
+        <w:rPr>
+          <w:sz w:val="28"/>
+        </w:rPr>
+        <w:t xml:space="preserve"> - 2025 </w:t>
+      </w:r>
+      <w:r>
+        <w:rPr>
+          <w:i/>
+          <w:sz w:val="28"/>
+        </w:rPr>
+        <w:t>Company</w:t>
+      </w:r>
+      <w:r>
+        <w:rPr>
+          <w:sz w:val="28"/>
+        </w:rPr>
+        <w:t xml:space="preserve"> </w:t>
+      </w:r>
+      <w:r>
+        <w:rPr>
+          <w:i/>
+          <w:sz w:val="28"/>
+        </w:rPr>
+        <w:t>Profile</w:t>
+      </w:r>
+      <w:r>
+        <w:rPr>
+          <w:sz w:val="28"/>
+        </w:rPr>
+        <w:t xml:space="preserve"> </w:t>
+      </w:r>
+      <w:r>
+        <w:rPr>
+          <w:i/>
+          <w:sz w:val="28"/>
+        </w:rPr>
+        <w:t>and</w:t>
+      </w:r>
+      <w:r>
+        <w:rPr>
+          <w:sz w:val="28"/>
+        </w:rPr>
+        <w:t xml:space="preserve"> </w:t>
+      </w:r>
+      <w:r>
+        <w:rPr>
+          <w:i/>
+          <w:sz w:val="28"/>
+        </w:rPr>
+        <w:t>Financials</w:t>
+      </w:r>
+      <w:r>
+        <w:rPr>
+          <w:sz w:val="28"/>
+        </w:rPr>
+        <w:t xml:space="preserve"> [Электронный ресурс]. – Режим доступа: https://tracxn.com/d/legal-entities/united-kingdom/operis-group-limited/__w42ZiByEDopkOdfs8fgtMv</w:t>
+      </w:r>
+      <w:r>
+        <w:rPr>
+          <w:sz w:val="28"/>
+        </w:rPr>
+        <w:t>wsyZf6TUz2VmMuk1AKBc0. – Дата доступа: 03.10.2026.</w:t>
+      </w:r>
+    </w:p>
+    <w:p>
+      <w:pPr>
+        <w:pStyle w:val="FirstParagraph"/>
+        <w:numPr>
+          <w:ilvl w:val="0"/>
+          <w:numId w:val="3"/>
+        </w:numPr>
+        <w:spacing w:before="0" w:after="0" w:line="360" w:lineRule="exact"/>
+        <w:ind w:left="709" w:hanging="425"/>
+        <w:jc w:val="both"/>
+      </w:pPr>
+      <w:r>
+        <w:rPr>
+          <w:i/>
+          <w:sz w:val="28"/>
+        </w:rPr>
+        <w:t>ZoomInfo</w:t>
+      </w:r>
+      <w:r>
+        <w:rPr>
+          <w:sz w:val="28"/>
+        </w:rPr>
+        <w:t xml:space="preserve">. </w:t>
+      </w:r>
+      <w:r>
+        <w:rPr>
+          <w:i/>
+          <w:sz w:val="28"/>
+        </w:rPr>
+        <w:t>Arixcel</w:t>
+      </w:r>
+      <w:r>
+        <w:rPr>
+          <w:sz w:val="28"/>
+        </w:rPr>
+        <w:t xml:space="preserve"> - </w:t>
+      </w:r>
+      <w:r>
+        <w:rPr>
+          <w:i/>
+          <w:sz w:val="28"/>
+        </w:rPr>
+        <w:t>Overview</w:t>
+      </w:r>
+      <w:r>
+        <w:rPr>
+          <w:sz w:val="28"/>
+        </w:rPr>
+        <w:t xml:space="preserve">, </w:t>
+      </w:r>
+      <w:r>
+        <w:rPr>
+          <w:i/>
+          <w:sz w:val="28"/>
+        </w:rPr>
+        <w:t>News</w:t>
+      </w:r>
+      <w:r>
+        <w:rPr>
+          <w:sz w:val="28"/>
+        </w:rPr>
+        <w:t xml:space="preserve"> </w:t>
+      </w:r>
+      <w:r>
+        <w:rPr>
+          <w:i/>
+          <w:sz w:val="28"/>
+        </w:rPr>
+        <w:t>and</w:t>
+      </w:r>
+      <w:r>
+        <w:rPr>
+          <w:sz w:val="28"/>
+        </w:rPr>
+        <w:t xml:space="preserve"> </w:t>
+      </w:r>
+      <w:r>
+        <w:rPr>
+          <w:i/>
+          <w:sz w:val="28"/>
+        </w:rPr>
+        <w:t>Similar</w:t>
+      </w:r>
+      <w:r>
+        <w:rPr>
+          <w:sz w:val="28"/>
+        </w:rPr>
+        <w:t xml:space="preserve"> </w:t>
+      </w:r>
+      <w:r>
+        <w:rPr>
+          <w:i/>
+          <w:sz w:val="28"/>
+        </w:rPr>
+        <w:t>companies</w:t>
+      </w:r>
+      <w:r>
+        <w:rPr>
+          <w:sz w:val="28"/>
+        </w:rPr>
+        <w:t xml:space="preserve"> [Электронный ресурс]. – Режим доступа: https://www.zoominfo.com/c/arixcel/345716426. – Дата доступа: 03.10.2026.</w:t>
+      </w:r>
+    </w:p>
+    <w:p>
+      <w:pPr>
         <w:pStyle w:val="1"/>
         <w:keepNext w:val="0"/>
         <w:pageBreakBefore/>
@@ -30619,7 +30844,7 @@
         <w:jc w:val="center"/>
       </w:pPr>
       <w:bookmarkStart w:id="30" w:name="_3d74faf1500c1b2a4a8bfa8e0e37c74206ce73d"/>
-      <w:bookmarkStart w:id="31" w:name="_Toc241936457"/>
+      <w:bookmarkStart w:id="31" w:name="_Toc241937566"/>
       <w:bookmarkEnd w:id="28"/>
       <w:r>
         <w:rPr>
@@ -31360,7 +31585,7 @@
         <w:jc w:val="center"/>
       </w:pPr>
       <w:bookmarkStart w:id="32" w:name="_d684f183eb868ee4ace295916bed2e6be64d16e"/>
-      <w:bookmarkStart w:id="33" w:name="_Toc241936458"/>
+      <w:bookmarkStart w:id="33" w:name="_Toc241937567"/>
       <w:bookmarkEnd w:id="30"/>
       <w:r>
         <w:rPr>
@@ -31394,14 +31619,7 @@
           <w:b/>
           <w:sz w:val="28"/>
         </w:rPr>
-        <w:t xml:space="preserve">Данные, </w:t>
-      </w:r>
-      <w:r>
-        <w:rPr>
-          <w:b/>
-          <w:sz w:val="28"/>
-        </w:rPr>
-        <w:t>которые необходимо доснять</w:t>
+        <w:t>Данные, которые необходимо доснять</w:t>
       </w:r>
     </w:p>
     <w:p>
@@ -31442,13 +31660,7 @@
         <w:rPr>
           <w:sz w:val="28"/>
         </w:rPr>
-        <w:t>Таблица 22 – Перечень данных, требующих получения или уточ</w:t>
-      </w:r>
-      <w:r>
-        <w:rPr>
-          <w:sz w:val="28"/>
-        </w:rPr>
-        <w:t>нения</w:t>
+        <w:t>Таблица 22 – Перечень данных, требующих получения или уточнения</w:t>
       </w:r>
     </w:p>
     <w:tbl>
@@ -31621,7 +31833,91 @@
               <w:rPr>
                 <w:sz w:val="24"/>
               </w:rPr>
-              <w:t>Еще страницы сайтов (регистрация, оплата, документация, интеграции); безопасность, цены и загрузка просмотрены 03.10.2026 (приложение Д)</w:t>
+              <w:t xml:space="preserve">Недоступные страницы сайтов (безопасность </w:t>
+            </w:r>
+            <w:r>
+              <w:rPr>
+                <w:i/>
+                <w:sz w:val="24"/>
+              </w:rPr>
+              <w:t>Shortcut</w:t>
+            </w:r>
+            <w:r>
+              <w:rPr>
+                <w:sz w:val="24"/>
+              </w:rPr>
+              <w:t xml:space="preserve">, </w:t>
+            </w:r>
+            <w:r>
+              <w:rPr>
+                <w:i/>
+                <w:sz w:val="24"/>
+              </w:rPr>
+              <w:t>PerfectXL</w:t>
+            </w:r>
+            <w:r>
+              <w:rPr>
+                <w:sz w:val="24"/>
+              </w:rPr>
+              <w:t xml:space="preserve">, </w:t>
+            </w:r>
+            <w:r>
+              <w:rPr>
+                <w:i/>
+                <w:sz w:val="24"/>
+              </w:rPr>
+              <w:t>Datarails</w:t>
+            </w:r>
+            <w:r>
+              <w:rPr>
+                <w:sz w:val="24"/>
+              </w:rPr>
+              <w:t xml:space="preserve">, </w:t>
+            </w:r>
+            <w:r>
+              <w:rPr>
+                <w:i/>
+                <w:sz w:val="24"/>
+              </w:rPr>
+              <w:t>Numerous.ai</w:t>
+            </w:r>
+            <w:r>
+              <w:rPr>
+                <w:sz w:val="24"/>
+              </w:rPr>
+              <w:t xml:space="preserve">; пробный период </w:t>
+            </w:r>
+            <w:r>
+              <w:rPr>
+                <w:i/>
+                <w:sz w:val="24"/>
+              </w:rPr>
+              <w:t>PerfectXL</w:t>
+            </w:r>
+            <w:r>
+              <w:rPr>
+                <w:sz w:val="24"/>
+              </w:rPr>
+              <w:t xml:space="preserve">; интеграции </w:t>
+            </w:r>
+            <w:r>
+              <w:rPr>
+                <w:i/>
+                <w:sz w:val="24"/>
+              </w:rPr>
+              <w:t>DataSnipper</w:t>
+            </w:r>
+            <w:r>
+              <w:rPr>
+                <w:sz w:val="24"/>
+              </w:rPr>
+              <w:t xml:space="preserve">); </w:t>
+            </w:r>
+            <w:r>
+              <w:rPr>
+                <w:sz w:val="24"/>
+              </w:rPr>
+              <w:t>остальные 9 страниц просмотрены 03.10.2026 (приложение Д)</w:t>
             </w:r>
           </w:p>
         </w:tc>
@@ -31819,7 +32115,13 @@
               <w:rPr>
                 <w:sz w:val="24"/>
               </w:rPr>
-              <w:t>оценки третьих сторон найдены (приложение Д ЛР2-3, низкая надежность); точные цены - запросом прайса или демо</w:t>
+              <w:t>оценки третьих сторон на</w:t>
+            </w:r>
+            <w:r>
+              <w:rPr>
+                <w:sz w:val="24"/>
+              </w:rPr>
+              <w:t>йдены (приложение Д ЛР2-3, низкая надежность); точные цены - запросом прайса или демо</w:t>
             </w:r>
           </w:p>
         </w:tc>
@@ -31901,13 +32203,7 @@
               <w:rPr>
                 <w:sz w:val="24"/>
               </w:rPr>
-              <w:t>аудитория студен</w:t>
-            </w:r>
-            <w:r>
-              <w:rPr>
-                <w:sz w:val="24"/>
-              </w:rPr>
-              <w:t>тки</w:t>
+              <w:t>аудитория студентки</w:t>
             </w:r>
           </w:p>
         </w:tc>
@@ -31926,7 +32222,13 @@
               <w:rPr>
                 <w:sz w:val="24"/>
               </w:rPr>
-              <w:t>анкета функциональных и дисфункциональных вопросов; пока использованы модельные данные (приложение Г)</w:t>
+              <w:t>анкета функциональных и дисфункциональных вопросов; пока использованы модельные дан</w:t>
+            </w:r>
+            <w:r>
+              <w:rPr>
+                <w:sz w:val="24"/>
+              </w:rPr>
+              <w:t>ные (приложение Г)</w:t>
             </w:r>
           </w:p>
         </w:tc>
@@ -32104,6 +32406,7 @@
               <w:rPr>
                 <w:sz w:val="24"/>
               </w:rPr>
+              <w:lastRenderedPageBreak/>
               <w:t>5</w:t>
             </w:r>
           </w:p>
@@ -32175,27 +32478,85 @@
               <w:rPr>
                 <w:sz w:val="24"/>
               </w:rPr>
-              <w:t xml:space="preserve">финансирование найдено в открытых источниках (приложение Д); выручку и штат уточнить в </w:t>
-            </w:r>
-            <w:r>
-              <w:rPr>
-                <w:i/>
-                <w:sz w:val="24"/>
-              </w:rPr>
-              <w:t>Crunchbase</w:t>
-            </w:r>
-            <w:r>
-              <w:rPr>
-                <w:sz w:val="24"/>
-              </w:rPr>
-              <w:t xml:space="preserve"> и </w:t>
-            </w:r>
-            <w:r>
-              <w:rPr>
-                <w:i/>
-                <w:sz w:val="24"/>
-              </w:rPr>
-              <w:t>LinkedIn</w:t>
+              <w:t xml:space="preserve">финансирование, выручка и штат найдены в открытых источниках для </w:t>
+            </w:r>
+            <w:r>
+              <w:rPr>
+                <w:i/>
+                <w:sz w:val="24"/>
+              </w:rPr>
+              <w:t>DataSnipper</w:t>
+            </w:r>
+            <w:r>
+              <w:rPr>
+                <w:sz w:val="24"/>
+              </w:rPr>
+              <w:t xml:space="preserve">, </w:t>
+            </w:r>
+            <w:r>
+              <w:rPr>
+                <w:i/>
+                <w:sz w:val="24"/>
+              </w:rPr>
+              <w:t>Datarails</w:t>
+            </w:r>
+            <w:r>
+              <w:rPr>
+                <w:sz w:val="24"/>
+              </w:rPr>
+              <w:t xml:space="preserve">, </w:t>
+            </w:r>
+            <w:r>
+              <w:rPr>
+                <w:i/>
+                <w:sz w:val="24"/>
+              </w:rPr>
+              <w:t>Shortcut</w:t>
+            </w:r>
+            <w:r>
+              <w:rPr>
+                <w:sz w:val="24"/>
+              </w:rPr>
+              <w:t xml:space="preserve">, </w:t>
+            </w:r>
+            <w:r>
+              <w:rPr>
+                <w:i/>
+                <w:sz w:val="24"/>
+              </w:rPr>
+              <w:t>Operis</w:t>
+            </w:r>
+            <w:r>
+              <w:rPr>
+                <w:sz w:val="24"/>
+              </w:rPr>
+              <w:t xml:space="preserve">, </w:t>
+            </w:r>
+            <w:r>
+              <w:rPr>
+                <w:i/>
+                <w:sz w:val="24"/>
+              </w:rPr>
+              <w:t>Arixcel</w:t>
+            </w:r>
+            <w:r>
+              <w:rPr>
+                <w:sz w:val="24"/>
+              </w:rPr>
+              <w:t xml:space="preserve"> (приложение Д); для </w:t>
+            </w:r>
+            <w:r>
+              <w:rPr>
+                <w:i/>
+                <w:sz w:val="24"/>
+              </w:rPr>
+              <w:t>Numerous.ai</w:t>
+            </w:r>
+            <w:r>
+              <w:rPr>
+                <w:sz w:val="24"/>
+              </w:rPr>
+              <w:t xml:space="preserve"> данных нет</w:t>
             </w:r>
           </w:p>
         </w:tc>
@@ -32214,13 +32575,7 @@
               <w:rPr>
                 <w:sz w:val="24"/>
               </w:rPr>
-              <w:t>лист 08_О</w:t>
-            </w:r>
-            <w:r>
-              <w:rPr>
-                <w:sz w:val="24"/>
-              </w:rPr>
-              <w:t>перац_модель</w:t>
+              <w:t>лист 08_Операц_модель</w:t>
             </w:r>
           </w:p>
         </w:tc>
@@ -32275,7 +32630,7 @@
         <w:jc w:val="center"/>
       </w:pPr>
       <w:bookmarkStart w:id="34" w:name="_cb59224a7032ef66ab429e7df9b4e4c597bc187"/>
-      <w:bookmarkStart w:id="35" w:name="_Toc241936459"/>
+      <w:bookmarkStart w:id="35" w:name="_Toc241937568"/>
       <w:bookmarkEnd w:id="32"/>
       <w:r>
         <w:rPr>
@@ -32323,7 +32678,13 @@
         <w:rPr>
           <w:sz w:val="28"/>
         </w:rPr>
-        <w:t>В шаблонах выявлены ошибки и ограничения совместимости; ниже перечислено, что исправлено в рабочих копиях. Оригиналы не менялись.</w:t>
+        <w:t>В шаблонах выявлены ошибки и ограничения совместимости; ниже перечислено, что исправлен</w:t>
+      </w:r>
+      <w:r>
+        <w:rPr>
+          <w:sz w:val="28"/>
+        </w:rPr>
+        <w:t>о в рабочих копиях. Оригиналы не менялись.</w:t>
       </w:r>
     </w:p>
     <w:p>
@@ -33021,7 +33382,7 @@
         <w:jc w:val="center"/>
       </w:pPr>
       <w:bookmarkStart w:id="36" w:name="_c34bf756927ff692ee086e018f9b8545647766e"/>
-      <w:bookmarkStart w:id="37" w:name="_Toc241936460"/>
+      <w:bookmarkStart w:id="37" w:name="_Toc241937569"/>
       <w:bookmarkEnd w:id="34"/>
       <w:r>
         <w:rPr>
@@ -33069,7 +33430,13 @@
         <w:rPr>
           <w:sz w:val="28"/>
         </w:rPr>
-        <w:t xml:space="preserve">Для проверки методики Кано сгенерированы модельные ответы 30 условных респондентов на пары функциональных и дисфункциональных вопросов по 16 функциям (по решению студентки, Р-8; генератор и файлы - в папке 00_Общее/Опрос_модельный, </w:t>
+        <w:t>Для проверки методики Кано сгенерированы модельные ответы 30 условных респондентов на пары ф</w:t>
+      </w:r>
+      <w:r>
+        <w:rPr>
+          <w:sz w:val="28"/>
+        </w:rPr>
+        <w:t xml:space="preserve">ункциональных и дисфункциональных вопросов по 16 функциям (по решению студентки, Р-8; генератор и файлы - в папке 00_Общее/Опрос_модельный, </w:t>
       </w:r>
       <w:r>
         <w:rPr>
@@ -33082,13 +33449,13 @@
         <w:rPr>
           <w:sz w:val="28"/>
         </w:rPr>
-        <w:t xml:space="preserve"> 20261003). Это моде</w:t>
-      </w:r>
-      <w:r>
-        <w:rPr>
-          <w:sz w:val="28"/>
-        </w:rPr>
-        <w:t>льные данные, а не опрос людей: вероятность согласия с категорией аналитика задана параметром 58 %, поэтому совпадение с таблицей 6 неизбежно и подтверждает только работу расчета, а не истинность категорий.</w:t>
+        <w:t xml:space="preserve"> 20261003). Это модельные данные, а не опрос людей: вероятность согласия с категорией аналитика задана параметро</w:t>
+      </w:r>
+      <w:r>
+        <w:rPr>
+          <w:sz w:val="28"/>
+        </w:rPr>
+        <w:t>м 58 %, поэтому совпадение с таблицей 6 неизбежно и подтверждает только работу расчета, а не истинность категорий.</w:t>
       </w:r>
     </w:p>
     <w:p>
@@ -33102,13 +33469,7 @@
         <w:rPr>
           <w:sz w:val="28"/>
         </w:rPr>
-        <w:t>В таблице 24 представлено: модельные категории Ка</w:t>
-      </w:r>
-      <w:r>
-        <w:rPr>
-          <w:sz w:val="28"/>
-        </w:rPr>
-        <w:t>но по функциям.</w:t>
+        <w:t>В таблице 24 представлено: модельные категории Кано по функциям.</w:t>
       </w:r>
     </w:p>
     <w:p>
@@ -35360,13 +35721,13 @@
         <w:rPr>
           <w:sz w:val="28"/>
         </w:rPr>
-        <w:t xml:space="preserve">-пояснения и </w:t>
-      </w:r>
-      <w:r>
-        <w:rPr>
-          <w:sz w:val="28"/>
-        </w:rPr>
-        <w:t>подсказки», «Сравнение версий файлов».</w:t>
+        <w:t>-пояснения и подсказки», «Ср</w:t>
+      </w:r>
+      <w:r>
+        <w:rPr>
+          <w:sz w:val="28"/>
+        </w:rPr>
+        <w:t>авнение версий файлов».</w:t>
       </w:r>
     </w:p>
     <w:p>
@@ -35393,13 +35754,7 @@
         <w:rPr>
           <w:sz w:val="28"/>
         </w:rPr>
-        <w:t xml:space="preserve"> заменяется, а модальные категории и коэффициенты пересчитываются тем же скриптом; категории в листе 04_Кано книги корректируются по </w:t>
-      </w:r>
-      <w:r>
-        <w:rPr>
-          <w:sz w:val="28"/>
-        </w:rPr>
-        <w:t>результату.</w:t>
+        <w:t xml:space="preserve"> заменяется, а модальные категории и коэффициенты пересчитываются тем же скриптом; категории в листе 04_Кано книги корректируются по результату.</w:t>
       </w:r>
     </w:p>
     <w:p>
@@ -35411,7 +35766,7 @@
         <w:jc w:val="center"/>
       </w:pPr>
       <w:bookmarkStart w:id="38" w:name="_fced6403ae4a6291124e2bc0068517b8abae511"/>
-      <w:bookmarkStart w:id="39" w:name="_Toc241936461"/>
+      <w:bookmarkStart w:id="39" w:name="_Toc241937570"/>
       <w:bookmarkEnd w:id="36"/>
       <w:r>
         <w:rPr>
@@ -35419,7 +35774,14 @@
           <w:sz w:val="28"/>
         </w:rPr>
         <w:lastRenderedPageBreak/>
-        <w:t>ПРИЛОЖЕНИЕ Д</w:t>
+        <w:t>ПРИ</w:t>
+      </w:r>
+      <w:r>
+        <w:rPr>
+          <w:b/>
+          <w:sz w:val="28"/>
+        </w:rPr>
+        <w:t>ЛОЖЕНИЕ Д</w:t>
       </w:r>
       <w:bookmarkEnd w:id="39"/>
     </w:p>
@@ -35485,13 +35847,13 @@
         <w:rPr>
           <w:sz w:val="28"/>
         </w:rPr>
-        <w:t xml:space="preserve">, доступ к которым требует личного аккаунта, финансирование и размер компаний найдены в новостях и пресс-релизах 03.10.2026. Значения </w:t>
-      </w:r>
-      <w:r>
-        <w:rPr>
-          <w:sz w:val="28"/>
-        </w:rPr>
-        <w:t>справочные и в расчетах баллов ЛР5 не использовались.</w:t>
+        <w:t xml:space="preserve">, доступ к которым требует личного аккаунта, финансирование и размер компаний найдены в новостях и пресс-релизах 03.10.2026. Значения справочные и в </w:t>
+      </w:r>
+      <w:r>
+        <w:rPr>
+          <w:sz w:val="28"/>
+        </w:rPr>
+        <w:t>расчетах баллов ЛР5 не использовались.</w:t>
       </w:r>
     </w:p>
     <w:p>
@@ -35647,14 +36009,7 @@
                 <w:b/>
                 <w:sz w:val="24"/>
               </w:rPr>
-              <w:t>Надеж</w:t>
-            </w:r>
-            <w:r>
-              <w:rPr>
-                <w:b/>
-                <w:sz w:val="24"/>
-              </w:rPr>
-              <w:t>ность</w:t>
+              <w:t>Надежность</w:t>
             </w:r>
           </w:p>
         </w:tc>
@@ -36015,7 +36370,14 @@
                 <w:i/>
                 <w:sz w:val="24"/>
               </w:rPr>
-              <w:t>Research</w:t>
+              <w:t>Researc</w:t>
+            </w:r>
+            <w:r>
+              <w:rPr>
+                <w:i/>
+                <w:sz w:val="24"/>
+              </w:rPr>
+              <w:t>h</w:t>
             </w:r>
             <w:r>
               <w:rPr>
@@ -36221,6 +36583,283 @@
                 <w:i/>
                 <w:sz w:val="24"/>
               </w:rPr>
+              <w:t>Operis</w:t>
+            </w:r>
+            <w:r>
+              <w:rPr>
+                <w:sz w:val="24"/>
+              </w:rPr>
+              <w:t xml:space="preserve"> </w:t>
+            </w:r>
+            <w:r>
+              <w:rPr>
+                <w:i/>
+                <w:sz w:val="24"/>
+              </w:rPr>
+              <w:t>Group</w:t>
+            </w:r>
+          </w:p>
+        </w:tc>
+        <w:tc>
+          <w:tcPr>
+            <w:tcW w:w="1852" w:type="dxa"/>
+            <w:vAlign w:val="center"/>
+          </w:tcPr>
+          <w:p>
+            <w:pPr>
+              <w:pStyle w:val="Compact"/>
+              <w:spacing w:before="0" w:after="0" w:line="280" w:lineRule="exact"/>
+              <w:jc w:val="center"/>
+            </w:pPr>
+            <w:r>
+              <w:rPr>
+                <w:sz w:val="24"/>
+              </w:rPr>
+              <w:t>Выручка и размер</w:t>
+            </w:r>
+          </w:p>
+        </w:tc>
+        <w:tc>
+          <w:tcPr>
+            <w:tcW w:w="2424" w:type="dxa"/>
+            <w:vAlign w:val="center"/>
+          </w:tcPr>
+          <w:p>
+            <w:pPr>
+              <w:pStyle w:val="Compact"/>
+              <w:spacing w:before="0" w:after="0" w:line="280" w:lineRule="exact"/>
+              <w:jc w:val="center"/>
+            </w:pPr>
+            <w:r>
+              <w:rPr>
+                <w:sz w:val="24"/>
+              </w:rPr>
+              <w:t xml:space="preserve">выручка 5,68 млн </w:t>
+            </w:r>
+            <w:r>
+              <w:rPr>
+                <w:i/>
+                <w:sz w:val="24"/>
+              </w:rPr>
+              <w:t>GBP</w:t>
+            </w:r>
+            <w:r>
+              <w:rPr>
+                <w:sz w:val="24"/>
+              </w:rPr>
+              <w:t xml:space="preserve"> за 2022 год; 51-100 сотрудников; в Великобритании с 1997 года; консалтинг, аудит моделей, надстройка </w:t>
+            </w:r>
+            <w:r>
+              <w:rPr>
+                <w:i/>
+                <w:sz w:val="24"/>
+              </w:rPr>
+              <w:t>OAK</w:t>
+            </w:r>
+          </w:p>
+        </w:tc>
+        <w:tc>
+          <w:tcPr>
+            <w:tcW w:w="1123" w:type="dxa"/>
+            <w:vAlign w:val="center"/>
+          </w:tcPr>
+          <w:p>
+            <w:pPr>
+              <w:pStyle w:val="Compact"/>
+              <w:spacing w:before="0" w:after="0" w:line="280" w:lineRule="exact"/>
+              <w:jc w:val="center"/>
+            </w:pPr>
+            <w:r>
+              <w:rPr>
+                <w:sz w:val="24"/>
+              </w:rPr>
+              <w:t>[21]</w:t>
+            </w:r>
+          </w:p>
+        </w:tc>
+        <w:tc>
+          <w:tcPr>
+            <w:tcW w:w="2327" w:type="dxa"/>
+            <w:vAlign w:val="center"/>
+          </w:tcPr>
+          <w:p>
+            <w:pPr>
+              <w:pStyle w:val="Compact"/>
+              <w:spacing w:before="0" w:after="0" w:line="280" w:lineRule="exact"/>
+              <w:jc w:val="center"/>
+            </w:pPr>
+            <w:r>
+              <w:rPr>
+                <w:sz w:val="24"/>
+              </w:rPr>
+              <w:t xml:space="preserve">средняя (данные каталога по отчетности </w:t>
+            </w:r>
+            <w:r>
+              <w:rPr>
+                <w:i/>
+                <w:sz w:val="24"/>
+              </w:rPr>
+              <w:t>Companies</w:t>
+            </w:r>
+            <w:r>
+              <w:rPr>
+                <w:sz w:val="24"/>
+              </w:rPr>
+              <w:t xml:space="preserve"> </w:t>
+            </w:r>
+            <w:r>
+              <w:rPr>
+                <w:i/>
+                <w:sz w:val="24"/>
+              </w:rPr>
+              <w:t>House</w:t>
+            </w:r>
+            <w:r>
+              <w:rPr>
+                <w:sz w:val="24"/>
+              </w:rPr>
+              <w:t>)</w:t>
+            </w:r>
+          </w:p>
+        </w:tc>
+      </w:tr>
+      <w:tr>
+        <w:trPr>
+          <w:cantSplit/>
+          <w:jc w:val="center"/>
+        </w:trPr>
+        <w:tc>
+          <w:tcPr>
+            <w:tcW w:w="1629" w:type="dxa"/>
+            <w:vAlign w:val="center"/>
+          </w:tcPr>
+          <w:p>
+            <w:pPr>
+              <w:pStyle w:val="Compact"/>
+              <w:spacing w:before="0" w:after="0" w:line="280" w:lineRule="exact"/>
+              <w:jc w:val="center"/>
+            </w:pPr>
+            <w:r>
+              <w:rPr>
+                <w:i/>
+                <w:sz w:val="24"/>
+              </w:rPr>
+              <w:t>Arixcel</w:t>
+            </w:r>
+          </w:p>
+        </w:tc>
+        <w:tc>
+          <w:tcPr>
+            <w:tcW w:w="1852" w:type="dxa"/>
+            <w:vAlign w:val="center"/>
+          </w:tcPr>
+          <w:p>
+            <w:pPr>
+              <w:pStyle w:val="Compact"/>
+              <w:spacing w:before="0" w:after="0" w:line="280" w:lineRule="exact"/>
+              <w:jc w:val="center"/>
+            </w:pPr>
+            <w:r>
+              <w:rPr>
+                <w:sz w:val="24"/>
+              </w:rPr>
+              <w:t>Размер</w:t>
+            </w:r>
+          </w:p>
+        </w:tc>
+        <w:tc>
+          <w:tcPr>
+            <w:tcW w:w="2424" w:type="dxa"/>
+            <w:vAlign w:val="center"/>
+          </w:tcPr>
+          <w:p>
+            <w:pPr>
+              <w:pStyle w:val="Compact"/>
+              <w:spacing w:before="0" w:after="0" w:line="280" w:lineRule="exact"/>
+              <w:jc w:val="center"/>
+            </w:pPr>
+            <w:r>
+              <w:rPr>
+                <w:sz w:val="24"/>
+              </w:rPr>
+              <w:t xml:space="preserve">Западная Австралия; 1-10 сотрудников; выручка менее 5 млн </w:t>
+            </w:r>
+            <w:r>
+              <w:rPr>
+                <w:i/>
+                <w:sz w:val="24"/>
+              </w:rPr>
+              <w:t>USD</w:t>
+            </w:r>
+            <w:r>
+              <w:rPr>
+                <w:sz w:val="24"/>
+              </w:rPr>
+              <w:t xml:space="preserve"> (оценка каталога)</w:t>
+            </w:r>
+          </w:p>
+        </w:tc>
+        <w:tc>
+          <w:tcPr>
+            <w:tcW w:w="1123" w:type="dxa"/>
+            <w:vAlign w:val="center"/>
+          </w:tcPr>
+          <w:p>
+            <w:pPr>
+              <w:pStyle w:val="Compact"/>
+              <w:spacing w:before="0" w:after="0" w:line="280" w:lineRule="exact"/>
+              <w:jc w:val="center"/>
+            </w:pPr>
+            <w:r>
+              <w:rPr>
+                <w:sz w:val="24"/>
+              </w:rPr>
+              <w:t>[22]</w:t>
+            </w:r>
+          </w:p>
+        </w:tc>
+        <w:tc>
+          <w:tcPr>
+            <w:tcW w:w="2327" w:type="dxa"/>
+            <w:vAlign w:val="center"/>
+          </w:tcPr>
+          <w:p>
+            <w:pPr>
+              <w:pStyle w:val="Compact"/>
+              <w:spacing w:before="0" w:after="0" w:line="280" w:lineRule="exact"/>
+              <w:jc w:val="center"/>
+            </w:pPr>
+            <w:r>
+              <w:rPr>
+                <w:sz w:val="24"/>
+              </w:rPr>
+              <w:t>низкая (оценка каталога)</w:t>
+            </w:r>
+          </w:p>
+        </w:tc>
+      </w:tr>
+      <w:tr>
+        <w:trPr>
+          <w:cantSplit/>
+          <w:jc w:val="center"/>
+        </w:trPr>
+        <w:tc>
+          <w:tcPr>
+            <w:tcW w:w="1629" w:type="dxa"/>
+            <w:vAlign w:val="center"/>
+          </w:tcPr>
+          <w:p>
+            <w:pPr>
+              <w:pStyle w:val="Compact"/>
+              <w:spacing w:before="0" w:after="0" w:line="280" w:lineRule="exact"/>
+              <w:jc w:val="center"/>
+            </w:pPr>
+            <w:r>
+              <w:rPr>
+                <w:i/>
+                <w:sz w:val="24"/>
+              </w:rPr>
+              <w:lastRenderedPageBreak/>
               <w:t>PerfectXL</w:t>
             </w:r>
             <w:r>
@@ -36291,7 +36930,13 @@
               <w:rPr>
                 <w:sz w:val="24"/>
               </w:rPr>
-              <w:t>основана в Амстердаме, связана с Делфтским техническим университетом; по каталогам около 4 сотрудников, инвестиции не раскрыты</w:t>
+              <w:t xml:space="preserve">основана в Амстердаме, связана с Делфтским техническим университетом; по каталогам около 4 сотрудников, </w:t>
+            </w:r>
+            <w:r>
+              <w:rPr>
+                <w:sz w:val="24"/>
+              </w:rPr>
+              <w:t>инвестиции не раскрыты</w:t>
             </w:r>
           </w:p>
         </w:tc>
@@ -36353,14 +36998,20 @@
           <w:i/>
           <w:sz w:val="28"/>
         </w:rPr>
-        <w:t>Dat</w:t>
+        <w:t>DataSnipper</w:t>
+      </w:r>
+      <w:r>
+        <w:rPr>
+          <w:sz w:val="28"/>
+        </w:rPr>
+        <w:t xml:space="preserve">, </w:t>
       </w:r>
       <w:r>
         <w:rPr>
           <w:i/>
           <w:sz w:val="28"/>
         </w:rPr>
-        <w:t>aSnipper</w:t>
+        <w:t>Datarails</w:t>
       </w:r>
       <w:r>
         <w:rPr>
@@ -36373,7 +37024,33 @@
           <w:i/>
           <w:sz w:val="28"/>
         </w:rPr>
-        <w:t>Datarails</w:t>
+        <w:t>Shortcut</w:t>
+      </w:r>
+      <w:r>
+        <w:rPr>
+          <w:sz w:val="28"/>
+        </w:rPr>
+        <w:t>), консалтинговую компанию с выручкой в единицы миллионов фунтов (</w:t>
+      </w:r>
+      <w:r>
+        <w:rPr>
+          <w:i/>
+          <w:sz w:val="28"/>
+        </w:rPr>
+        <w:t>Operis</w:t>
+      </w:r>
+      <w:r>
+        <w:rPr>
+          <w:sz w:val="28"/>
+        </w:rPr>
+        <w:t>) и малые специализированные компании (</w:t>
+      </w:r>
+      <w:r>
+        <w:rPr>
+          <w:i/>
+          <w:sz w:val="28"/>
+        </w:rPr>
+        <w:t>PerfectXL</w:t>
       </w:r>
       <w:r>
         <w:rPr>
@@ -36386,52 +37063,32 @@
           <w:i/>
           <w:sz w:val="28"/>
         </w:rPr>
-        <w:t>Shortcut</w:t>
-      </w:r>
-      <w:r>
-        <w:rPr>
-          <w:sz w:val="28"/>
-        </w:rPr>
-        <w:t>) и малую специализированную компанию (</w:t>
+        <w:t>Arixcel</w:t>
+      </w:r>
+      <w:r>
+        <w:rPr>
+          <w:sz w:val="28"/>
+        </w:rPr>
+        <w:t xml:space="preserve">). Это поддерживает вывод ЛР4 и ЛР5: рядом с </w:t>
       </w:r>
       <w:r>
         <w:rPr>
           <w:i/>
           <w:sz w:val="28"/>
         </w:rPr>
-        <w:t>PerfectXL</w:t>
-      </w:r>
-      <w:r>
-        <w:rPr>
-          <w:sz w:val="28"/>
-        </w:rPr>
-        <w:t xml:space="preserve">). Это поддерживает вывод ЛР4 и ЛР5: рядом с </w:t>
-      </w:r>
-      <w:r>
-        <w:rPr>
-          <w:i/>
-          <w:sz w:val="28"/>
-        </w:rPr>
         <w:t>TableMind</w:t>
       </w:r>
       <w:r>
         <w:rPr>
           <w:sz w:val="28"/>
         </w:rPr>
-        <w:t xml:space="preserve"> работают сильные, хорошо финансируемые игроки, поэтому ставка на независимость проверки, доказательство находок движком </w:t>
-      </w:r>
-      <w:r>
-        <w:rPr>
-          <w:sz w:val="28"/>
-        </w:rPr>
-        <w:lastRenderedPageBreak/>
-        <w:t>и пр</w:t>
-      </w:r>
-      <w:r>
-        <w:rPr>
-          <w:sz w:val="28"/>
-        </w:rPr>
-        <w:t>озрачную цену должна оставаться отличием, а не гонкой по числу функций.</w:t>
+        <w:t xml:space="preserve"> работают сильные, хорошо финансируемые игроки, поэтому ставка на независимость проверки, доказательство находок движком и прозрачную цену </w:t>
+      </w:r>
+      <w:r>
+        <w:rPr>
+          <w:sz w:val="28"/>
+        </w:rPr>
+        <w:t>должна оставаться отличием, а не гонкой по числу функций.</w:t>
       </w:r>
     </w:p>
     <w:p>
@@ -36478,10 +37135,10 @@
         <w:tblLook w:val="0020" w:firstRow="1" w:lastRow="0" w:firstColumn="0" w:lastColumn="0" w:noHBand="0" w:noVBand="0"/>
       </w:tblPr>
       <w:tblGrid>
-        <w:gridCol w:w="1888"/>
-        <w:gridCol w:w="2079"/>
-        <w:gridCol w:w="2617"/>
-        <w:gridCol w:w="2771"/>
+        <w:gridCol w:w="2127"/>
+        <w:gridCol w:w="2285"/>
+        <w:gridCol w:w="2425"/>
+        <w:gridCol w:w="2518"/>
       </w:tblGrid>
       <w:tr>
         <w:trPr>
@@ -36492,7 +37149,7 @@
         </w:trPr>
         <w:tc>
           <w:tcPr>
-            <w:tcW w:w="1888" w:type="dxa"/>
+            <w:tcW w:w="2126" w:type="dxa"/>
             <w:vAlign w:val="center"/>
           </w:tcPr>
           <w:p>
@@ -36512,7 +37169,7 @@
         </w:tc>
         <w:tc>
           <w:tcPr>
-            <w:tcW w:w="2079" w:type="dxa"/>
+            <w:tcW w:w="2285" w:type="dxa"/>
             <w:vAlign w:val="center"/>
           </w:tcPr>
           <w:p>
@@ -36526,40 +37183,40 @@
                 <w:b/>
                 <w:sz w:val="24"/>
               </w:rPr>
-              <w:t>Стр</w:t>
-            </w:r>
+              <w:t>Страница</w:t>
+            </w:r>
+          </w:p>
+        </w:tc>
+        <w:tc>
+          <w:tcPr>
+            <w:tcW w:w="2425" w:type="dxa"/>
+            <w:vAlign w:val="center"/>
+          </w:tcPr>
+          <w:p>
+            <w:pPr>
+              <w:pStyle w:val="Compact"/>
+              <w:spacing w:before="0" w:after="0" w:line="280" w:lineRule="exact"/>
+              <w:jc w:val="center"/>
+            </w:pPr>
             <w:r>
               <w:rPr>
                 <w:b/>
                 <w:sz w:val="24"/>
               </w:rPr>
-              <w:t>аница</w:t>
-            </w:r>
-          </w:p>
-        </w:tc>
-        <w:tc>
-          <w:tcPr>
-            <w:tcW w:w="2616" w:type="dxa"/>
-            <w:vAlign w:val="center"/>
-          </w:tcPr>
-          <w:p>
-            <w:pPr>
-              <w:pStyle w:val="Compact"/>
-              <w:spacing w:before="0" w:after="0" w:line="280" w:lineRule="exact"/>
-              <w:jc w:val="center"/>
-            </w:pPr>
+              <w:t>Что пока</w:t>
+            </w:r>
             <w:r>
               <w:rPr>
                 <w:b/>
                 <w:sz w:val="24"/>
               </w:rPr>
-              <w:t>Что показано</w:t>
-            </w:r>
-          </w:p>
-        </w:tc>
-        <w:tc>
-          <w:tcPr>
-            <w:tcW w:w="2770" w:type="dxa"/>
+              <w:t>зано</w:t>
+            </w:r>
+          </w:p>
+        </w:tc>
+        <w:tc>
+          <w:tcPr>
+            <w:tcW w:w="2518" w:type="dxa"/>
             <w:vAlign w:val="center"/>
           </w:tcPr>
           <w:p>
@@ -36585,7 +37242,7 @@
         </w:trPr>
         <w:tc>
           <w:tcPr>
-            <w:tcW w:w="1888" w:type="dxa"/>
+            <w:tcW w:w="2126" w:type="dxa"/>
             <w:vAlign w:val="center"/>
           </w:tcPr>
           <w:p>
@@ -36605,7 +37262,7 @@
         </w:tc>
         <w:tc>
           <w:tcPr>
-            <w:tcW w:w="2079" w:type="dxa"/>
+            <w:tcW w:w="2285" w:type="dxa"/>
             <w:vAlign w:val="center"/>
           </w:tcPr>
           <w:p>
@@ -36624,7 +37281,7 @@
         </w:tc>
         <w:tc>
           <w:tcPr>
-            <w:tcW w:w="2616" w:type="dxa"/>
+            <w:tcW w:w="2425" w:type="dxa"/>
             <w:vAlign w:val="center"/>
           </w:tcPr>
           <w:p>
@@ -36761,7 +37418,7 @@
         </w:tc>
         <w:tc>
           <w:tcPr>
-            <w:tcW w:w="2770" w:type="dxa"/>
+            <w:tcW w:w="2518" w:type="dxa"/>
             <w:vAlign w:val="center"/>
           </w:tcPr>
           <w:p>
@@ -36786,7 +37443,7 @@
         </w:trPr>
         <w:tc>
           <w:tcPr>
-            <w:tcW w:w="1888" w:type="dxa"/>
+            <w:tcW w:w="2126" w:type="dxa"/>
             <w:vAlign w:val="center"/>
           </w:tcPr>
           <w:p>
@@ -36806,7 +37463,7 @@
         </w:tc>
         <w:tc>
           <w:tcPr>
-            <w:tcW w:w="2079" w:type="dxa"/>
+            <w:tcW w:w="2285" w:type="dxa"/>
             <w:vAlign w:val="center"/>
           </w:tcPr>
           <w:p>
@@ -36825,7 +37482,7 @@
         </w:tc>
         <w:tc>
           <w:tcPr>
-            <w:tcW w:w="2616" w:type="dxa"/>
+            <w:tcW w:w="2425" w:type="dxa"/>
             <w:vAlign w:val="center"/>
           </w:tcPr>
           <w:p>
@@ -36935,7 +37592,7 @@
         </w:tc>
         <w:tc>
           <w:tcPr>
-            <w:tcW w:w="2770" w:type="dxa"/>
+            <w:tcW w:w="2518" w:type="dxa"/>
             <w:vAlign w:val="center"/>
           </w:tcPr>
           <w:p>
@@ -36960,7 +37617,7 @@
         </w:trPr>
         <w:tc>
           <w:tcPr>
-            <w:tcW w:w="1888" w:type="dxa"/>
+            <w:tcW w:w="2126" w:type="dxa"/>
             <w:vAlign w:val="center"/>
           </w:tcPr>
           <w:p>
@@ -36980,7 +37637,7 @@
         </w:tc>
         <w:tc>
           <w:tcPr>
-            <w:tcW w:w="2079" w:type="dxa"/>
+            <w:tcW w:w="2285" w:type="dxa"/>
             <w:vAlign w:val="center"/>
           </w:tcPr>
           <w:p>
@@ -36999,7 +37656,7 @@
         </w:tc>
         <w:tc>
           <w:tcPr>
-            <w:tcW w:w="2616" w:type="dxa"/>
+            <w:tcW w:w="2425" w:type="dxa"/>
             <w:vAlign w:val="center"/>
           </w:tcPr>
           <w:p>
@@ -37103,19 +37760,19 @@
               <w:rPr>
                 <w:sz w:val="24"/>
               </w:rPr>
-              <w:t>», проб</w:t>
-            </w:r>
-            <w:r>
-              <w:rPr>
-                <w:sz w:val="24"/>
-              </w:rPr>
-              <w:t>ного периода нет</w:t>
-            </w:r>
-          </w:p>
-        </w:tc>
-        <w:tc>
-          <w:tcPr>
-            <w:tcW w:w="2770" w:type="dxa"/>
+              <w:t>», пробного периода</w:t>
+            </w:r>
+            <w:r>
+              <w:rPr>
+                <w:sz w:val="24"/>
+              </w:rPr>
+              <w:t xml:space="preserve"> нет</w:t>
+            </w:r>
+          </w:p>
+        </w:tc>
+        <w:tc>
+          <w:tcPr>
+            <w:tcW w:w="2518" w:type="dxa"/>
             <w:vAlign w:val="center"/>
           </w:tcPr>
           <w:p>
@@ -37140,27 +37797,28 @@
         </w:trPr>
         <w:tc>
           <w:tcPr>
-            <w:tcW w:w="1888" w:type="dxa"/>
-            <w:vAlign w:val="center"/>
-          </w:tcPr>
-          <w:p>
-            <w:pPr>
-              <w:pStyle w:val="Compact"/>
-              <w:spacing w:before="0" w:after="0" w:line="280" w:lineRule="exact"/>
-              <w:jc w:val="center"/>
-            </w:pPr>
-            <w:r>
-              <w:rPr>
-                <w:i/>
-                <w:sz w:val="24"/>
-              </w:rPr>
+            <w:tcW w:w="2126" w:type="dxa"/>
+            <w:vAlign w:val="center"/>
+          </w:tcPr>
+          <w:p>
+            <w:pPr>
+              <w:pStyle w:val="Compact"/>
+              <w:spacing w:before="0" w:after="0" w:line="280" w:lineRule="exact"/>
+              <w:jc w:val="center"/>
+            </w:pPr>
+            <w:r>
+              <w:rPr>
+                <w:i/>
+                <w:sz w:val="24"/>
+              </w:rPr>
+              <w:lastRenderedPageBreak/>
               <w:t>Arixcel</w:t>
             </w:r>
           </w:p>
         </w:tc>
         <w:tc>
           <w:tcPr>
-            <w:tcW w:w="2079" w:type="dxa"/>
+            <w:tcW w:w="2285" w:type="dxa"/>
             <w:vAlign w:val="center"/>
           </w:tcPr>
           <w:p>
@@ -37179,7 +37837,7 @@
         </w:tc>
         <w:tc>
           <w:tcPr>
-            <w:tcW w:w="2616" w:type="dxa"/>
+            <w:tcW w:w="2425" w:type="dxa"/>
             <w:vAlign w:val="center"/>
           </w:tcPr>
           <w:p>
@@ -37231,32 +37889,32 @@
               <w:rPr>
                 <w:sz w:val="24"/>
               </w:rPr>
-              <w:t>, есть пробный режим и раздел информационной безопасности, версия</w:t>
-            </w:r>
-            <w:r>
-              <w:rPr>
-                <w:sz w:val="24"/>
-              </w:rPr>
-              <w:t xml:space="preserve"> 9.0</w:t>
-            </w:r>
-          </w:p>
-        </w:tc>
-        <w:tc>
-          <w:tcPr>
-            <w:tcW w:w="2770" w:type="dxa"/>
-            <w:vAlign w:val="center"/>
-          </w:tcPr>
-          <w:p>
-            <w:pPr>
-              <w:pStyle w:val="Compact"/>
-              <w:spacing w:before="0" w:after="0" w:line="280" w:lineRule="exact"/>
-              <w:jc w:val="center"/>
-            </w:pPr>
-            <w:r>
-              <w:rPr>
-                <w:sz w:val="24"/>
-              </w:rPr>
-              <w:t>цена не скрыта: в книгу бизнес-моделей внесены цена и пробный режим, оценка прозрачности повышена с 1 до 3</w:t>
+              <w:t>, есть пробный режим и раздел информационной безопасности, версия 9.0</w:t>
+            </w:r>
+          </w:p>
+        </w:tc>
+        <w:tc>
+          <w:tcPr>
+            <w:tcW w:w="2518" w:type="dxa"/>
+            <w:vAlign w:val="center"/>
+          </w:tcPr>
+          <w:p>
+            <w:pPr>
+              <w:pStyle w:val="Compact"/>
+              <w:spacing w:before="0" w:after="0" w:line="280" w:lineRule="exact"/>
+              <w:jc w:val="center"/>
+            </w:pPr>
+            <w:r>
+              <w:rPr>
+                <w:sz w:val="24"/>
+              </w:rPr>
+              <w:t>цена не</w:t>
+            </w:r>
+            <w:r>
+              <w:rPr>
+                <w:sz w:val="24"/>
+              </w:rPr>
+              <w:t xml:space="preserve"> скрыта: в книгу бизнес-моделей внесены цена и пробный режим, оценка прозрачности повышена с 1 до 3</w:t>
             </w:r>
           </w:p>
         </w:tc>
@@ -37268,7 +37926,7 @@
         </w:trPr>
         <w:tc>
           <w:tcPr>
-            <w:tcW w:w="1888" w:type="dxa"/>
+            <w:tcW w:w="2126" w:type="dxa"/>
             <w:vAlign w:val="center"/>
           </w:tcPr>
           <w:p>
@@ -37307,7 +37965,7 @@
         </w:tc>
         <w:tc>
           <w:tcPr>
-            <w:tcW w:w="2079" w:type="dxa"/>
+            <w:tcW w:w="2285" w:type="dxa"/>
             <w:vAlign w:val="center"/>
           </w:tcPr>
           <w:p>
@@ -37326,7 +37984,7 @@
         </w:tc>
         <w:tc>
           <w:tcPr>
-            <w:tcW w:w="2616" w:type="dxa"/>
+            <w:tcW w:w="2425" w:type="dxa"/>
             <w:vAlign w:val="center"/>
           </w:tcPr>
           <w:p>
@@ -37410,7 +38068,7 @@
         </w:tc>
         <w:tc>
           <w:tcPr>
-            <w:tcW w:w="2770" w:type="dxa"/>
+            <w:tcW w:w="2518" w:type="dxa"/>
             <w:vAlign w:val="center"/>
           </w:tcPr>
           <w:p>
@@ -37435,215 +38093,91 @@
         </w:trPr>
         <w:tc>
           <w:tcPr>
-            <w:tcW w:w="1888" w:type="dxa"/>
-            <w:vAlign w:val="center"/>
-          </w:tcPr>
-          <w:p>
-            <w:pPr>
-              <w:pStyle w:val="Compact"/>
-              <w:spacing w:before="0" w:after="0" w:line="280" w:lineRule="exact"/>
-              <w:jc w:val="center"/>
-            </w:pPr>
-            <w:r>
-              <w:rPr>
-                <w:i/>
-                <w:sz w:val="24"/>
-              </w:rPr>
-              <w:lastRenderedPageBreak/>
-              <w:t>Shortcut</w:t>
-            </w:r>
-          </w:p>
-        </w:tc>
-        <w:tc>
-          <w:tcPr>
-            <w:tcW w:w="2079" w:type="dxa"/>
-            <w:vAlign w:val="center"/>
-          </w:tcPr>
-          <w:p>
-            <w:pPr>
-              <w:pStyle w:val="Compact"/>
-              <w:spacing w:before="0" w:after="0" w:line="280" w:lineRule="exact"/>
-              <w:jc w:val="center"/>
-            </w:pPr>
-            <w:r>
-              <w:rPr>
-                <w:sz w:val="24"/>
-              </w:rPr>
-              <w:t>Центр приватности и безопасности</w:t>
-            </w:r>
-          </w:p>
-        </w:tc>
-        <w:tc>
-          <w:tcPr>
-            <w:tcW w:w="2616" w:type="dxa"/>
-            <w:vAlign w:val="center"/>
-          </w:tcPr>
-          <w:p>
-            <w:pPr>
-              <w:pStyle w:val="Compact"/>
-              <w:spacing w:before="0" w:after="0" w:line="280" w:lineRule="exact"/>
-              <w:jc w:val="center"/>
-            </w:pPr>
-            <w:r>
-              <w:rPr>
-                <w:sz w:val="24"/>
-              </w:rPr>
-              <w:t xml:space="preserve">по найденным описаниям: </w:t>
-            </w:r>
-            <w:r>
-              <w:rPr>
-                <w:i/>
-                <w:sz w:val="24"/>
-              </w:rPr>
-              <w:t>SOC</w:t>
-            </w:r>
-            <w:r>
-              <w:rPr>
-                <w:sz w:val="24"/>
-              </w:rPr>
-              <w:t xml:space="preserve"> 2 </w:t>
-            </w:r>
-            <w:r>
-              <w:rPr>
-                <w:i/>
-                <w:sz w:val="24"/>
-              </w:rPr>
-              <w:t>Type</w:t>
-            </w:r>
-            <w:r>
-              <w:rPr>
-                <w:sz w:val="24"/>
-              </w:rPr>
-              <w:t xml:space="preserve"> </w:t>
-            </w:r>
-            <w:r>
-              <w:rPr>
-                <w:i/>
-                <w:sz w:val="24"/>
-              </w:rPr>
-              <w:t>I</w:t>
-            </w:r>
-            <w:r>
-              <w:rPr>
-                <w:sz w:val="24"/>
-              </w:rPr>
-              <w:t xml:space="preserve"> выполнен, отчет </w:t>
-            </w:r>
-            <w:r>
-              <w:rPr>
-                <w:i/>
-                <w:sz w:val="24"/>
-              </w:rPr>
-              <w:t>Type</w:t>
-            </w:r>
-            <w:r>
-              <w:rPr>
-                <w:sz w:val="24"/>
-              </w:rPr>
-              <w:t xml:space="preserve"> </w:t>
-            </w:r>
-            <w:r>
-              <w:rPr>
-                <w:i/>
-                <w:sz w:val="24"/>
-              </w:rPr>
-              <w:t>II</w:t>
-            </w:r>
-            <w:r>
-              <w:rPr>
-                <w:sz w:val="24"/>
-              </w:rPr>
-              <w:t xml:space="preserve"> ожидался в начале 2026, вход через </w:t>
-            </w:r>
-            <w:r>
-              <w:rPr>
-                <w:i/>
-                <w:sz w:val="24"/>
-              </w:rPr>
-              <w:t>Google</w:t>
-            </w:r>
-            <w:r>
-              <w:rPr>
-                <w:sz w:val="24"/>
-              </w:rPr>
-              <w:t xml:space="preserve"> </w:t>
-            </w:r>
-            <w:r>
-              <w:rPr>
-                <w:i/>
-                <w:sz w:val="24"/>
-              </w:rPr>
-              <w:t>OAuth</w:t>
-            </w:r>
-            <w:r>
-              <w:rPr>
-                <w:sz w:val="24"/>
-              </w:rPr>
-              <w:t xml:space="preserve"> и </w:t>
-            </w:r>
-            <w:r>
-              <w:rPr>
-                <w:i/>
-                <w:sz w:val="24"/>
-              </w:rPr>
-              <w:t>SAML</w:t>
-            </w:r>
-            <w:r>
-              <w:rPr>
-                <w:sz w:val="24"/>
-              </w:rPr>
-              <w:t>, рол</w:t>
-            </w:r>
-            <w:r>
-              <w:rPr>
-                <w:sz w:val="24"/>
-              </w:rPr>
-              <w:t>евой доступ</w:t>
-            </w:r>
-          </w:p>
-        </w:tc>
-        <w:tc>
-          <w:tcPr>
-            <w:tcW w:w="2770" w:type="dxa"/>
-            <w:vAlign w:val="center"/>
-          </w:tcPr>
-          <w:p>
-            <w:pPr>
-              <w:pStyle w:val="Compact"/>
-              <w:spacing w:before="0" w:after="0" w:line="280" w:lineRule="exact"/>
-              <w:jc w:val="center"/>
-            </w:pPr>
-            <w:r>
-              <w:rPr>
-                <w:sz w:val="24"/>
-              </w:rPr>
-              <w:t xml:space="preserve">заявление </w:t>
-            </w:r>
-            <w:r>
-              <w:rPr>
-                <w:i/>
-                <w:sz w:val="24"/>
-              </w:rPr>
-              <w:t>Type</w:t>
-            </w:r>
-            <w:r>
-              <w:rPr>
-                <w:sz w:val="24"/>
-              </w:rPr>
-              <w:t xml:space="preserve"> </w:t>
-            </w:r>
-            <w:r>
-              <w:rPr>
-                <w:i/>
-                <w:sz w:val="24"/>
-              </w:rPr>
-              <w:t>II</w:t>
-            </w:r>
-            <w:r>
-              <w:rPr>
-                <w:sz w:val="24"/>
-              </w:rPr>
-              <w:t xml:space="preserve"> на главной подтверждено частично; надежность средняя</w:t>
+            <w:tcW w:w="2126" w:type="dxa"/>
+            <w:vAlign w:val="center"/>
+          </w:tcPr>
+          <w:p>
+            <w:pPr>
+              <w:pStyle w:val="Compact"/>
+              <w:spacing w:before="0" w:after="0" w:line="280" w:lineRule="exact"/>
+              <w:jc w:val="center"/>
+            </w:pPr>
+            <w:r>
+              <w:rPr>
+                <w:i/>
+                <w:sz w:val="24"/>
+              </w:rPr>
+              <w:t>Numerous.ai</w:t>
+            </w:r>
+          </w:p>
+        </w:tc>
+        <w:tc>
+          <w:tcPr>
+            <w:tcW w:w="2285" w:type="dxa"/>
+            <w:vAlign w:val="center"/>
+          </w:tcPr>
+          <w:p>
+            <w:pPr>
+              <w:pStyle w:val="Compact"/>
+              <w:spacing w:before="0" w:after="0" w:line="280" w:lineRule="exact"/>
+              <w:jc w:val="center"/>
+            </w:pPr>
+            <w:r>
+              <w:rPr>
+                <w:sz w:val="24"/>
+              </w:rPr>
+              <w:t>Цены и регистрация</w:t>
+            </w:r>
+          </w:p>
+        </w:tc>
+        <w:tc>
+          <w:tcPr>
+            <w:tcW w:w="2425" w:type="dxa"/>
+            <w:vAlign w:val="center"/>
+          </w:tcPr>
+          <w:p>
+            <w:pPr>
+              <w:pStyle w:val="Compact"/>
+              <w:spacing w:before="0" w:after="0" w:line="280" w:lineRule="exact"/>
+              <w:jc w:val="center"/>
+            </w:pPr>
+            <w:r>
+              <w:rPr>
+                <w:sz w:val="24"/>
+              </w:rPr>
+              <w:t>первые 7 дней бесплатно для всех тарифов, оплата за год (10 </w:t>
+            </w:r>
+            <w:r>
+              <w:rPr>
+                <w:i/>
+                <w:sz w:val="24"/>
+              </w:rPr>
+              <w:t>USD</w:t>
+            </w:r>
+            <w:r>
+              <w:rPr>
+                <w:sz w:val="24"/>
+              </w:rPr>
+              <w:t xml:space="preserve"> в месяц при годовой оплате), лимит 500 тыс. символов и 500 генераций, неиспользованные токены сохраняются после отмены</w:t>
+            </w:r>
+          </w:p>
+        </w:tc>
+        <w:tc>
+          <w:tcPr>
+            <w:tcW w:w="2518" w:type="dxa"/>
+            <w:vAlign w:val="center"/>
+          </w:tcPr>
+          <w:p>
+            <w:pPr>
+              <w:pStyle w:val="Compact"/>
+              <w:spacing w:before="0" w:after="0" w:line="280" w:lineRule="exact"/>
+              <w:jc w:val="center"/>
+            </w:pPr>
+            <w:r>
+              <w:rPr>
+                <w:sz w:val="24"/>
+              </w:rPr>
+              <w:t>подтверждает путь «бесплатная проба - годовая подписка» без разговора с продавцом</w:t>
             </w:r>
           </w:p>
         </w:tc>
@@ -37655,84 +38189,163 @@
         </w:trPr>
         <w:tc>
           <w:tcPr>
-            <w:tcW w:w="1888" w:type="dxa"/>
-            <w:vAlign w:val="center"/>
-          </w:tcPr>
-          <w:p>
-            <w:pPr>
-              <w:pStyle w:val="Compact"/>
-              <w:spacing w:before="0" w:after="0" w:line="280" w:lineRule="exact"/>
-              <w:jc w:val="center"/>
-            </w:pPr>
-            <w:r>
-              <w:rPr>
-                <w:i/>
-                <w:sz w:val="24"/>
-              </w:rPr>
-              <w:t>PerfectXL</w:t>
-            </w:r>
-          </w:p>
-        </w:tc>
-        <w:tc>
-          <w:tcPr>
-            <w:tcW w:w="2079" w:type="dxa"/>
-            <w:vAlign w:val="center"/>
-          </w:tcPr>
-          <w:p>
-            <w:pPr>
-              <w:pStyle w:val="Compact"/>
-              <w:spacing w:before="0" w:after="0" w:line="280" w:lineRule="exact"/>
-              <w:jc w:val="center"/>
-            </w:pPr>
-            <w:r>
-              <w:rPr>
-                <w:sz w:val="24"/>
-              </w:rPr>
-              <w:t>Политика конфиденциальности</w:t>
-            </w:r>
-          </w:p>
-        </w:tc>
-        <w:tc>
-          <w:tcPr>
-            <w:tcW w:w="2616" w:type="dxa"/>
-            <w:vAlign w:val="center"/>
-          </w:tcPr>
-          <w:p>
-            <w:pPr>
-              <w:pStyle w:val="Compact"/>
-              <w:spacing w:before="0" w:after="0" w:line="280" w:lineRule="exact"/>
-              <w:jc w:val="center"/>
-            </w:pPr>
-            <w:r>
-              <w:rPr>
-                <w:sz w:val="24"/>
-              </w:rPr>
-              <w:t>данные о лицензии и использовании могут проверяться и записываться; сертификаты безопасности на найденных страницах не указаны</w:t>
-            </w:r>
-          </w:p>
-        </w:tc>
-        <w:tc>
-          <w:tcPr>
-            <w:tcW w:w="2770" w:type="dxa"/>
-            <w:vAlign w:val="center"/>
-          </w:tcPr>
-          <w:p>
-            <w:pPr>
-              <w:pStyle w:val="Compact"/>
-              <w:spacing w:before="0" w:after="0" w:line="280" w:lineRule="exact"/>
-              <w:jc w:val="center"/>
-            </w:pPr>
-            <w:r>
-              <w:rPr>
-                <w:sz w:val="24"/>
-              </w:rPr>
-              <w:t>подтвер</w:t>
-            </w:r>
-            <w:r>
-              <w:rPr>
-                <w:sz w:val="24"/>
-              </w:rPr>
-              <w:t>ждает слабое раскрытие безопасности у специализированных игроков</w:t>
+            <w:tcW w:w="2126" w:type="dxa"/>
+            <w:vAlign w:val="center"/>
+          </w:tcPr>
+          <w:p>
+            <w:pPr>
+              <w:pStyle w:val="Compact"/>
+              <w:spacing w:before="0" w:after="0" w:line="280" w:lineRule="exact"/>
+              <w:jc w:val="center"/>
+            </w:pPr>
+            <w:r>
+              <w:rPr>
+                <w:i/>
+                <w:sz w:val="24"/>
+              </w:rPr>
+              <w:t>Datarails</w:t>
+            </w:r>
+          </w:p>
+        </w:tc>
+        <w:tc>
+          <w:tcPr>
+            <w:tcW w:w="2285" w:type="dxa"/>
+            <w:vAlign w:val="center"/>
+          </w:tcPr>
+          <w:p>
+            <w:pPr>
+              <w:pStyle w:val="Compact"/>
+              <w:spacing w:before="0" w:after="0" w:line="280" w:lineRule="exact"/>
+              <w:jc w:val="center"/>
+            </w:pPr>
+            <w:r>
+              <w:rPr>
+                <w:sz w:val="24"/>
+              </w:rPr>
+              <w:t>Интеграции</w:t>
+            </w:r>
+          </w:p>
+        </w:tc>
+        <w:tc>
+          <w:tcPr>
+            <w:tcW w:w="2425" w:type="dxa"/>
+            <w:vAlign w:val="center"/>
+          </w:tcPr>
+          <w:p>
+            <w:pPr>
+              <w:pStyle w:val="Compact"/>
+              <w:spacing w:before="0" w:after="0" w:line="280" w:lineRule="exact"/>
+              <w:jc w:val="center"/>
+            </w:pPr>
+            <w:r>
+              <w:rPr>
+                <w:sz w:val="24"/>
+              </w:rPr>
+              <w:t>более 200 интеграций в списке (</w:t>
+            </w:r>
+            <w:r>
+              <w:rPr>
+                <w:i/>
+                <w:sz w:val="24"/>
+              </w:rPr>
+              <w:t>E</w:t>
+            </w:r>
+            <w:r>
+              <w:rPr>
+                <w:i/>
+                <w:sz w:val="24"/>
+              </w:rPr>
+              <w:t>RP</w:t>
+            </w:r>
+            <w:r>
+              <w:rPr>
+                <w:sz w:val="24"/>
+              </w:rPr>
+              <w:t xml:space="preserve">, </w:t>
+            </w:r>
+            <w:r>
+              <w:rPr>
+                <w:i/>
+                <w:sz w:val="24"/>
+              </w:rPr>
+              <w:t>CRM</w:t>
+            </w:r>
+            <w:r>
+              <w:rPr>
+                <w:sz w:val="24"/>
+              </w:rPr>
+              <w:t xml:space="preserve">, хранилища данных, </w:t>
+            </w:r>
+            <w:r>
+              <w:rPr>
+                <w:i/>
+                <w:sz w:val="24"/>
+              </w:rPr>
+              <w:t>Google</w:t>
+            </w:r>
+            <w:r>
+              <w:rPr>
+                <w:sz w:val="24"/>
+              </w:rPr>
+              <w:t xml:space="preserve"> </w:t>
+            </w:r>
+            <w:r>
+              <w:rPr>
+                <w:i/>
+                <w:sz w:val="24"/>
+              </w:rPr>
+              <w:t>Sheets</w:t>
+            </w:r>
+            <w:r>
+              <w:rPr>
+                <w:sz w:val="24"/>
+              </w:rPr>
+              <w:t xml:space="preserve">, </w:t>
+            </w:r>
+            <w:r>
+              <w:rPr>
+                <w:i/>
+                <w:sz w:val="24"/>
+              </w:rPr>
+              <w:t>Excel</w:t>
+            </w:r>
+            <w:r>
+              <w:rPr>
+                <w:sz w:val="24"/>
+              </w:rPr>
+              <w:t xml:space="preserve"> через </w:t>
+            </w:r>
+            <w:r>
+              <w:rPr>
+                <w:i/>
+                <w:sz w:val="24"/>
+              </w:rPr>
+              <w:t>API</w:t>
+            </w:r>
+            <w:r>
+              <w:rPr>
+                <w:sz w:val="24"/>
+              </w:rPr>
+              <w:t>); главная страница заявляет более 600</w:t>
+            </w:r>
+          </w:p>
+        </w:tc>
+        <w:tc>
+          <w:tcPr>
+            <w:tcW w:w="2518" w:type="dxa"/>
+            <w:vAlign w:val="center"/>
+          </w:tcPr>
+          <w:p>
+            <w:pPr>
+              <w:pStyle w:val="Compact"/>
+              <w:spacing w:before="0" w:after="0" w:line="280" w:lineRule="exact"/>
+              <w:jc w:val="center"/>
+            </w:pPr>
+            <w:r>
+              <w:rPr>
+                <w:sz w:val="24"/>
+              </w:rPr>
+              <w:t>заявление главной страницы завышено относительно списка; интеграции - главный барьер переключения платформы</w:t>
             </w:r>
           </w:p>
         </w:tc>
@@ -37744,7 +38357,7 @@
         </w:trPr>
         <w:tc>
           <w:tcPr>
-            <w:tcW w:w="1888" w:type="dxa"/>
+            <w:tcW w:w="2126" w:type="dxa"/>
             <w:vAlign w:val="center"/>
           </w:tcPr>
           <w:p>
@@ -37760,6 +38373,309 @@
               </w:rPr>
               <w:t>Shortcut</w:t>
             </w:r>
+          </w:p>
+        </w:tc>
+        <w:tc>
+          <w:tcPr>
+            <w:tcW w:w="2285" w:type="dxa"/>
+            <w:vAlign w:val="center"/>
+          </w:tcPr>
+          <w:p>
+            <w:pPr>
+              <w:pStyle w:val="Compact"/>
+              <w:spacing w:before="0" w:after="0" w:line="280" w:lineRule="exact"/>
+              <w:jc w:val="center"/>
+            </w:pPr>
+            <w:r>
+              <w:rPr>
+                <w:sz w:val="24"/>
+              </w:rPr>
+              <w:t>Центр приватности и безопасности</w:t>
+            </w:r>
+          </w:p>
+        </w:tc>
+        <w:tc>
+          <w:tcPr>
+            <w:tcW w:w="2425" w:type="dxa"/>
+            <w:vAlign w:val="center"/>
+          </w:tcPr>
+          <w:p>
+            <w:pPr>
+              <w:pStyle w:val="Compact"/>
+              <w:spacing w:before="0" w:after="0" w:line="280" w:lineRule="exact"/>
+              <w:jc w:val="center"/>
+            </w:pPr>
+            <w:r>
+              <w:rPr>
+                <w:sz w:val="24"/>
+              </w:rPr>
+              <w:t>по найден</w:t>
+            </w:r>
+            <w:r>
+              <w:rPr>
+                <w:sz w:val="24"/>
+              </w:rPr>
+              <w:t xml:space="preserve">ным описаниям: </w:t>
+            </w:r>
+            <w:r>
+              <w:rPr>
+                <w:i/>
+                <w:sz w:val="24"/>
+              </w:rPr>
+              <w:t>SOC</w:t>
+            </w:r>
+            <w:r>
+              <w:rPr>
+                <w:sz w:val="24"/>
+              </w:rPr>
+              <w:t xml:space="preserve"> 2 </w:t>
+            </w:r>
+            <w:r>
+              <w:rPr>
+                <w:i/>
+                <w:sz w:val="24"/>
+              </w:rPr>
+              <w:t>Type</w:t>
+            </w:r>
+            <w:r>
+              <w:rPr>
+                <w:sz w:val="24"/>
+              </w:rPr>
+              <w:t xml:space="preserve"> </w:t>
+            </w:r>
+            <w:r>
+              <w:rPr>
+                <w:i/>
+                <w:sz w:val="24"/>
+              </w:rPr>
+              <w:t>I</w:t>
+            </w:r>
+            <w:r>
+              <w:rPr>
+                <w:sz w:val="24"/>
+              </w:rPr>
+              <w:t xml:space="preserve"> выполнен, отчет </w:t>
+            </w:r>
+            <w:r>
+              <w:rPr>
+                <w:i/>
+                <w:sz w:val="24"/>
+              </w:rPr>
+              <w:t>Type</w:t>
+            </w:r>
+            <w:r>
+              <w:rPr>
+                <w:sz w:val="24"/>
+              </w:rPr>
+              <w:t xml:space="preserve"> </w:t>
+            </w:r>
+            <w:r>
+              <w:rPr>
+                <w:i/>
+                <w:sz w:val="24"/>
+              </w:rPr>
+              <w:t>II</w:t>
+            </w:r>
+            <w:r>
+              <w:rPr>
+                <w:sz w:val="24"/>
+              </w:rPr>
+              <w:t xml:space="preserve"> ожидался в начале 2026, вход через </w:t>
+            </w:r>
+            <w:r>
+              <w:rPr>
+                <w:i/>
+                <w:sz w:val="24"/>
+              </w:rPr>
+              <w:t>Google</w:t>
+            </w:r>
+            <w:r>
+              <w:rPr>
+                <w:sz w:val="24"/>
+              </w:rPr>
+              <w:t xml:space="preserve"> </w:t>
+            </w:r>
+            <w:r>
+              <w:rPr>
+                <w:i/>
+                <w:sz w:val="24"/>
+              </w:rPr>
+              <w:t>OAuth</w:t>
+            </w:r>
+            <w:r>
+              <w:rPr>
+                <w:sz w:val="24"/>
+              </w:rPr>
+              <w:t xml:space="preserve"> и </w:t>
+            </w:r>
+            <w:r>
+              <w:rPr>
+                <w:i/>
+                <w:sz w:val="24"/>
+              </w:rPr>
+              <w:t>SAML</w:t>
+            </w:r>
+            <w:r>
+              <w:rPr>
+                <w:sz w:val="24"/>
+              </w:rPr>
+              <w:t>, ролевой доступ</w:t>
+            </w:r>
+          </w:p>
+        </w:tc>
+        <w:tc>
+          <w:tcPr>
+            <w:tcW w:w="2518" w:type="dxa"/>
+            <w:vAlign w:val="center"/>
+          </w:tcPr>
+          <w:p>
+            <w:pPr>
+              <w:pStyle w:val="Compact"/>
+              <w:spacing w:before="0" w:after="0" w:line="280" w:lineRule="exact"/>
+              <w:jc w:val="center"/>
+            </w:pPr>
+            <w:r>
+              <w:rPr>
+                <w:sz w:val="24"/>
+              </w:rPr>
+              <w:t xml:space="preserve">заявление </w:t>
+            </w:r>
+            <w:r>
+              <w:rPr>
+                <w:i/>
+                <w:sz w:val="24"/>
+              </w:rPr>
+              <w:t>Type</w:t>
+            </w:r>
+            <w:r>
+              <w:rPr>
+                <w:sz w:val="24"/>
+              </w:rPr>
+              <w:t xml:space="preserve"> </w:t>
+            </w:r>
+            <w:r>
+              <w:rPr>
+                <w:i/>
+                <w:sz w:val="24"/>
+              </w:rPr>
+              <w:t>II</w:t>
+            </w:r>
+            <w:r>
+              <w:rPr>
+                <w:sz w:val="24"/>
+              </w:rPr>
+              <w:t xml:space="preserve"> на главной подтверждено частично; надежность средняя</w:t>
+            </w:r>
+          </w:p>
+        </w:tc>
+      </w:tr>
+      <w:tr>
+        <w:trPr>
+          <w:cantSplit/>
+          <w:jc w:val="center"/>
+        </w:trPr>
+        <w:tc>
+          <w:tcPr>
+            <w:tcW w:w="2126" w:type="dxa"/>
+            <w:vAlign w:val="center"/>
+          </w:tcPr>
+          <w:p>
+            <w:pPr>
+              <w:pStyle w:val="Compact"/>
+              <w:spacing w:before="0" w:after="0" w:line="280" w:lineRule="exact"/>
+              <w:jc w:val="center"/>
+            </w:pPr>
+            <w:r>
+              <w:rPr>
+                <w:i/>
+                <w:sz w:val="24"/>
+              </w:rPr>
+              <w:lastRenderedPageBreak/>
+              <w:t>PerfectXL</w:t>
+            </w:r>
+          </w:p>
+        </w:tc>
+        <w:tc>
+          <w:tcPr>
+            <w:tcW w:w="2285" w:type="dxa"/>
+            <w:vAlign w:val="center"/>
+          </w:tcPr>
+          <w:p>
+            <w:pPr>
+              <w:pStyle w:val="Compact"/>
+              <w:spacing w:before="0" w:after="0" w:line="280" w:lineRule="exact"/>
+              <w:jc w:val="center"/>
+            </w:pPr>
+            <w:r>
+              <w:rPr>
+                <w:sz w:val="24"/>
+              </w:rPr>
+              <w:t>Политика конфиденциальности</w:t>
+            </w:r>
+          </w:p>
+        </w:tc>
+        <w:tc>
+          <w:tcPr>
+            <w:tcW w:w="2425" w:type="dxa"/>
+            <w:vAlign w:val="center"/>
+          </w:tcPr>
+          <w:p>
+            <w:pPr>
+              <w:pStyle w:val="Compact"/>
+              <w:spacing w:before="0" w:after="0" w:line="280" w:lineRule="exact"/>
+              <w:jc w:val="center"/>
+            </w:pPr>
+            <w:r>
+              <w:rPr>
+                <w:sz w:val="24"/>
+              </w:rPr>
+              <w:t>данные о лицензии и использовании могут проверяться и записываться; сертификаты безопасности на найденных страницах не указаны</w:t>
+            </w:r>
+          </w:p>
+        </w:tc>
+        <w:tc>
+          <w:tcPr>
+            <w:tcW w:w="2518" w:type="dxa"/>
+            <w:vAlign w:val="center"/>
+          </w:tcPr>
+          <w:p>
+            <w:pPr>
+              <w:pStyle w:val="Compact"/>
+              <w:spacing w:before="0" w:after="0" w:line="280" w:lineRule="exact"/>
+              <w:jc w:val="center"/>
+            </w:pPr>
+            <w:r>
+              <w:rPr>
+                <w:sz w:val="24"/>
+              </w:rPr>
+              <w:t>подтверждает слабое раскрытие безопасности у специализированных игроков</w:t>
+            </w:r>
+          </w:p>
+        </w:tc>
+      </w:tr>
+      <w:tr>
+        <w:trPr>
+          <w:cantSplit/>
+          <w:jc w:val="center"/>
+        </w:trPr>
+        <w:tc>
+          <w:tcPr>
+            <w:tcW w:w="2126" w:type="dxa"/>
+            <w:vAlign w:val="center"/>
+          </w:tcPr>
+          <w:p>
+            <w:pPr>
+              <w:pStyle w:val="Compact"/>
+              <w:spacing w:before="0" w:after="0" w:line="280" w:lineRule="exact"/>
+              <w:jc w:val="center"/>
+            </w:pPr>
+            <w:r>
+              <w:rPr>
+                <w:i/>
+                <w:sz w:val="24"/>
+              </w:rPr>
+              <w:t>Shortcut</w:t>
+            </w:r>
             <w:r>
               <w:rPr>
                 <w:sz w:val="24"/>
@@ -37784,7 +38700,14 @@
                 <w:i/>
                 <w:sz w:val="24"/>
               </w:rPr>
-              <w:t>Datarails</w:t>
+              <w:t>Datarai</w:t>
+            </w:r>
+            <w:r>
+              <w:rPr>
+                <w:i/>
+                <w:sz w:val="24"/>
+              </w:rPr>
+              <w:t>ls</w:t>
             </w:r>
             <w:r>
               <w:rPr>
@@ -37799,62 +38722,101 @@
               </w:rPr>
               <w:t>Numerous.ai</w:t>
             </w:r>
-          </w:p>
-        </w:tc>
-        <w:tc>
-          <w:tcPr>
-            <w:tcW w:w="2079" w:type="dxa"/>
-            <w:vAlign w:val="center"/>
-          </w:tcPr>
-          <w:p>
-            <w:pPr>
-              <w:pStyle w:val="Compact"/>
-              <w:spacing w:before="0" w:after="0" w:line="280" w:lineRule="exact"/>
-              <w:jc w:val="center"/>
-            </w:pPr>
-            <w:r>
-              <w:rPr>
-                <w:sz w:val="24"/>
-              </w:rPr>
-              <w:t>Страницы безопасности</w:t>
-            </w:r>
-          </w:p>
-        </w:tc>
-        <w:tc>
-          <w:tcPr>
-            <w:tcW w:w="2616" w:type="dxa"/>
-            <w:vAlign w:val="center"/>
-          </w:tcPr>
-          <w:p>
-            <w:pPr>
-              <w:pStyle w:val="Compact"/>
-              <w:spacing w:before="0" w:after="0" w:line="280" w:lineRule="exact"/>
-              <w:jc w:val="center"/>
-            </w:pPr>
-            <w:r>
-              <w:rPr>
-                <w:sz w:val="24"/>
-              </w:rPr>
-              <w:t>отдельных страниц нет или они недоступны (ошибки 404 и 502, перенаправление на изображение)</w:t>
-            </w:r>
-          </w:p>
-        </w:tc>
-        <w:tc>
-          <w:tcPr>
-            <w:tcW w:w="2770" w:type="dxa"/>
-            <w:vAlign w:val="center"/>
-          </w:tcPr>
-          <w:p>
-            <w:pPr>
-              <w:pStyle w:val="Compact"/>
-              <w:spacing w:before="0" w:after="0" w:line="280" w:lineRule="exact"/>
-              <w:jc w:val="center"/>
-            </w:pPr>
-            <w:r>
-              <w:rPr>
-                <w:sz w:val="24"/>
-              </w:rPr>
-              <w:t>отсутствие отдельной страницы безопасности само является фактом для признака «раскрытие безопасности»</w:t>
+            <w:r>
+              <w:rPr>
+                <w:sz w:val="24"/>
+              </w:rPr>
+              <w:t xml:space="preserve">, </w:t>
+            </w:r>
+            <w:r>
+              <w:rPr>
+                <w:i/>
+                <w:sz w:val="24"/>
+              </w:rPr>
+              <w:t>DataSnipper</w:t>
+            </w:r>
+          </w:p>
+        </w:tc>
+        <w:tc>
+          <w:tcPr>
+            <w:tcW w:w="2285" w:type="dxa"/>
+            <w:vAlign w:val="center"/>
+          </w:tcPr>
+          <w:p>
+            <w:pPr>
+              <w:pStyle w:val="Compact"/>
+              <w:spacing w:before="0" w:after="0" w:line="280" w:lineRule="exact"/>
+              <w:jc w:val="center"/>
+            </w:pPr>
+            <w:r>
+              <w:rPr>
+                <w:sz w:val="24"/>
+              </w:rPr>
+              <w:t xml:space="preserve">Страницы безопасности, пробного периода, интеграций и цен </w:t>
+            </w:r>
+            <w:r>
+              <w:rPr>
+                <w:i/>
+                <w:sz w:val="24"/>
+              </w:rPr>
+              <w:t>Shortcut</w:t>
+            </w:r>
+          </w:p>
+        </w:tc>
+        <w:tc>
+          <w:tcPr>
+            <w:tcW w:w="2425" w:type="dxa"/>
+            <w:vAlign w:val="center"/>
+          </w:tcPr>
+          <w:p>
+            <w:pPr>
+              <w:pStyle w:val="Compact"/>
+              <w:spacing w:before="0" w:after="0" w:line="280" w:lineRule="exact"/>
+              <w:jc w:val="center"/>
+            </w:pPr>
+            <w:r>
+              <w:rPr>
+                <w:sz w:val="24"/>
+              </w:rPr>
+              <w:t xml:space="preserve">отдельных страниц нет или они недоступны (404, 502, перенаправление на изображение, запрет загрузки у </w:t>
+            </w:r>
+            <w:r>
+              <w:rPr>
+                <w:i/>
+                <w:sz w:val="24"/>
+              </w:rPr>
+              <w:t>Shortcut</w:t>
+            </w:r>
+            <w:r>
+              <w:rPr>
+                <w:sz w:val="24"/>
+              </w:rPr>
+              <w:t>)</w:t>
+            </w:r>
+          </w:p>
+        </w:tc>
+        <w:tc>
+          <w:tcPr>
+            <w:tcW w:w="2518" w:type="dxa"/>
+            <w:vAlign w:val="center"/>
+          </w:tcPr>
+          <w:p>
+            <w:pPr>
+              <w:pStyle w:val="Compact"/>
+              <w:spacing w:before="0" w:after="0" w:line="280" w:lineRule="exact"/>
+              <w:jc w:val="center"/>
+            </w:pPr>
+            <w:r>
+              <w:rPr>
+                <w:sz w:val="24"/>
+              </w:rPr>
+              <w:t xml:space="preserve">отсутствие отдельной страницы безопасности само </w:t>
+            </w:r>
+            <w:r>
+              <w:rPr>
+                <w:sz w:val="24"/>
+              </w:rPr>
+              <w:t>является фактом для признака «раскрытие безопасности»</w:t>
             </w:r>
           </w:p>
         </w:tc>
@@ -37871,7 +38833,7 @@
         <w:rPr>
           <w:sz w:val="28"/>
         </w:rPr>
-        <w:t xml:space="preserve">Проверено 11 адресов: 7 страниц дали данные (пять напрямую, две </w:t>
+        <w:t xml:space="preserve">Проверено 16 адресов: 9 страниц дали данные (семь напрямую, две </w:t>
       </w:r>
       <w:r>
         <w:rPr>
@@ -37897,13 +38859,7 @@
         <w:rPr>
           <w:sz w:val="28"/>
         </w:rPr>
-        <w:t xml:space="preserve"> по описаниям поисковой выдачи), 4 адреса отдельной страницы безопасн</w:t>
-      </w:r>
-      <w:r>
-        <w:rPr>
-          <w:sz w:val="28"/>
-        </w:rPr>
-        <w:t xml:space="preserve">ости не имеют; план 14-20 страниц выполнен частично, а оставшиеся страницы (регистрация, оплата, интеграции) остаются в приложении Б. Результаты уточняют факты ЛР5; цены </w:t>
+        <w:t xml:space="preserve"> по описаниям поисковой выдачи), 7 адресов недоступны или не существуют; план 14-20 страниц выполнен в пределах доступного. Результаты уточняют факты ЛР5; цены </w:t>
       </w:r>
       <w:r>
         <w:rPr>
@@ -37929,13 +38885,13 @@
         <w:rPr>
           <w:sz w:val="28"/>
         </w:rPr>
-        <w:t xml:space="preserve"> были отмечены как не показанные, хотя опубликованы на страницах произ</w:t>
-      </w:r>
-      <w:r>
-        <w:rPr>
-          <w:sz w:val="28"/>
-        </w:rPr>
-        <w:t xml:space="preserve">водителей. Поэтому в книгу бизнес-моделей внесены их цены и пробные режимы, а оценки прозрачности цен повышены с 1 до 3 из 5; 70 независимых проверок </w:t>
+        <w:t xml:space="preserve"> были отмечены как не показанные, хотя опубликованы на страницах производителей.</w:t>
+      </w:r>
+      <w:r>
+        <w:rPr>
+          <w:sz w:val="28"/>
+        </w:rPr>
+        <w:t xml:space="preserve"> Поэтому в книгу бизнес-моделей внесены их цены и пробные режимы, а оценки прозрачности цен повышены с 1 до 3 из 5; 70 независимых проверок </w:t>
       </w:r>
       <w:r>
         <w:rPr>
@@ -37961,13 +38917,13 @@
         <w:rPr>
           <w:sz w:val="28"/>
         </w:rPr>
-        <w:t xml:space="preserve"> по-прежнему сходятся, а индексы бизнес-моделей не изменились, так как оценка прозрачности в</w:t>
-      </w:r>
-      <w:r>
-        <w:rPr>
-          <w:sz w:val="28"/>
-        </w:rPr>
-        <w:t xml:space="preserve"> них не входит.</w:t>
+        <w:t xml:space="preserve"> по-прежнему сходятся, а индексы бизнес-моделей не изменились, так как оценка прозрачности в них не вх</w:t>
+      </w:r>
+      <w:r>
+        <w:rPr>
+          <w:sz w:val="28"/>
+        </w:rPr>
+        <w:t>одит.</w:t>
       </w:r>
     </w:p>
     <w:p>
@@ -38033,13 +38989,13 @@
         <w:rPr>
           <w:sz w:val="28"/>
         </w:rPr>
-        <w:t xml:space="preserve"> не меняют статус «зона дифференциации». Если считать признак</w:t>
-      </w:r>
-      <w:r>
-        <w:rPr>
-          <w:sz w:val="28"/>
-        </w:rPr>
-        <w:t xml:space="preserve">ом любую опубликованную цену, показатель вырастет до 5 из 7 (71 %) и перейдет порог 70 % в рыночный стандарт; тогда возможностью дифференциации остаются лестница тарифов с бесплатным входом и доказательство вывода. Книги </w:t>
+        <w:t xml:space="preserve"> не меняют статус «зона дифференциации». Если считать признаком любую о</w:t>
+      </w:r>
+      <w:r>
+        <w:rPr>
+          <w:sz w:val="28"/>
+        </w:rPr>
+        <w:t xml:space="preserve">публикованную цену, показатель вырастет до 5 из 7 (71 %) и перейдет порог 70 % в рыночный стандарт; тогда возможностью дифференциации остаются лестница тарифов с бесплатным входом и доказательство вывода. Книги </w:t>
       </w:r>
       <w:r>
         <w:rPr>
@@ -38065,7 +39021,13 @@
         <w:rPr>
           <w:sz w:val="28"/>
         </w:rPr>
-        <w:t xml:space="preserve"> и </w:t>
+        <w:t xml:space="preserve"> </w:t>
+      </w:r>
+      <w:r>
+        <w:rPr>
+          <w:sz w:val="28"/>
+        </w:rPr>
+        <w:t xml:space="preserve">и </w:t>
       </w:r>
       <w:r>
         <w:rPr>
@@ -38212,7 +39174,7 @@
   <w:abstractNum w:abstractNumId="0" w15:restartNumberingAfterBreak="0">
     <w:nsid w:val="0000A990"/>
     <w:multiLevelType w:val="multilevel"/>
-    <w:tmpl w:val="53BE2B00"/>
+    <w:tmpl w:val="133AE9F4"/>
     <w:lvl w:ilvl="0">
       <w:numFmt w:val="bullet"/>
       <w:lvlText w:val=" "/>
@@ -38289,7 +39251,7 @@
   <w:abstractNum w:abstractNumId="1" w15:restartNumberingAfterBreak="0">
     <w:nsid w:val="00A99411"/>
     <w:multiLevelType w:val="multilevel"/>
-    <w:tmpl w:val="2A4AAA7A"/>
+    <w:tmpl w:val="D512CE48"/>
     <w:lvl w:ilvl="0">
       <w:start w:val="1"/>
       <w:numFmt w:val="decimal"/>
@@ -39767,7 +40729,7 @@
     <w:autoRedefine/>
     <w:uiPriority w:val="39"/>
     <w:unhideWhenUsed/>
-    <w:rsid w:val="001968F1"/>
+    <w:rsid w:val="00B04651"/>
     <w:pPr>
       <w:spacing w:after="100"/>
     </w:pPr>
@@ -39779,7 +40741,7 @@
     <w:autoRedefine/>
     <w:uiPriority w:val="39"/>
     <w:unhideWhenUsed/>
-    <w:rsid w:val="001968F1"/>
+    <w:rsid w:val="00B04651"/>
     <w:pPr>
       <w:spacing w:after="100"/>
       <w:ind w:left="240"/>

</xml_diff>

<commit_message>
decision: full start (LR7, summary, final); SOC 2 cost and timeline; teacher questions resolved per sample; Crunchbase note
</commit_message>
<xml_diff>
--- a/ЛР5_Анализ_конкурентов/ОТЧЕТ_ЛР5_TableMind.docx
+++ b/ЛР5_Анализ_конкурентов/ОТЧЕТ_ЛР5_TableMind.docx
@@ -264,7 +264,7 @@
       <w:r>
         <w:fldChar w:fldCharType="separate"/>
       </w:r>
-      <w:hyperlink w:anchor="_Toc241939370" w:history="1">
+      <w:hyperlink w:anchor="_Toc241940158" w:history="1">
         <w:r>
           <w:rPr>
             <w:rStyle w:val="af"/>
@@ -292,7 +292,7 @@
             <w:noProof/>
             <w:webHidden/>
           </w:rPr>
-          <w:instrText xml:space="preserve"> PAGEREF _Toc241939370 \h </w:instrText>
+          <w:instrText xml:space="preserve"> PAGEREF _Toc241940158 \h </w:instrText>
         </w:r>
         <w:r>
           <w:rPr>
@@ -333,7 +333,7 @@
           <w:noProof/>
         </w:rPr>
       </w:pPr>
-      <w:hyperlink w:anchor="_Toc241939371" w:history="1">
+      <w:hyperlink w:anchor="_Toc241940159" w:history="1">
         <w:r>
           <w:rPr>
             <w:rStyle w:val="af"/>
@@ -361,7 +361,7 @@
             <w:noProof/>
             <w:webHidden/>
           </w:rPr>
-          <w:instrText xml:space="preserve"> PAGEREF _Toc241939371 \h </w:instrText>
+          <w:instrText xml:space="preserve"> PAGEREF _Toc241940159 \h </w:instrText>
         </w:r>
         <w:r>
           <w:rPr>
@@ -402,7 +402,7 @@
           <w:noProof/>
         </w:rPr>
       </w:pPr>
-      <w:hyperlink w:anchor="_Toc241939372" w:history="1">
+      <w:hyperlink w:anchor="_Toc241940160" w:history="1">
         <w:r>
           <w:rPr>
             <w:rStyle w:val="af"/>
@@ -430,7 +430,7 @@
             <w:noProof/>
             <w:webHidden/>
           </w:rPr>
-          <w:instrText xml:space="preserve"> PAGEREF _Toc241939372 \h </w:instrText>
+          <w:instrText xml:space="preserve"> PAGEREF _Toc241940160 \h </w:instrText>
         </w:r>
         <w:r>
           <w:rPr>
@@ -471,7 +471,7 @@
           <w:noProof/>
         </w:rPr>
       </w:pPr>
-      <w:hyperlink w:anchor="_Toc241939373" w:history="1">
+      <w:hyperlink w:anchor="_Toc241940161" w:history="1">
         <w:r>
           <w:rPr>
             <w:rStyle w:val="af"/>
@@ -499,7 +499,7 @@
             <w:noProof/>
             <w:webHidden/>
           </w:rPr>
-          <w:instrText xml:space="preserve"> PAGEREF _Toc241939373 \h </w:instrText>
+          <w:instrText xml:space="preserve"> PAGEREF _Toc241940161 \h </w:instrText>
         </w:r>
         <w:r>
           <w:rPr>
@@ -540,7 +540,7 @@
           <w:noProof/>
         </w:rPr>
       </w:pPr>
-      <w:hyperlink w:anchor="_Toc241939374" w:history="1">
+      <w:hyperlink w:anchor="_Toc241940162" w:history="1">
         <w:r>
           <w:rPr>
             <w:rStyle w:val="af"/>
@@ -568,7 +568,7 @@
             <w:noProof/>
             <w:webHidden/>
           </w:rPr>
-          <w:instrText xml:space="preserve"> PAGEREF _Toc241939374 \h </w:instrText>
+          <w:instrText xml:space="preserve"> PAGEREF _Toc241940162 \h </w:instrText>
         </w:r>
         <w:r>
           <w:rPr>
@@ -609,7 +609,7 @@
           <w:noProof/>
         </w:rPr>
       </w:pPr>
-      <w:hyperlink w:anchor="_Toc241939375" w:history="1">
+      <w:hyperlink w:anchor="_Toc241940163" w:history="1">
         <w:r>
           <w:rPr>
             <w:rStyle w:val="af"/>
@@ -637,7 +637,7 @@
             <w:noProof/>
             <w:webHidden/>
           </w:rPr>
-          <w:instrText xml:space="preserve"> PAGEREF _Toc241939375 \h </w:instrText>
+          <w:instrText xml:space="preserve"> PAGEREF _Toc241940163 \h </w:instrText>
         </w:r>
         <w:r>
           <w:rPr>
@@ -678,7 +678,7 @@
           <w:noProof/>
         </w:rPr>
       </w:pPr>
-      <w:hyperlink w:anchor="_Toc241939376" w:history="1">
+      <w:hyperlink w:anchor="_Toc241940164" w:history="1">
         <w:r>
           <w:rPr>
             <w:rStyle w:val="af"/>
@@ -706,7 +706,7 @@
             <w:noProof/>
             <w:webHidden/>
           </w:rPr>
-          <w:instrText xml:space="preserve"> PAGEREF _Toc241939376 \h </w:instrText>
+          <w:instrText xml:space="preserve"> PAGEREF _Toc241940164 \h </w:instrText>
         </w:r>
         <w:r>
           <w:rPr>
@@ -747,7 +747,7 @@
           <w:noProof/>
         </w:rPr>
       </w:pPr>
-      <w:hyperlink w:anchor="_Toc241939377" w:history="1">
+      <w:hyperlink w:anchor="_Toc241940165" w:history="1">
         <w:r>
           <w:rPr>
             <w:rStyle w:val="af"/>
@@ -775,7 +775,7 @@
             <w:noProof/>
             <w:webHidden/>
           </w:rPr>
-          <w:instrText xml:space="preserve"> PAGEREF _Toc241939377 \h </w:instrText>
+          <w:instrText xml:space="preserve"> PAGEREF _Toc241940165 \h </w:instrText>
         </w:r>
         <w:r>
           <w:rPr>
@@ -816,7 +816,7 @@
           <w:noProof/>
         </w:rPr>
       </w:pPr>
-      <w:hyperlink w:anchor="_Toc241939378" w:history="1">
+      <w:hyperlink w:anchor="_Toc241940166" w:history="1">
         <w:r>
           <w:rPr>
             <w:rStyle w:val="af"/>
@@ -844,7 +844,7 @@
             <w:noProof/>
             <w:webHidden/>
           </w:rPr>
-          <w:instrText xml:space="preserve"> PAGEREF _Toc241939378 \h </w:instrText>
+          <w:instrText xml:space="preserve"> PAGEREF _Toc241940166 \h </w:instrText>
         </w:r>
         <w:r>
           <w:rPr>
@@ -885,7 +885,7 @@
           <w:noProof/>
         </w:rPr>
       </w:pPr>
-      <w:hyperlink w:anchor="_Toc241939379" w:history="1">
+      <w:hyperlink w:anchor="_Toc241940167" w:history="1">
         <w:r>
           <w:rPr>
             <w:rStyle w:val="af"/>
@@ -913,7 +913,7 @@
             <w:noProof/>
             <w:webHidden/>
           </w:rPr>
-          <w:instrText xml:space="preserve"> PAGEREF _Toc241939379 \h </w:instrText>
+          <w:instrText xml:space="preserve"> PAGEREF _Toc241940167 \h </w:instrText>
         </w:r>
         <w:r>
           <w:rPr>
@@ -954,7 +954,7 @@
           <w:noProof/>
         </w:rPr>
       </w:pPr>
-      <w:hyperlink w:anchor="_Toc241939380" w:history="1">
+      <w:hyperlink w:anchor="_Toc241940168" w:history="1">
         <w:r>
           <w:rPr>
             <w:rStyle w:val="af"/>
@@ -991,7 +991,7 @@
             <w:noProof/>
             <w:webHidden/>
           </w:rPr>
-          <w:instrText xml:space="preserve"> PAGEREF _Toc241939380 \h </w:instrText>
+          <w:instrText xml:space="preserve"> PAGEREF _Toc241940168 \h </w:instrText>
         </w:r>
         <w:r>
           <w:rPr>
@@ -1032,7 +1032,7 @@
           <w:noProof/>
         </w:rPr>
       </w:pPr>
-      <w:hyperlink w:anchor="_Toc241939381" w:history="1">
+      <w:hyperlink w:anchor="_Toc241940169" w:history="1">
         <w:r>
           <w:rPr>
             <w:rStyle w:val="af"/>
@@ -1060,7 +1060,7 @@
             <w:noProof/>
             <w:webHidden/>
           </w:rPr>
-          <w:instrText xml:space="preserve"> PAGEREF _Toc241939381 \h </w:instrText>
+          <w:instrText xml:space="preserve"> PAGEREF _Toc241940169 \h </w:instrText>
         </w:r>
         <w:r>
           <w:rPr>
@@ -1101,7 +1101,7 @@
           <w:noProof/>
         </w:rPr>
       </w:pPr>
-      <w:hyperlink w:anchor="_Toc241939382" w:history="1">
+      <w:hyperlink w:anchor="_Toc241940170" w:history="1">
         <w:r>
           <w:rPr>
             <w:rStyle w:val="af"/>
@@ -1129,7 +1129,7 @@
             <w:noProof/>
             <w:webHidden/>
           </w:rPr>
-          <w:instrText xml:space="preserve"> PAGEREF _Toc241939382 \h </w:instrText>
+          <w:instrText xml:space="preserve"> PAGEREF _Toc241940170 \h </w:instrText>
         </w:r>
         <w:r>
           <w:rPr>
@@ -1170,7 +1170,7 @@
           <w:noProof/>
         </w:rPr>
       </w:pPr>
-      <w:hyperlink w:anchor="_Toc241939383" w:history="1">
+      <w:hyperlink w:anchor="_Toc241940171" w:history="1">
         <w:r>
           <w:rPr>
             <w:rStyle w:val="af"/>
@@ -1198,7 +1198,7 @@
             <w:noProof/>
             <w:webHidden/>
           </w:rPr>
-          <w:instrText xml:space="preserve"> PAGEREF _Toc241939383 \h </w:instrText>
+          <w:instrText xml:space="preserve"> PAGEREF _Toc241940171 \h </w:instrText>
         </w:r>
         <w:r>
           <w:rPr>
@@ -1239,7 +1239,7 @@
           <w:noProof/>
         </w:rPr>
       </w:pPr>
-      <w:hyperlink w:anchor="_Toc241939384" w:history="1">
+      <w:hyperlink w:anchor="_Toc241940172" w:history="1">
         <w:r>
           <w:rPr>
             <w:rStyle w:val="af"/>
@@ -1267,7 +1267,7 @@
             <w:noProof/>
             <w:webHidden/>
           </w:rPr>
-          <w:instrText xml:space="preserve"> PAGEREF _Toc241939384 \h </w:instrText>
+          <w:instrText xml:space="preserve"> PAGEREF _Toc241940172 \h </w:instrText>
         </w:r>
         <w:r>
           <w:rPr>
@@ -1308,7 +1308,7 @@
           <w:noProof/>
         </w:rPr>
       </w:pPr>
-      <w:hyperlink w:anchor="_Toc241939385" w:history="1">
+      <w:hyperlink w:anchor="_Toc241940173" w:history="1">
         <w:r>
           <w:rPr>
             <w:rStyle w:val="af"/>
@@ -1336,7 +1336,7 @@
             <w:noProof/>
             <w:webHidden/>
           </w:rPr>
-          <w:instrText xml:space="preserve"> PAGEREF _Toc241939385 \h </w:instrText>
+          <w:instrText xml:space="preserve"> PAGEREF _Toc241940173 \h </w:instrText>
         </w:r>
         <w:r>
           <w:rPr>
@@ -1377,7 +1377,7 @@
           <w:noProof/>
         </w:rPr>
       </w:pPr>
-      <w:hyperlink w:anchor="_Toc241939386" w:history="1">
+      <w:hyperlink w:anchor="_Toc241940174" w:history="1">
         <w:r>
           <w:rPr>
             <w:rStyle w:val="af"/>
@@ -1405,7 +1405,7 @@
             <w:noProof/>
             <w:webHidden/>
           </w:rPr>
-          <w:instrText xml:space="preserve"> PAGEREF _Toc241939386 \h </w:instrText>
+          <w:instrText xml:space="preserve"> PAGEREF _Toc241940174 \h </w:instrText>
         </w:r>
         <w:r>
           <w:rPr>
@@ -1446,7 +1446,7 @@
           <w:noProof/>
         </w:rPr>
       </w:pPr>
-      <w:hyperlink w:anchor="_Toc241939387" w:history="1">
+      <w:hyperlink w:anchor="_Toc241940175" w:history="1">
         <w:r>
           <w:rPr>
             <w:rStyle w:val="af"/>
@@ -1474,76 +1474,7 @@
             <w:noProof/>
             <w:webHidden/>
           </w:rPr>
-          <w:instrText xml:space="preserve"> PAGEREF _Toc241939387 \h </w:instrText>
-        </w:r>
-        <w:r>
-          <w:rPr>
-            <w:noProof/>
-            <w:webHidden/>
-          </w:rPr>
-        </w:r>
-        <w:r>
-          <w:rPr>
-            <w:noProof/>
-            <w:webHidden/>
-          </w:rPr>
-          <w:fldChar w:fldCharType="separate"/>
-        </w:r>
-        <w:r>
-          <w:rPr>
-            <w:noProof/>
-            <w:webHidden/>
-          </w:rPr>
-          <w:t>31</w:t>
-        </w:r>
-        <w:r>
-          <w:rPr>
-            <w:noProof/>
-            <w:webHidden/>
-          </w:rPr>
-          <w:fldChar w:fldCharType="end"/>
-        </w:r>
-      </w:hyperlink>
-    </w:p>
-    <w:p>
-      <w:pPr>
-        <w:pStyle w:val="12"/>
-        <w:tabs>
-          <w:tab w:val="right" w:leader="dot" w:pos="9345"/>
-        </w:tabs>
-        <w:rPr>
-          <w:noProof/>
-        </w:rPr>
-      </w:pPr>
-      <w:hyperlink w:anchor="_Toc241939388" w:history="1">
-        <w:r>
-          <w:rPr>
-            <w:rStyle w:val="af"/>
-            <w:b/>
-            <w:noProof/>
-          </w:rPr>
-          <w:t>ПРИЛОЖЕНИЕ Г</w:t>
-        </w:r>
-        <w:r>
-          <w:rPr>
-            <w:noProof/>
-            <w:webHidden/>
-          </w:rPr>
-          <w:tab/>
-        </w:r>
-        <w:r>
-          <w:rPr>
-            <w:noProof/>
-            <w:webHidden/>
-          </w:rPr>
-          <w:fldChar w:fldCharType="begin"/>
-        </w:r>
-        <w:r>
-          <w:rPr>
-            <w:noProof/>
-            <w:webHidden/>
-          </w:rPr>
-          <w:instrText xml:space="preserve"> PAGEREF _Toc241939388 \h </w:instrText>
+          <w:instrText xml:space="preserve"> PAGEREF _Toc241940175 \h </w:instrText>
         </w:r>
         <w:r>
           <w:rPr>
@@ -1584,7 +1515,76 @@
           <w:noProof/>
         </w:rPr>
       </w:pPr>
-      <w:hyperlink w:anchor="_Toc241939389" w:history="1">
+      <w:hyperlink w:anchor="_Toc241940176" w:history="1">
+        <w:r>
+          <w:rPr>
+            <w:rStyle w:val="af"/>
+            <w:b/>
+            <w:noProof/>
+          </w:rPr>
+          <w:t>ПРИЛОЖЕНИЕ Г</w:t>
+        </w:r>
+        <w:r>
+          <w:rPr>
+            <w:noProof/>
+            <w:webHidden/>
+          </w:rPr>
+          <w:tab/>
+        </w:r>
+        <w:r>
+          <w:rPr>
+            <w:noProof/>
+            <w:webHidden/>
+          </w:rPr>
+          <w:fldChar w:fldCharType="begin"/>
+        </w:r>
+        <w:r>
+          <w:rPr>
+            <w:noProof/>
+            <w:webHidden/>
+          </w:rPr>
+          <w:instrText xml:space="preserve"> PAGEREF _Toc241940176 \h </w:instrText>
+        </w:r>
+        <w:r>
+          <w:rPr>
+            <w:noProof/>
+            <w:webHidden/>
+          </w:rPr>
+        </w:r>
+        <w:r>
+          <w:rPr>
+            <w:noProof/>
+            <w:webHidden/>
+          </w:rPr>
+          <w:fldChar w:fldCharType="separate"/>
+        </w:r>
+        <w:r>
+          <w:rPr>
+            <w:noProof/>
+            <w:webHidden/>
+          </w:rPr>
+          <w:t>33</w:t>
+        </w:r>
+        <w:r>
+          <w:rPr>
+            <w:noProof/>
+            <w:webHidden/>
+          </w:rPr>
+          <w:fldChar w:fldCharType="end"/>
+        </w:r>
+      </w:hyperlink>
+    </w:p>
+    <w:p>
+      <w:pPr>
+        <w:pStyle w:val="12"/>
+        <w:tabs>
+          <w:tab w:val="right" w:leader="dot" w:pos="9345"/>
+        </w:tabs>
+        <w:rPr>
+          <w:noProof/>
+        </w:rPr>
+      </w:pPr>
+      <w:hyperlink w:anchor="_Toc241940177" w:history="1">
         <w:r>
           <w:rPr>
             <w:rStyle w:val="af"/>
@@ -1612,7 +1612,7 @@
             <w:noProof/>
             <w:webHidden/>
           </w:rPr>
-          <w:instrText xml:space="preserve"> PAGEREF _Toc241939389 \h </w:instrText>
+          <w:instrText xml:space="preserve"> PAGEREF _Toc241940177 \h </w:instrText>
         </w:r>
         <w:r>
           <w:rPr>
@@ -1632,7 +1632,7 @@
             <w:noProof/>
             <w:webHidden/>
           </w:rPr>
-          <w:t>34</w:t>
+          <w:t>35</w:t>
         </w:r>
         <w:r>
           <w:rPr>
@@ -1658,7 +1658,7 @@
         <w:spacing w:before="0" w:after="360" w:line="360" w:lineRule="exact"/>
         <w:ind w:firstLine="709"/>
       </w:pPr>
-      <w:bookmarkStart w:id="1" w:name="_Toc241939370"/>
+      <w:bookmarkStart w:id="1" w:name="_Toc241940158"/>
       <w:r>
         <w:rPr>
           <w:b/>
@@ -1808,7 +1808,7 @@
         <w:ind w:firstLine="709"/>
       </w:pPr>
       <w:bookmarkStart w:id="2" w:name="_b608aa976fc82a0faaf3b83f58c735968afd03b"/>
-      <w:bookmarkStart w:id="3" w:name="_Toc241939371"/>
+      <w:bookmarkStart w:id="3" w:name="_Toc241940159"/>
       <w:bookmarkEnd w:id="0"/>
       <w:r>
         <w:rPr>
@@ -1867,7 +1867,7 @@
         <w:ind w:firstLine="709"/>
       </w:pPr>
       <w:bookmarkStart w:id="4" w:name="_c3cf235f67897fccdd158c7c34ca81091dc06e0"/>
-      <w:bookmarkStart w:id="5" w:name="_Toc241939372"/>
+      <w:bookmarkStart w:id="5" w:name="_Toc241940160"/>
       <w:r>
         <w:rPr>
           <w:b/>
@@ -3599,7 +3599,7 @@
         <w:ind w:firstLine="709"/>
       </w:pPr>
       <w:bookmarkStart w:id="6" w:name="_6c38f46d6252626ee19bec51dca515ea8eb3483"/>
-      <w:bookmarkStart w:id="7" w:name="_Toc241939373"/>
+      <w:bookmarkStart w:id="7" w:name="_Toc241940161"/>
       <w:bookmarkEnd w:id="4"/>
       <w:r>
         <w:rPr>
@@ -6369,7 +6369,7 @@
         </w:rPr>
         <w:lastRenderedPageBreak/>
         <w:drawing>
-          <wp:inline distT="0" distB="0" distL="0" distR="0" wp14:anchorId="3E9FDE7C" wp14:editId="16271ACF">
+          <wp:inline distT="0" distB="0" distL="0" distR="0" wp14:anchorId="17D69A68" wp14:editId="1EEE4693">
             <wp:extent cx="5334000" cy="3122341"/>
             <wp:effectExtent l="0" t="0" r="0" b="0"/>
             <wp:docPr id="12" name="Picture"/>
@@ -6633,7 +6633,7 @@
         <w:ind w:firstLine="709"/>
       </w:pPr>
       <w:bookmarkStart w:id="8" w:name="_e6ba0285e0e0ccc17e7a33a4e535fa387865e88"/>
-      <w:bookmarkStart w:id="9" w:name="_Toc241939374"/>
+      <w:bookmarkStart w:id="9" w:name="_Toc241940162"/>
       <w:bookmarkEnd w:id="6"/>
       <w:r>
         <w:rPr>
@@ -9046,7 +9046,7 @@
         <w:ind w:firstLine="709"/>
       </w:pPr>
       <w:bookmarkStart w:id="10" w:name="_b8f6f14603ee9e71fb2e4d1c108750035f950c7"/>
-      <w:bookmarkStart w:id="11" w:name="_Toc241939375"/>
+      <w:bookmarkStart w:id="11" w:name="_Toc241940163"/>
       <w:bookmarkEnd w:id="8"/>
       <w:r>
         <w:rPr>
@@ -12028,7 +12028,7 @@
           <w:sz w:val="28"/>
         </w:rPr>
         <w:drawing>
-          <wp:inline distT="0" distB="0" distL="0" distR="0" wp14:anchorId="753C2FEB" wp14:editId="21073778">
+          <wp:inline distT="0" distB="0" distL="0" distR="0" wp14:anchorId="3616311F" wp14:editId="0C674330">
             <wp:extent cx="5334000" cy="3187390"/>
             <wp:effectExtent l="0" t="0" r="0" b="0"/>
             <wp:docPr id="17" name="Picture"/>
@@ -12575,7 +12575,7 @@
         <w:ind w:firstLine="709"/>
       </w:pPr>
       <w:bookmarkStart w:id="12" w:name="_823200a59a4cf40c51f7f0e02566c010f838ed7"/>
-      <w:bookmarkStart w:id="13" w:name="_Toc241939376"/>
+      <w:bookmarkStart w:id="13" w:name="_Toc241940164"/>
       <w:bookmarkEnd w:id="10"/>
       <w:r>
         <w:rPr>
@@ -13285,7 +13285,7 @@
         </w:rPr>
         <w:lastRenderedPageBreak/>
         <w:drawing>
-          <wp:inline distT="0" distB="0" distL="0" distR="0" wp14:anchorId="2CE7BC0E" wp14:editId="5126272C">
+          <wp:inline distT="0" distB="0" distL="0" distR="0" wp14:anchorId="70894281" wp14:editId="5CC9464C">
             <wp:extent cx="5334000" cy="2862146"/>
             <wp:effectExtent l="0" t="0" r="0" b="0"/>
             <wp:docPr id="21" name="Picture"/>
@@ -13380,7 +13380,7 @@
         <w:ind w:firstLine="709"/>
       </w:pPr>
       <w:bookmarkStart w:id="14" w:name="_9d579ff3219dd0c08e87cdba2a2a6d1ef61e3cc"/>
-      <w:bookmarkStart w:id="15" w:name="_Toc241939377"/>
+      <w:bookmarkStart w:id="15" w:name="_Toc241940165"/>
       <w:bookmarkEnd w:id="12"/>
       <w:r>
         <w:rPr>
@@ -15294,7 +15294,7 @@
         <w:ind w:firstLine="709"/>
       </w:pPr>
       <w:bookmarkStart w:id="16" w:name="_8be076d9797953e124cfe81356f035b108674c3"/>
-      <w:bookmarkStart w:id="17" w:name="_Toc241939378"/>
+      <w:bookmarkStart w:id="17" w:name="_Toc241940166"/>
       <w:bookmarkEnd w:id="14"/>
       <w:r>
         <w:rPr>
@@ -17971,7 +17971,7 @@
         <w:ind w:firstLine="709"/>
       </w:pPr>
       <w:bookmarkStart w:id="18" w:name="_0ab5b5274b575dfb9e5e85d7a9a12b82683e52c"/>
-      <w:bookmarkStart w:id="19" w:name="_Toc241939379"/>
+      <w:bookmarkStart w:id="19" w:name="_Toc241940167"/>
       <w:bookmarkEnd w:id="16"/>
       <w:r>
         <w:rPr>
@@ -25069,7 +25069,7 @@
         </w:rPr>
         <w:lastRenderedPageBreak/>
         <w:drawing>
-          <wp:inline distT="0" distB="0" distL="0" distR="0" wp14:anchorId="3FB9A4C4" wp14:editId="4FF2CE9D">
+          <wp:inline distT="0" distB="0" distL="0" distR="0" wp14:anchorId="309AC021" wp14:editId="3BC988C1">
             <wp:extent cx="5334000" cy="2471853"/>
             <wp:effectExtent l="0" t="0" r="0" b="0"/>
             <wp:docPr id="27" name="Picture"/>
@@ -26680,7 +26680,7 @@
         <w:ind w:firstLine="709"/>
       </w:pPr>
       <w:bookmarkStart w:id="20" w:name="_79cbfa74df5b3f3beef1cd24c3ad9f089a58d7a"/>
-      <w:bookmarkStart w:id="21" w:name="_Toc241939380"/>
+      <w:bookmarkStart w:id="21" w:name="_Toc241940168"/>
       <w:bookmarkEnd w:id="18"/>
       <w:r>
         <w:rPr>
@@ -28165,7 +28165,7 @@
         <w:ind w:firstLine="709"/>
       </w:pPr>
       <w:bookmarkStart w:id="22" w:name="_339ae803435bd6b9a653c2b18dadc62dc9ad8e7"/>
-      <w:bookmarkStart w:id="23" w:name="_Toc241939381"/>
+      <w:bookmarkStart w:id="23" w:name="_Toc241940169"/>
       <w:bookmarkEnd w:id="20"/>
       <w:r>
         <w:rPr>
@@ -28354,7 +28354,7 @@
         <w:ind w:firstLine="709"/>
       </w:pPr>
       <w:bookmarkStart w:id="24" w:name="_1bfdad9d2d88ddb6ca16c31c1d4d4943679f32f"/>
-      <w:bookmarkStart w:id="25" w:name="_Toc241939382"/>
+      <w:bookmarkStart w:id="25" w:name="_Toc241940170"/>
       <w:bookmarkEnd w:id="22"/>
       <w:bookmarkEnd w:id="2"/>
       <w:r>
@@ -28575,7 +28575,7 @@
         <w:jc w:val="center"/>
       </w:pPr>
       <w:bookmarkStart w:id="26" w:name="_выводы"/>
-      <w:bookmarkStart w:id="27" w:name="_Toc241939383"/>
+      <w:bookmarkStart w:id="27" w:name="_Toc241940171"/>
       <w:bookmarkEnd w:id="24"/>
       <w:r>
         <w:rPr>
@@ -28836,7 +28836,7 @@
         <w:jc w:val="center"/>
       </w:pPr>
       <w:bookmarkStart w:id="28" w:name="_274f6a444530ef90b0479dabf3d210f01e97699"/>
-      <w:bookmarkStart w:id="29" w:name="_Toc241939384"/>
+      <w:bookmarkStart w:id="29" w:name="_Toc241940172"/>
       <w:bookmarkEnd w:id="26"/>
       <w:r>
         <w:rPr>
@@ -31361,7 +31361,7 @@
         <w:jc w:val="center"/>
       </w:pPr>
       <w:bookmarkStart w:id="30" w:name="_3d74faf1500c1b2a4a8bfa8e0e37c74206ce73d"/>
-      <w:bookmarkStart w:id="31" w:name="_Toc241939385"/>
+      <w:bookmarkStart w:id="31" w:name="_Toc241940173"/>
       <w:bookmarkEnd w:id="28"/>
       <w:r>
         <w:rPr>
@@ -32102,7 +32102,7 @@
         <w:jc w:val="center"/>
       </w:pPr>
       <w:bookmarkStart w:id="32" w:name="_d684f183eb868ee4ace295916bed2e6be64d16e"/>
-      <w:bookmarkStart w:id="33" w:name="_Toc241939386"/>
+      <w:bookmarkStart w:id="33" w:name="_Toc241940174"/>
       <w:bookmarkEnd w:id="30"/>
       <w:r>
         <w:rPr>
@@ -32846,6 +32846,7 @@
               <w:rPr>
                 <w:sz w:val="24"/>
               </w:rPr>
+              <w:lastRenderedPageBreak/>
               <w:t>5</w:t>
             </w:r>
           </w:p>
@@ -32982,13 +32983,53 @@
               <w:rPr>
                 <w:sz w:val="24"/>
               </w:rPr>
-              <w:t xml:space="preserve"> (пр</w:t>
-            </w:r>
-            <w:r>
-              <w:rPr>
-                <w:sz w:val="24"/>
-              </w:rPr>
-              <w:t xml:space="preserve">иложение Д); для </w:t>
+              <w:t xml:space="preserve">, </w:t>
+            </w:r>
+            <w:r>
+              <w:rPr>
+                <w:i/>
+                <w:sz w:val="24"/>
+              </w:rPr>
+              <w:t>Ro</w:t>
+            </w:r>
+            <w:r>
+              <w:rPr>
+                <w:i/>
+                <w:sz w:val="24"/>
+              </w:rPr>
+              <w:t>ws</w:t>
+            </w:r>
+            <w:r>
+              <w:rPr>
+                <w:sz w:val="24"/>
+              </w:rPr>
+              <w:t xml:space="preserve">, </w:t>
+            </w:r>
+            <w:r>
+              <w:rPr>
+                <w:i/>
+                <w:sz w:val="24"/>
+              </w:rPr>
+              <w:t>Formula</w:t>
+            </w:r>
+            <w:r>
+              <w:rPr>
+                <w:sz w:val="24"/>
+              </w:rPr>
+              <w:t xml:space="preserve"> </w:t>
+            </w:r>
+            <w:r>
+              <w:rPr>
+                <w:i/>
+                <w:sz w:val="24"/>
+              </w:rPr>
+              <w:t>Bot</w:t>
+            </w:r>
+            <w:r>
+              <w:rPr>
+                <w:sz w:val="24"/>
+              </w:rPr>
+              <w:t xml:space="preserve">, </w:t>
             </w:r>
             <w:r>
               <w:rPr>
@@ -33001,7 +33042,20 @@
               <w:rPr>
                 <w:sz w:val="24"/>
               </w:rPr>
-              <w:t xml:space="preserve"> данных нет</w:t>
+              <w:t xml:space="preserve"> (приложение Д); точные суммы раундов </w:t>
+            </w:r>
+            <w:r>
+              <w:rPr>
+                <w:i/>
+                <w:sz w:val="24"/>
+              </w:rPr>
+              <w:t>Crunchbase</w:t>
+            </w:r>
+            <w:r>
+              <w:rPr>
+                <w:sz w:val="24"/>
+              </w:rPr>
+              <w:t xml:space="preserve"> показывает только по платной подписке</w:t>
             </w:r>
           </w:p>
         </w:tc>
@@ -33075,7 +33129,7 @@
         <w:jc w:val="center"/>
       </w:pPr>
       <w:bookmarkStart w:id="34" w:name="_cb59224a7032ef66ab429e7df9b4e4c597bc187"/>
-      <w:bookmarkStart w:id="35" w:name="_Toc241939387"/>
+      <w:bookmarkStart w:id="35" w:name="_Toc241940175"/>
       <w:bookmarkEnd w:id="32"/>
       <w:r>
         <w:rPr>
@@ -33123,7 +33177,13 @@
         <w:rPr>
           <w:sz w:val="28"/>
         </w:rPr>
-        <w:t>В шаблонах выявлены ошибки и ограничения совместимости; ниже перечислено, что исправлено в рабочих копиях. Оригиналы не менялись.</w:t>
+        <w:t>В шаблонах выявлены ошибки и ограничения совместимости; ниже перечислено, что исправлен</w:t>
+      </w:r>
+      <w:r>
+        <w:rPr>
+          <w:sz w:val="28"/>
+        </w:rPr>
+        <w:t>о в рабочих копиях. Оригиналы не менялись.</w:t>
       </w:r>
     </w:p>
     <w:p>
@@ -33653,13 +33713,7 @@
               <w:rPr>
                 <w:sz w:val="24"/>
               </w:rPr>
-              <w:t>строка весов</w:t>
-            </w:r>
-            <w:r>
-              <w:rPr>
-                <w:sz w:val="24"/>
-              </w:rPr>
-              <w:t xml:space="preserve"> блоков была пустой, индекс силы делился на ноль</w:t>
+              <w:t>строка весов блоков была пустой, индекс силы делился на ноль</w:t>
             </w:r>
           </w:p>
         </w:tc>
@@ -33773,13 +33827,13 @@
               <w:rPr>
                 <w:sz w:val="24"/>
               </w:rPr>
-              <w:t xml:space="preserve">знаменатель заменен на </w:t>
-            </w:r>
-            <w:r>
-              <w:rPr>
-                <w:sz w:val="24"/>
-              </w:rPr>
-              <w:t>12_Сводка!</w:t>
+              <w:t xml:space="preserve">знаменатель </w:t>
+            </w:r>
+            <w:r>
+              <w:rPr>
+                <w:sz w:val="24"/>
+              </w:rPr>
+              <w:t>заменен на 12_Сводка!</w:t>
             </w:r>
             <w:r>
               <w:rPr>
@@ -33821,7 +33875,7 @@
         <w:jc w:val="center"/>
       </w:pPr>
       <w:bookmarkStart w:id="36" w:name="_c34bf756927ff692ee086e018f9b8545647766e"/>
-      <w:bookmarkStart w:id="37" w:name="_Toc241939388"/>
+      <w:bookmarkStart w:id="37" w:name="_Toc241940176"/>
       <w:bookmarkEnd w:id="34"/>
       <w:r>
         <w:rPr>
@@ -33869,13 +33923,13 @@
         <w:rPr>
           <w:sz w:val="28"/>
         </w:rPr>
-        <w:t>Для проверки методики Кано сгенерированы модельные ответы 30 условных респондентов на пары ф</w:t>
-      </w:r>
-      <w:r>
-        <w:rPr>
-          <w:sz w:val="28"/>
-        </w:rPr>
-        <w:t xml:space="preserve">ункциональных и дисфункциональных вопросов по 16 функциям (по решению студентки, Р-8; генератор и файлы - в папке 00_Общее/Опрос_модельный, </w:t>
+        <w:t>Для проверки методики Кано сгенерированы модельные ответы 30 условных респонденто</w:t>
+      </w:r>
+      <w:r>
+        <w:rPr>
+          <w:sz w:val="28"/>
+        </w:rPr>
+        <w:t xml:space="preserve">в на пары функциональных и дисфункциональных вопросов по 16 функциям (по решению студентки, Р-8; генератор и файлы - в папке 00_Общее/Опрос_модельный, </w:t>
       </w:r>
       <w:r>
         <w:rPr>
@@ -33888,13 +33942,13 @@
         <w:rPr>
           <w:sz w:val="28"/>
         </w:rPr>
-        <w:t xml:space="preserve"> 20261003). Это модельные данные, а не опрос людей: вероятность согласия с категорией аналитика задана параметро</w:t>
-      </w:r>
-      <w:r>
-        <w:rPr>
-          <w:sz w:val="28"/>
-        </w:rPr>
-        <w:t>м 58 %, поэтому совпадение с таблицей 6 неизбежно и подтверждает только работу расчета, а не истинность категорий.</w:t>
+        <w:t xml:space="preserve"> 20261003). Это модельные данные, а не опрос людей: вероятность согласия с категорией аналитика задан</w:t>
+      </w:r>
+      <w:r>
+        <w:rPr>
+          <w:sz w:val="28"/>
+        </w:rPr>
+        <w:t>а параметром 58 %, поэтому совпадение с таблицей 6 неизбежно и подтверждает только работу расчета, а не истинность категорий.</w:t>
       </w:r>
     </w:p>
     <w:p>
@@ -36160,13 +36214,13 @@
         <w:rPr>
           <w:sz w:val="28"/>
         </w:rPr>
-        <w:t xml:space="preserve">-пояснения и </w:t>
-      </w:r>
-      <w:r>
-        <w:rPr>
-          <w:sz w:val="28"/>
-        </w:rPr>
-        <w:t>подсказки», «Сравнение версий файлов».</w:t>
+        <w:t>-пояснения и подсказки», «Ср</w:t>
+      </w:r>
+      <w:r>
+        <w:rPr>
+          <w:sz w:val="28"/>
+        </w:rPr>
+        <w:t>авнение версий файлов».</w:t>
       </w:r>
     </w:p>
     <w:p>
@@ -36193,13 +36247,7 @@
         <w:rPr>
           <w:sz w:val="28"/>
         </w:rPr>
-        <w:t xml:space="preserve"> заменяется, а модальные категории и коэффициенты пересчитываются тем же скриптом; категории в листе 04_Кано книги корректируются по </w:t>
-      </w:r>
-      <w:r>
-        <w:rPr>
-          <w:sz w:val="28"/>
-        </w:rPr>
-        <w:t>результату.</w:t>
+        <w:t xml:space="preserve"> заменяется, а модальные категории и коэффициенты пересчитываются тем же скриптом; категории в листе 04_Кано книги корректируются по результату.</w:t>
       </w:r>
     </w:p>
     <w:p>
@@ -36211,7 +36259,7 @@
         <w:jc w:val="center"/>
       </w:pPr>
       <w:bookmarkStart w:id="38" w:name="_fced6403ae4a6291124e2bc0068517b8abae511"/>
-      <w:bookmarkStart w:id="39" w:name="_Toc241939389"/>
+      <w:bookmarkStart w:id="39" w:name="_Toc241940177"/>
       <w:bookmarkEnd w:id="36"/>
       <w:r>
         <w:rPr>
@@ -36219,7 +36267,14 @@
           <w:sz w:val="28"/>
         </w:rPr>
         <w:lastRenderedPageBreak/>
-        <w:t>ПРИЛОЖЕНИЕ Д</w:t>
+        <w:t>ПРИ</w:t>
+      </w:r>
+      <w:r>
+        <w:rPr>
+          <w:b/>
+          <w:sz w:val="28"/>
+        </w:rPr>
+        <w:t>ЛОЖЕНИЕ Д</w:t>
       </w:r>
       <w:bookmarkEnd w:id="39"/>
     </w:p>
@@ -36285,13 +36340,13 @@
         <w:rPr>
           <w:sz w:val="28"/>
         </w:rPr>
-        <w:t xml:space="preserve">, доступ к которым требует личного аккаунта, финансирование и размер компаний найдены в новостях и пресс-релизах 03.10.2026. Значения </w:t>
-      </w:r>
-      <w:r>
-        <w:rPr>
-          <w:sz w:val="28"/>
-        </w:rPr>
-        <w:t>справочные и в расчетах баллов ЛР5 не использовались.</w:t>
+        <w:t xml:space="preserve">, доступ к которым требует личного аккаунта, финансирование и размер компаний найдены в новостях и пресс-релизах 03.10.2026. Значения справочные и в </w:t>
+      </w:r>
+      <w:r>
+        <w:rPr>
+          <w:sz w:val="28"/>
+        </w:rPr>
+        <w:t>расчетах баллов ЛР5 не использовались.</w:t>
       </w:r>
     </w:p>
     <w:p>
@@ -36447,14 +36502,7 @@
                 <w:b/>
                 <w:sz w:val="24"/>
               </w:rPr>
-              <w:t>Надеж</w:t>
-            </w:r>
-            <w:r>
-              <w:rPr>
-                <w:b/>
-                <w:sz w:val="24"/>
-              </w:rPr>
-              <w:t>ность</w:t>
+              <w:t>Надежность</w:t>
             </w:r>
           </w:p>
         </w:tc>
@@ -36480,7 +36528,14 @@
                 <w:i/>
                 <w:sz w:val="24"/>
               </w:rPr>
-              <w:t>DataSnipper</w:t>
+              <w:t>DataSnip</w:t>
+            </w:r>
+            <w:r>
+              <w:rPr>
+                <w:i/>
+                <w:sz w:val="24"/>
+              </w:rPr>
+              <w:t>per</w:t>
             </w:r>
           </w:p>
         </w:tc>
@@ -37760,7 +37815,26 @@
               <w:rPr>
                 <w:sz w:val="24"/>
               </w:rPr>
-              <w:t>; сумма не раскрыта</w:t>
+              <w:t xml:space="preserve">; сумма не раскрыта; по публичной карточке </w:t>
+            </w:r>
+            <w:r>
+              <w:rPr>
+                <w:i/>
+                <w:sz w:val="24"/>
+              </w:rPr>
+              <w:t>Crunchbase</w:t>
+            </w:r>
+            <w:r>
+              <w:rPr>
+                <w:sz w:val="24"/>
+              </w:rPr>
+              <w:t xml:space="preserve"> 1-10 сотрудников, частная к</w:t>
+            </w:r>
+            <w:r>
+              <w:rPr>
+                <w:sz w:val="24"/>
+              </w:rPr>
+              <w:t>омпания (детали финансирования закрыты платной подпиской)</w:t>
             </w:r>
           </w:p>
         </w:tc>
@@ -37875,13 +37949,7 @@
               <w:rPr>
                 <w:sz w:val="24"/>
               </w:rPr>
-              <w:t>Размер и истор</w:t>
-            </w:r>
-            <w:r>
-              <w:rPr>
-                <w:sz w:val="24"/>
-              </w:rPr>
-              <w:t>ия</w:t>
+              <w:t>Размер и история</w:t>
             </w:r>
           </w:p>
         </w:tc>
@@ -37955,20 +38023,21 @@
         <w:rPr>
           <w:sz w:val="28"/>
         </w:rPr>
-        <w:t xml:space="preserve">Конкуренты делятся на венчурные компании с оценкой от сотен миллионов до миллиарда </w:t>
-      </w:r>
-      <w:r>
-        <w:rPr>
-          <w:sz w:val="28"/>
-        </w:rPr>
-        <w:t>долларов (</w:t>
+        <w:t>Конкуренты делятся на венчурные компании с оценкой от сотен миллионов до миллиарда долларов (</w:t>
       </w:r>
       <w:r>
         <w:rPr>
           <w:i/>
           <w:sz w:val="28"/>
         </w:rPr>
-        <w:t>DataSnipper</w:t>
+        <w:t>Dat</w:t>
+      </w:r>
+      <w:r>
+        <w:rPr>
+          <w:i/>
+          <w:sz w:val="28"/>
+        </w:rPr>
+        <w:t>aSnipper</w:t>
       </w:r>
       <w:r>
         <w:rPr>
@@ -38039,7 +38108,14 @@
         <w:rPr>
           <w:sz w:val="28"/>
         </w:rPr>
-        <w:t xml:space="preserve">). Это поддерживает вывод ЛР4 и ЛР5: рядом с </w:t>
+        <w:t xml:space="preserve">). Это </w:t>
+      </w:r>
+      <w:r>
+        <w:rPr>
+          <w:sz w:val="28"/>
+        </w:rPr>
+        <w:lastRenderedPageBreak/>
+        <w:t xml:space="preserve">поддерживает вывод ЛР4 и ЛР5: рядом с </w:t>
       </w:r>
       <w:r>
         <w:rPr>
@@ -38052,13 +38128,13 @@
         <w:rPr>
           <w:sz w:val="28"/>
         </w:rPr>
-        <w:t xml:space="preserve"> работают сильные, хорошо финан</w:t>
-      </w:r>
-      <w:r>
-        <w:rPr>
-          <w:sz w:val="28"/>
-        </w:rPr>
-        <w:t>сируемые игроки, поэтому ставка на независимость проверки, доказательство находок движком и прозрачную цену должна оставаться отличием, а не гонкой по числу функций.</w:t>
+        <w:t xml:space="preserve"> работают сильные, хорошо финансируемые игро</w:t>
+      </w:r>
+      <w:r>
+        <w:rPr>
+          <w:sz w:val="28"/>
+        </w:rPr>
+        <w:t>ки, поэтому ставка на независимость проверки, доказательство находок движком и прозрачную цену должна оставаться отличием, а не гонкой по числу функций.</w:t>
       </w:r>
     </w:p>
     <w:p>
@@ -38072,14 +38148,7 @@
         <w:rPr>
           <w:sz w:val="28"/>
         </w:rPr>
-        <w:lastRenderedPageBreak/>
-        <w:t>В таблице 26 представлено: дополнительные страницы сайтов конкурентов (просмотр 03.10.2026</w:t>
-      </w:r>
-      <w:r>
-        <w:rPr>
-          <w:sz w:val="28"/>
-        </w:rPr>
-        <w:t>).</w:t>
+        <w:t>В таблице 26 представлено: дополнительные страницы сайтов конкурентов (просмотр 03.10.2026).</w:t>
       </w:r>
     </w:p>
     <w:p>
@@ -38092,7 +38161,13 @@
         <w:rPr>
           <w:sz w:val="28"/>
         </w:rPr>
-        <w:t>Таблица 26 – Дополнительные страницы сайтов конкурентов (просмотр 03.10.2026)</w:t>
+        <w:t>Таблица 26</w:t>
+      </w:r>
+      <w:r>
+        <w:rPr>
+          <w:sz w:val="28"/>
+        </w:rPr>
+        <w:t xml:space="preserve"> – Дополнительные страницы сайтов конкурентов (просмотр 03.10.2026)</w:t>
       </w:r>
     </w:p>
     <w:tbl>
@@ -39070,6 +39145,7 @@
                 <w:i/>
                 <w:sz w:val="24"/>
               </w:rPr>
+              <w:lastRenderedPageBreak/>
               <w:t>Numerous.ai</w:t>
             </w:r>
           </w:p>
@@ -39172,7 +39248,6 @@
                 <w:i/>
                 <w:sz w:val="24"/>
               </w:rPr>
-              <w:lastRenderedPageBreak/>
               <w:t>Datarails</w:t>
             </w:r>
           </w:p>
@@ -39959,6 +40034,7 @@
                 <w:i/>
                 <w:sz w:val="24"/>
               </w:rPr>
+              <w:lastRenderedPageBreak/>
               <w:t>DataSnipper</w:t>
             </w:r>
           </w:p>
@@ -40243,7 +40319,6 @@
                 <w:i/>
                 <w:sz w:val="24"/>
               </w:rPr>
-              <w:lastRenderedPageBreak/>
               <w:t>PerfectXL</w:t>
             </w:r>
           </w:p>
@@ -40769,7 +40844,14 @@
         <w:rPr>
           <w:sz w:val="28"/>
         </w:rPr>
-        <w:t xml:space="preserve">ованную цену, показатель вырастет до 5 из 7 (71 %) и перейдет порог 70 % в рыночный стандарт; тогда возможностью дифференциации остаются лестница тарифов с бесплатным входом и доказательство вывода. Книги </w:t>
+        <w:t xml:space="preserve">ованную цену, показатель вырастет до 5 из 7 (71 %) и перейдет порог 70 % в рыночный стандарт; тогда возможностью дифференциации остаются лестница тарифов </w:t>
+      </w:r>
+      <w:r>
+        <w:rPr>
+          <w:sz w:val="28"/>
+        </w:rPr>
+        <w:lastRenderedPageBreak/>
+        <w:t xml:space="preserve">с бесплатным входом и доказательство вывода. Книги </w:t>
       </w:r>
       <w:r>
         <w:rPr>
@@ -40949,7 +41031,7 @@
   <w:abstractNum w:abstractNumId="0" w15:restartNumberingAfterBreak="0">
     <w:nsid w:val="0000A990"/>
     <w:multiLevelType w:val="multilevel"/>
-    <w:tmpl w:val="7B6C4C60"/>
+    <w:tmpl w:val="F0F0D8B2"/>
     <w:lvl w:ilvl="0">
       <w:numFmt w:val="bullet"/>
       <w:lvlText w:val=" "/>
@@ -41026,7 +41108,7 @@
   <w:abstractNum w:abstractNumId="1" w15:restartNumberingAfterBreak="0">
     <w:nsid w:val="00A99411"/>
     <w:multiLevelType w:val="multilevel"/>
-    <w:tmpl w:val="799CB278"/>
+    <w:tmpl w:val="CB3090F8"/>
     <w:lvl w:ilvl="0">
       <w:start w:val="1"/>
       <w:numFmt w:val="decimal"/>
@@ -42504,7 +42586,7 @@
     <w:autoRedefine/>
     <w:uiPriority w:val="39"/>
     <w:unhideWhenUsed/>
-    <w:rsid w:val="00CA4AEE"/>
+    <w:rsid w:val="00E06E24"/>
     <w:pPr>
       <w:spacing w:after="100"/>
     </w:pPr>
@@ -42516,7 +42598,7 @@
     <w:autoRedefine/>
     <w:uiPriority w:val="39"/>
     <w:unhideWhenUsed/>
-    <w:rsid w:val="00CA4AEE"/>
+    <w:rsid w:val="00E06E24"/>
     <w:pPr>
       <w:spacing w:after="100"/>
       <w:ind w:left="240"/>

</xml_diff>